<commit_message>
FROM FEB11 to MARCH 18(7:22)
</commit_message>
<xml_diff>
--- a/TenancyContract.docx
+++ b/TenancyContract.docx
@@ -1,6 +1,6 @@
 
 <file path=word/document.xml><?xml version="1.0" encoding="utf-8"?>
-<w:document xmlns:a="http://schemas.openxmlformats.org/drawingml/2006/main" xmlns:a14="http://schemas.microsoft.com/office/drawing/2010/main" xmlns:pic="http://schemas.openxmlformats.org/drawingml/2006/picture" xmlns:wpc="http://schemas.microsoft.com/office/word/2010/wordprocessingCanvas" xmlns:cx="http://schemas.microsoft.com/office/drawing/2014/chartex" xmlns:cx1="http://schemas.microsoft.com/office/drawing/2015/9/8/chartex" xmlns:cx2="http://schemas.microsoft.com/office/drawing/2015/10/21/chartex" xmlns:cx3="http://schemas.microsoft.com/office/drawing/2016/5/9/chartex" xmlns:cx4="http://schemas.microsoft.com/office/drawing/2016/5/10/chartex" xmlns:cx5="http://schemas.microsoft.com/office/drawing/2016/5/11/chartex" xmlns:cx6="http://schemas.microsoft.com/office/drawing/2016/5/12/chartex" xmlns:cx7="http://schemas.microsoft.com/office/drawing/2016/5/13/chartex" xmlns:cx8="http://schemas.microsoft.com/office/drawing/2016/5/14/chartex" xmlns:mc="http://schemas.openxmlformats.org/markup-compatibility/2006" xmlns:aink="http://schemas.microsoft.com/office/drawing/2016/ink" xmlns:am3d="http://schemas.microsoft.com/office/drawing/2017/model3d" xmlns:o="urn:schemas-microsoft-com:office:office" xmlns:oel="http://schemas.microsoft.com/office/2019/extlst" xmlns:r="http://schemas.openxmlformats.org/officeDocument/2006/relationships" xmlns:m="http://schemas.openxmlformats.org/officeDocument/2006/math" xmlns:v="urn:schemas-microsoft-com:vml" xmlns:wp14="http://schemas.microsoft.com/office/word/2010/wordprocessingDrawing" xmlns:wp="http://schemas.openxmlformats.org/drawingml/2006/wordprocessingDrawing" xmlns:w10="urn:schemas-microsoft-com:office:word" xmlns:w="http://schemas.openxmlformats.org/wordprocessingml/2006/main" xmlns:w14="http://schemas.microsoft.com/office/word/2010/wordml" xmlns:w15="http://schemas.microsoft.com/office/word/2012/wordml" xmlns:w16cex="http://schemas.microsoft.com/office/word/2018/wordml/cex" xmlns:w16cid="http://schemas.microsoft.com/office/word/2016/wordml/cid" xmlns:w16="http://schemas.microsoft.com/office/word/2018/wordml" xmlns:w16du="http://schemas.microsoft.com/office/word/2023/wordml/word16du" xmlns:w16sdtdh="http://schemas.microsoft.com/office/word/2020/wordml/sdtdatahash" xmlns:w16se="http://schemas.microsoft.com/office/word/2015/wordml/symex" xmlns:wpg="http://schemas.microsoft.com/office/word/2010/wordprocessingGroup" xmlns:wpi="http://schemas.microsoft.com/office/word/2010/wordprocessingInk" xmlns:wne="http://schemas.microsoft.com/office/word/2006/wordml" xmlns:wps="http://schemas.microsoft.com/office/word/2010/wordprocessingShape" mc:Ignorable="w14 w15 w16se w16cid w16 w16cex w16sdtdh w16du wp14">
+<w:document xmlns:a="http://schemas.openxmlformats.org/drawingml/2006/main" xmlns:a14="http://schemas.microsoft.com/office/drawing/2010/main" xmlns:pic="http://schemas.openxmlformats.org/drawingml/2006/picture" xmlns:wpc="http://schemas.microsoft.com/office/word/2010/wordprocessingCanvas" xmlns:cx="http://schemas.microsoft.com/office/drawing/2014/chartex" xmlns:cx1="http://schemas.microsoft.com/office/drawing/2015/9/8/chartex" xmlns:cx2="http://schemas.microsoft.com/office/drawing/2015/10/21/chartex" xmlns:cx3="http://schemas.microsoft.com/office/drawing/2016/5/9/chartex" xmlns:cx4="http://schemas.microsoft.com/office/drawing/2016/5/10/chartex" xmlns:cx5="http://schemas.microsoft.com/office/drawing/2016/5/11/chartex" xmlns:cx6="http://schemas.microsoft.com/office/drawing/2016/5/12/chartex" xmlns:cx7="http://schemas.microsoft.com/office/drawing/2016/5/13/chartex" xmlns:cx8="http://schemas.microsoft.com/office/drawing/2016/5/14/chartex" xmlns:mc="http://schemas.openxmlformats.org/markup-compatibility/2006" xmlns:aink="http://schemas.microsoft.com/office/drawing/2016/ink" xmlns:am3d="http://schemas.microsoft.com/office/drawing/2017/model3d" xmlns:o="urn:schemas-microsoft-com:office:office" xmlns:oel="http://schemas.microsoft.com/office/2019/extlst" xmlns:r="http://schemas.openxmlformats.org/officeDocument/2006/relationships" xmlns:m="http://schemas.openxmlformats.org/officeDocument/2006/math" xmlns:v="urn:schemas-microsoft-com:vml" xmlns:wp14="http://schemas.microsoft.com/office/word/2010/wordprocessingDrawing" xmlns:wp="http://schemas.openxmlformats.org/drawingml/2006/wordprocessingDrawing" xmlns:w10="urn:schemas-microsoft-com:office:word" xmlns:w="http://schemas.openxmlformats.org/wordprocessingml/2006/main" xmlns:w14="http://schemas.microsoft.com/office/word/2010/wordml" xmlns:w15="http://schemas.microsoft.com/office/word/2012/wordml" xmlns:w16cex="http://schemas.microsoft.com/office/word/2018/wordml/cex" xmlns:w16cid="http://schemas.microsoft.com/office/word/2016/wordml/cid" xmlns:w16="http://schemas.microsoft.com/office/word/2018/wordml" xmlns:w16du="http://schemas.microsoft.com/office/word/2023/wordml/word16du" xmlns:w16sdtdh="http://schemas.microsoft.com/office/word/2020/wordml/sdtdatahash" xmlns:w16sdtfl="http://schemas.microsoft.com/office/word/2024/wordml/sdtformatlock" xmlns:w16se="http://schemas.microsoft.com/office/word/2015/wordml/symex" xmlns:wpg="http://schemas.microsoft.com/office/word/2010/wordprocessingGroup" xmlns:wpi="http://schemas.microsoft.com/office/word/2010/wordprocessingInk" xmlns:wne="http://schemas.microsoft.com/office/word/2006/wordml" xmlns:wps="http://schemas.microsoft.com/office/word/2010/wordprocessingShape" mc:Ignorable="w14 w15 w16se w16cid w16 w16cex w16sdtdh w16sdtfl w16du wp14">
   <w:body>
     <w:p>
       <w:pPr>
@@ -19,7 +19,7 @@
         <mc:AlternateContent>
           <mc:Choice Requires="wpg">
             <w:drawing>
-              <wp:anchor distT="0" distB="0" distL="114300" distR="114300" simplePos="0" relativeHeight="251672576" behindDoc="0" locked="0" layoutInCell="1" allowOverlap="1" wp14:editId="62E3F205" wp14:anchorId="0C98F461">
+              <wp:anchor distT="0" distB="0" distL="114300" distR="114300" simplePos="0" relativeHeight="251672576" behindDoc="0" locked="0" layoutInCell="1" allowOverlap="1" wp14:editId="7A1816B2" wp14:anchorId="62F8B3D6">
                 <wp:simplePos x="0" y="0"/>
                 <wp:positionH relativeFrom="margin">
                   <wp:align>right</wp:align>
@@ -2497,7 +2497,7 @@
           </mc:Choice>
           <mc:Fallback>
             <w:pict>
-              <v:group id="Group 209" style="position:absolute;margin-left:543.95pt;margin-top:87pt;width:595.15pt;height:53.75pt;z-index:251672576;mso-position-horizontal:right;mso-position-horizontal-relative:margin;mso-position-vertical-relative:page" coordsize="11903,908" coordorigin="3,1720" o:spid="_x0000_s1026" o:gfxdata="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" w14:anchorId="0C98F461">
+              <v:group id="Group 209" style="position:absolute;margin-left:543.95pt;margin-top:87pt;width:595.15pt;height:53.75pt;z-index:251672576;mso-position-horizontal:right;mso-position-horizontal-relative:margin;mso-position-vertical-relative:page" coordsize="11903,908" coordorigin="3,1720" o:spid="_x0000_s1026" o:gfxdata="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" w14:anchorId="62F8B3D6">
                 <v:rect id="Rectangle 145" style="position:absolute;left:3;top:1720;width:11903;height:883;visibility:visible;mso-wrap-style:square;v-text-anchor:top" o:spid="_x0000_s1027" fillcolor="#f7f7f7" stroked="f" o:gfxdata="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"/>
                 <v:shapetype id="_x0000_t75" coordsize="21600,21600" filled="f" stroked="f" o:spt="75" o:preferrelative="t" path="m@4@5l@4@11@9@11@9@5xe">
                   <v:stroke joinstyle="miter"/>
@@ -2719,7 +2719,7 @@
         <mc:AlternateContent>
           <mc:Choice Requires="wps">
             <w:drawing>
-              <wp:anchor distT="0" distB="0" distL="114300" distR="114300" simplePos="0" relativeHeight="251674624" behindDoc="0" locked="0" layoutInCell="1" allowOverlap="1" wp14:editId="74B9A44C" wp14:anchorId="5DC8A047">
+              <wp:anchor distT="0" distB="0" distL="114300" distR="114300" simplePos="0" relativeHeight="251674624" behindDoc="0" locked="0" layoutInCell="1" allowOverlap="1" wp14:editId="67786429" wp14:anchorId="092B9178">
                 <wp:simplePos x="0" y="0"/>
                 <wp:positionH relativeFrom="column">
                   <wp:posOffset>5687786</wp:posOffset>
@@ -2961,7 +2961,7 @@
           </mc:Choice>
           <mc:Fallback>
             <w:pict>
-              <v:shape id="Text Box 224" style="position:absolute;margin-left:447.85pt;margin-top:3.3pt;width:117.85pt;height:20.15pt;z-index:251674624;visibility:visible;mso-wrap-style:square;mso-width-percent:0;mso-height-percent:0;mso-wrap-distance-left:9pt;mso-wrap-distance-top:0;mso-wrap-distance-right:9pt;mso-wrap-distance-bottom:0;mso-position-horizontal:absolute;mso-position-horizontal-relative:text;mso-position-vertical:absolute;mso-position-vertical-relative:text;mso-width-percent:0;mso-height-percent:0;mso-width-relative:margin;mso-height-relative:margin;v-text-anchor:top" o:spid="_x0000_s1039" fillcolor="#002060" stroked="f" strokeweight=".5pt" type="#_x0000_t202" o:gfxdata="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" w14:anchorId="5DC8A047">
+              <v:shape id="Text Box 224" style="position:absolute;margin-left:447.85pt;margin-top:3.3pt;width:117.85pt;height:20.15pt;z-index:251674624;visibility:visible;mso-wrap-style:square;mso-width-percent:0;mso-height-percent:0;mso-wrap-distance-left:9pt;mso-wrap-distance-top:0;mso-wrap-distance-right:9pt;mso-wrap-distance-bottom:0;mso-position-horizontal:absolute;mso-position-horizontal-relative:text;mso-position-vertical:absolute;mso-position-vertical-relative:text;mso-width-percent:0;mso-height-percent:0;mso-width-relative:margin;mso-height-relative:margin;v-text-anchor:top" o:spid="_x0000_s1039" fillcolor="#002060" stroked="f" strokeweight=".5pt" type="#_x0000_t202" o:gfxdata="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" w14:anchorId="092B9178">
                 <v:textbox>
                   <w:txbxContent>
                     <w:p>
@@ -3167,7 +3167,7 @@
         <mc:AlternateContent>
           <mc:Choice Requires="wps">
             <w:drawing>
-              <wp:anchor distT="45720" distB="45720" distL="114300" distR="114300" simplePos="0" relativeHeight="251673600" behindDoc="0" locked="0" layoutInCell="1" allowOverlap="1" wp14:editId="214ABB6A" wp14:anchorId="10E0F604">
+              <wp:anchor distT="45720" distB="45720" distL="114300" distR="114300" simplePos="0" relativeHeight="251673600" behindDoc="0" locked="0" layoutInCell="1" allowOverlap="1" wp14:editId="0070CD34" wp14:anchorId="10A7623F">
                 <wp:simplePos x="0" y="0"/>
                 <wp:positionH relativeFrom="column">
                   <wp:posOffset>375285</wp:posOffset>
@@ -3325,7 +3325,7 @@
           </mc:Choice>
           <mc:Fallback>
             <w:pict>
-              <v:shape id="Text Box 2" style="position:absolute;margin-left:29.55pt;margin-top:2.85pt;width:536.1pt;height:21.85pt;z-index:251673600;visibility:visible;mso-wrap-style:square;mso-width-percent:0;mso-height-percent:0;mso-wrap-distance-left:9pt;mso-wrap-distance-top:3.6pt;mso-wrap-distance-right:9pt;mso-wrap-distance-bottom:3.6pt;mso-position-horizontal:absolute;mso-position-horizontal-relative:text;mso-position-vertical:absolute;mso-position-vertical-relative:text;mso-width-percent:0;mso-height-percent:0;mso-width-relative:margin;mso-height-relative:margin;v-text-anchor:top" o:spid="_x0000_s1040" fillcolor="#002060" stroked="f" type="#_x0000_t202" o:gfxdata="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" w14:anchorId="10E0F604">
+              <v:shape id="Text Box 2" style="position:absolute;margin-left:29.55pt;margin-top:2.85pt;width:536.1pt;height:21.85pt;z-index:251673600;visibility:visible;mso-wrap-style:square;mso-width-percent:0;mso-height-percent:0;mso-wrap-distance-left:9pt;mso-wrap-distance-top:3.6pt;mso-wrap-distance-right:9pt;mso-wrap-distance-bottom:3.6pt;mso-position-horizontal:absolute;mso-position-horizontal-relative:text;mso-position-vertical:absolute;mso-position-vertical-relative:text;mso-width-percent:0;mso-height-percent:0;mso-width-relative:margin;mso-height-relative:margin;v-text-anchor:top" o:spid="_x0000_s1040" fillcolor="#002060" stroked="f" type="#_x0000_t202" o:gfxdata="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" w14:anchorId="10A7623F">
                 <v:textbox>
                   <w:txbxContent>
                     <w:p>
@@ -3444,12 +3444,7 @@
           <w:sz w:val="20"/>
         </w:rPr>
         <w:sectPr>
-          <w:headerReference w:type="even" r:id="rId21"/>
-          <w:headerReference w:type="default" r:id="rId22"/>
-          <w:footerReference w:type="even" r:id="rId23"/>
-          <w:footerReference w:type="default" r:id="rId24"/>
-          <w:headerReference w:type="first" r:id="rId25"/>
-          <w:footerReference w:type="first" r:id="rId26"/>
+          <w:headerReference w:type="default" r:id="rId21"/>
           <w:pgSz w:w="11920" w:h="16840"/>
           <w:pgMar w:top="1660" w:right="0" w:bottom="280" w:left="0" w:header="580" w:footer="720" w:gutter="0"/>
           <w:pgNumType w:start="1"/>
@@ -3466,7 +3461,7 @@
         <mc:AlternateContent>
           <mc:Choice Requires="wps">
             <w:drawing>
-              <wp:anchor distT="0" distB="0" distL="114300" distR="114300" simplePos="0" relativeHeight="251676672" behindDoc="0" locked="0" layoutInCell="1" allowOverlap="1" wp14:editId="0BBB77B1" wp14:anchorId="4B04A1AE">
+              <wp:anchor distT="0" distB="0" distL="114300" distR="114300" simplePos="0" relativeHeight="251676672" behindDoc="0" locked="0" layoutInCell="1" allowOverlap="1" wp14:editId="0DBD9340" wp14:anchorId="027CEDDB">
                 <wp:simplePos x="0" y="0"/>
                 <wp:positionH relativeFrom="column">
                   <wp:posOffset>6521450</wp:posOffset>
@@ -3555,7 +3550,7 @@
           </mc:Choice>
           <mc:Fallback>
             <w:pict>
-              <v:shape id="Text Box 226" style="position:absolute;margin-left:513.5pt;margin-top:13.25pt;width:50.45pt;height:18.75pt;z-index:251676672;visibility:visible;mso-wrap-style:square;mso-width-percent:0;mso-height-percent:0;mso-wrap-distance-left:9pt;mso-wrap-distance-top:0;mso-wrap-distance-right:9pt;mso-wrap-distance-bottom:0;mso-position-horizontal:absolute;mso-position-horizontal-relative:text;mso-position-vertical:absolute;mso-position-vertical-relative:text;mso-width-percent:0;mso-height-percent:0;mso-width-relative:margin;mso-height-relative:margin;v-text-anchor:top" o:spid="_x0000_s1041" fillcolor="white [3201]" stroked="f" strokeweight=".5pt" type="#_x0000_t202" o:gfxdata="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" w14:anchorId="4B04A1AE">
+              <v:shape id="Text Box 226" style="position:absolute;margin-left:513.5pt;margin-top:13.25pt;width:50.45pt;height:18.75pt;z-index:251676672;visibility:visible;mso-wrap-style:square;mso-width-percent:0;mso-height-percent:0;mso-wrap-distance-left:9pt;mso-wrap-distance-top:0;mso-wrap-distance-right:9pt;mso-wrap-distance-bottom:0;mso-position-horizontal:absolute;mso-position-horizontal-relative:text;mso-position-vertical:absolute;mso-position-vertical-relative:text;mso-width-percent:0;mso-height-percent:0;mso-width-relative:margin;mso-height-relative:margin;v-text-anchor:top" o:spid="_x0000_s1041" fillcolor="white [3201]" stroked="f" strokeweight=".5pt" type="#_x0000_t202" o:gfxdata="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" w14:anchorId="027CEDDB">
                 <v:textbox>
                   <w:txbxContent>
                     <w:p>
@@ -3608,7 +3603,7 @@
         <mc:AlternateContent>
           <mc:Choice Requires="wps">
             <w:drawing>
-              <wp:anchor distT="45720" distB="45720" distL="114300" distR="114300" simplePos="0" relativeHeight="251675648" behindDoc="0" locked="0" layoutInCell="1" allowOverlap="1" wp14:editId="3008B22F" wp14:anchorId="31EB6EDC">
+              <wp:anchor distT="45720" distB="45720" distL="114300" distR="114300" simplePos="0" relativeHeight="251675648" behindDoc="0" locked="0" layoutInCell="1" allowOverlap="1" wp14:editId="2D36DBD5" wp14:anchorId="3CC6AF10">
                 <wp:simplePos x="0" y="0"/>
                 <wp:positionH relativeFrom="margin">
                   <wp:align>center</wp:align>
@@ -3919,12 +3914,21 @@
                               </w:rPr>
                               <w:t xml:space="preserve">                                  </w:t>
                             </w:r>
+                            <w:proofErr w:type="spellStart"/>
                             <w:r>
                               <w:rPr>
                                 <w:color w:val="002060"/>
                                 <w:sz w:val="12"/>
                               </w:rPr>
-                              <w:t>Incase of a Company</w:t>
+                              <w:t>Incase</w:t>
+                            </w:r>
+                            <w:proofErr w:type="spellEnd"/>
+                            <w:r>
+                              <w:rPr>
+                                <w:color w:val="002060"/>
+                                <w:sz w:val="12"/>
+                              </w:rPr>
+                              <w:t xml:space="preserve"> of a Company</w:t>
                             </w:r>
                             <w:r>
                               <w:rPr>
@@ -4277,7 +4281,7 @@
           </mc:Choice>
           <mc:Fallback>
             <w:pict>
-              <v:shape id="_x0000_s1042" style="position:absolute;margin-left:0;margin-top:13.3pt;width:535.2pt;height:136.1pt;z-index:251675648;visibility:visible;mso-wrap-style:square;mso-width-percent:0;mso-height-percent:0;mso-wrap-distance-left:9pt;mso-wrap-distance-top:3.6pt;mso-wrap-distance-right:9pt;mso-wrap-distance-bottom:3.6pt;mso-position-horizontal:center;mso-position-horizontal-relative:margin;mso-position-vertical:absolute;mso-position-vertical-relative:text;mso-width-percent:0;mso-height-percent:0;mso-width-relative:margin;mso-height-relative:margin;v-text-anchor:top" strokecolor="#cfcdcd [2894]" type="#_x0000_t202" o:gfxdata="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" w14:anchorId="31EB6EDC">
+              <v:shape id="_x0000_s1042" style="position:absolute;margin-left:0;margin-top:13.3pt;width:535.2pt;height:136.1pt;z-index:251675648;visibility:visible;mso-wrap-style:square;mso-width-percent:0;mso-height-percent:0;mso-wrap-distance-left:9pt;mso-wrap-distance-top:3.6pt;mso-wrap-distance-right:9pt;mso-wrap-distance-bottom:3.6pt;mso-position-horizontal:center;mso-position-horizontal-relative:margin;mso-position-vertical:absolute;mso-position-vertical-relative:text;mso-width-percent:0;mso-height-percent:0;mso-width-relative:margin;mso-height-relative:margin;v-text-anchor:top" strokecolor="#cfcdcd [2894]" type="#_x0000_t202" o:gfxdata="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" w14:anchorId="3CC6AF10">
                 <v:textbox>
                   <w:txbxContent>
                     <w:p>
@@ -4546,12 +4550,21 @@
                         </w:rPr>
                         <w:t xml:space="preserve">                                  </w:t>
                       </w:r>
+                      <w:proofErr w:type="spellStart"/>
                       <w:r>
                         <w:rPr>
                           <w:color w:val="002060"/>
                           <w:sz w:val="12"/>
                         </w:rPr>
-                        <w:t>Incase of a Company</w:t>
+                        <w:t>Incase</w:t>
+                      </w:r>
+                      <w:proofErr w:type="spellEnd"/>
+                      <w:r>
+                        <w:rPr>
+                          <w:color w:val="002060"/>
+                          <w:sz w:val="12"/>
+                        </w:rPr>
+                        <w:t xml:space="preserve"> of a Company</w:t>
                       </w:r>
                       <w:r>
                         <w:rPr>
@@ -4920,7 +4933,7 @@
         <mc:AlternateContent>
           <mc:Choice Requires="wps">
             <w:drawing>
-              <wp:anchor distT="0" distB="0" distL="114300" distR="114300" simplePos="0" relativeHeight="251659264" behindDoc="1" locked="0" layoutInCell="1" allowOverlap="1" wp14:editId="527A3B78" wp14:anchorId="58A87AC2">
+              <wp:anchor distT="0" distB="0" distL="114300" distR="114300" simplePos="0" relativeHeight="251659264" behindDoc="1" locked="0" layoutInCell="1" allowOverlap="1" wp14:editId="01AE78AC" wp14:anchorId="2C9C4276">
                 <wp:simplePos x="0" y="0"/>
                 <wp:positionH relativeFrom="page">
                   <wp:posOffset>857250</wp:posOffset>
@@ -4983,7 +4996,7 @@
               </wp:anchor>
             </w:drawing>
           </mc:Choice>
-          <mc:Fallback xmlns:pic="http://schemas.openxmlformats.org/drawingml/2006/picture" xmlns:a14="http://schemas.microsoft.com/office/drawing/2010/main" xmlns:a="http://schemas.openxmlformats.org/drawingml/2006/main">
+          <mc:Fallback xmlns:a="http://schemas.openxmlformats.org/drawingml/2006/main" xmlns:a14="http://schemas.microsoft.com/office/drawing/2010/main" xmlns:pic="http://schemas.openxmlformats.org/drawingml/2006/picture">
             <w:pict>
               <v:rect id="Rectangle 98" style="position:absolute;margin-left:67.5pt;margin-top:521.55pt;width:2pt;height:.2pt;z-index:-251657216;visibility:visible;mso-wrap-style:square;mso-width-percent:0;mso-height-percent:0;mso-wrap-distance-left:9pt;mso-wrap-distance-top:0;mso-wrap-distance-right:9pt;mso-wrap-distance-bottom:0;mso-position-horizontal:absolute;mso-position-horizontal-relative:page;mso-position-vertical:absolute;mso-position-vertical-relative:page;mso-width-percent:0;mso-height-percent:0;mso-width-relative:page;mso-height-relative:page;v-text-anchor:top" o:spid="_x0000_s1026" fillcolor="#9d9d9d" stroked="f" o:gfxdata="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" w14:anchorId="3EF27AD4">
                 <w10:wrap anchorx="page" anchory="page"/>
@@ -5000,7 +5013,7 @@
         <mc:AlternateContent>
           <mc:Choice Requires="wps">
             <w:drawing>
-              <wp:anchor distT="0" distB="0" distL="114300" distR="114300" simplePos="0" relativeHeight="251660288" behindDoc="1" locked="0" layoutInCell="1" allowOverlap="1" wp14:editId="0CCC8FA1" wp14:anchorId="36484003">
+              <wp:anchor distT="0" distB="0" distL="114300" distR="114300" simplePos="0" relativeHeight="251660288" behindDoc="1" locked="0" layoutInCell="1" allowOverlap="1" wp14:editId="538860A4" wp14:anchorId="1D57FCC2">
                 <wp:simplePos x="0" y="0"/>
                 <wp:positionH relativeFrom="page">
                   <wp:posOffset>2520950</wp:posOffset>
@@ -5063,7 +5076,7 @@
               </wp:anchor>
             </w:drawing>
           </mc:Choice>
-          <mc:Fallback xmlns:pic="http://schemas.openxmlformats.org/drawingml/2006/picture" xmlns:a14="http://schemas.microsoft.com/office/drawing/2010/main" xmlns:a="http://schemas.openxmlformats.org/drawingml/2006/main">
+          <mc:Fallback xmlns:a="http://schemas.openxmlformats.org/drawingml/2006/main" xmlns:a14="http://schemas.microsoft.com/office/drawing/2010/main" xmlns:pic="http://schemas.openxmlformats.org/drawingml/2006/picture">
             <w:pict>
               <v:rect id="Rectangle 97" style="position:absolute;margin-left:198.5pt;margin-top:804.55pt;width:2pt;height:.2pt;z-index:-251656192;visibility:visible;mso-wrap-style:square;mso-width-percent:0;mso-height-percent:0;mso-wrap-distance-left:9pt;mso-wrap-distance-top:0;mso-wrap-distance-right:9pt;mso-wrap-distance-bottom:0;mso-position-horizontal:absolute;mso-position-horizontal-relative:page;mso-position-vertical:absolute;mso-position-vertical-relative:page;mso-width-percent:0;mso-height-percent:0;mso-width-relative:page;mso-height-relative:page;v-text-anchor:top" o:spid="_x0000_s1026" fillcolor="#9d9d9d" stroked="f" o:gfxdata="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" w14:anchorId="663D5ECD">
                 <w10:wrap anchorx="page" anchory="page"/>
@@ -5080,7 +5093,7 @@
         <mc:AlternateContent>
           <mc:Choice Requires="wps">
             <w:drawing>
-              <wp:anchor distT="0" distB="0" distL="114300" distR="114300" simplePos="0" relativeHeight="251661312" behindDoc="1" locked="0" layoutInCell="1" allowOverlap="1" wp14:editId="33F3CDCE" wp14:anchorId="1EAED37B">
+              <wp:anchor distT="0" distB="0" distL="114300" distR="114300" simplePos="0" relativeHeight="251661312" behindDoc="1" locked="0" layoutInCell="1" allowOverlap="1" wp14:editId="6AC59451" wp14:anchorId="31F04CF8">
                 <wp:simplePos x="0" y="0"/>
                 <wp:positionH relativeFrom="page">
                   <wp:posOffset>5988050</wp:posOffset>
@@ -5143,7 +5156,7 @@
               </wp:anchor>
             </w:drawing>
           </mc:Choice>
-          <mc:Fallback xmlns:pic="http://schemas.openxmlformats.org/drawingml/2006/picture" xmlns:a14="http://schemas.microsoft.com/office/drawing/2010/main" xmlns:a="http://schemas.openxmlformats.org/drawingml/2006/main">
+          <mc:Fallback xmlns:a="http://schemas.openxmlformats.org/drawingml/2006/main" xmlns:a14="http://schemas.microsoft.com/office/drawing/2010/main" xmlns:pic="http://schemas.openxmlformats.org/drawingml/2006/picture">
             <w:pict>
               <v:rect id="Rectangle 96" style="position:absolute;margin-left:471.5pt;margin-top:804.55pt;width:2pt;height:.2pt;z-index:-251655168;visibility:visible;mso-wrap-style:square;mso-width-percent:0;mso-height-percent:0;mso-wrap-distance-left:9pt;mso-wrap-distance-top:0;mso-wrap-distance-right:9pt;mso-wrap-distance-bottom:0;mso-position-horizontal:absolute;mso-position-horizontal-relative:page;mso-position-vertical:absolute;mso-position-vertical-relative:page;mso-width-percent:0;mso-height-percent:0;mso-width-relative:page;mso-height-relative:page;v-text-anchor:top" o:spid="_x0000_s1026" fillcolor="#9d9d9d" stroked="f" o:gfxdata="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" w14:anchorId="4158125D">
                 <w10:wrap anchorx="page" anchory="page"/>
@@ -5174,7 +5187,7 @@
         <mc:AlternateContent>
           <mc:Choice Requires="wps">
             <w:drawing>
-              <wp:anchor distT="0" distB="0" distL="114300" distR="114300" simplePos="0" relativeHeight="251677696" behindDoc="0" locked="0" layoutInCell="1" allowOverlap="1" wp14:editId="3365684A" wp14:anchorId="2B2B338D">
+              <wp:anchor distT="0" distB="0" distL="114300" distR="114300" simplePos="0" relativeHeight="251677696" behindDoc="0" locked="0" layoutInCell="1" allowOverlap="1" wp14:editId="4BC1758C" wp14:anchorId="38D7D98B">
                 <wp:simplePos x="0" y="0"/>
                 <wp:positionH relativeFrom="column">
                   <wp:posOffset>6642100</wp:posOffset>
@@ -5262,7 +5275,7 @@
           </mc:Choice>
           <mc:Fallback>
             <w:pict>
-              <v:shape id="Text Box 227" style="position:absolute;margin-left:523pt;margin-top:6pt;width:41pt;height:21pt;z-index:251677696;visibility:visible;mso-wrap-style:square;mso-width-percent:0;mso-height-percent:0;mso-wrap-distance-left:9pt;mso-wrap-distance-top:0;mso-wrap-distance-right:9pt;mso-wrap-distance-bottom:0;mso-position-horizontal:absolute;mso-position-horizontal-relative:text;mso-position-vertical:absolute;mso-position-vertical-relative:text;mso-width-percent:0;mso-height-percent:0;mso-width-relative:margin;mso-height-relative:margin;v-text-anchor:top" o:spid="_x0000_s1043" fillcolor="white [3201]" stroked="f" strokeweight=".5pt" type="#_x0000_t202" o:gfxdata="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" w14:anchorId="2B2B338D">
+              <v:shape id="Text Box 227" style="position:absolute;margin-left:523pt;margin-top:6pt;width:41pt;height:21pt;z-index:251677696;visibility:visible;mso-wrap-style:square;mso-width-percent:0;mso-height-percent:0;mso-wrap-distance-left:9pt;mso-wrap-distance-top:0;mso-wrap-distance-right:9pt;mso-wrap-distance-bottom:0;mso-position-horizontal:absolute;mso-position-horizontal-relative:text;mso-position-vertical:absolute;mso-position-vertical-relative:text;mso-width-percent:0;mso-height-percent:0;mso-width-relative:margin;mso-height-relative:margin;v-text-anchor:top" o:spid="_x0000_s1043" fillcolor="white [3201]" stroked="f" strokeweight=".5pt" type="#_x0000_t202" o:gfxdata="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" w14:anchorId="38D7D98B">
                 <v:textbox>
                   <w:txbxContent>
                     <w:p>
@@ -5315,7 +5328,7 @@
         <mc:AlternateContent>
           <mc:Choice Requires="wps">
             <w:drawing>
-              <wp:anchor distT="0" distB="0" distL="114300" distR="114300" simplePos="0" relativeHeight="251679744" behindDoc="0" locked="0" layoutInCell="1" allowOverlap="1" wp14:editId="4CDF310C" wp14:anchorId="545E9DF9">
+              <wp:anchor distT="0" distB="0" distL="114300" distR="114300" simplePos="0" relativeHeight="251679744" behindDoc="0" locked="0" layoutInCell="1" allowOverlap="1" wp14:editId="17490D85" wp14:anchorId="57C763B5">
                 <wp:simplePos x="0" y="0"/>
                 <wp:positionH relativeFrom="column">
                   <wp:posOffset>1328738</wp:posOffset>
@@ -5377,7 +5390,7 @@
               </wp:anchor>
             </w:drawing>
           </mc:Choice>
-          <mc:Fallback xmlns:pic="http://schemas.openxmlformats.org/drawingml/2006/picture" xmlns:a14="http://schemas.microsoft.com/office/drawing/2010/main" xmlns:a="http://schemas.openxmlformats.org/drawingml/2006/main">
+          <mc:Fallback xmlns:a="http://schemas.openxmlformats.org/drawingml/2006/main" xmlns:a14="http://schemas.microsoft.com/office/drawing/2010/main" xmlns:pic="http://schemas.openxmlformats.org/drawingml/2006/picture">
             <w:pict>
               <v:line id="Straight Connector 230" style="position:absolute;flip:y;z-index:251679744;visibility:visible;mso-wrap-style:square;mso-width-percent:0;mso-height-percent:0;mso-wrap-distance-left:9pt;mso-wrap-distance-top:0;mso-wrap-distance-right:9pt;mso-wrap-distance-bottom:0;mso-position-horizontal:absolute;mso-position-horizontal-relative:text;mso-position-vertical:absolute;mso-position-vertical-relative:text;mso-width-percent:0;mso-height-percent:0;mso-width-relative:margin;mso-height-relative:margin" o:spid="_x0000_s1026" strokecolor="silver" o:gfxdata="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" from="104.65pt,2.65pt" to="517.15pt,2.65pt" w14:anchorId="32535D83">
                 <v:stroke dashstyle="dash"/>
@@ -5416,7 +5429,7 @@
         <mc:AlternateContent>
           <mc:Choice Requires="wps">
             <w:drawing>
-              <wp:anchor distT="0" distB="0" distL="114300" distR="114300" simplePos="0" relativeHeight="251678720" behindDoc="0" locked="0" layoutInCell="1" allowOverlap="1" wp14:editId="4F6686D3" wp14:anchorId="2969802A">
+              <wp:anchor distT="0" distB="0" distL="114300" distR="114300" simplePos="0" relativeHeight="251678720" behindDoc="0" locked="0" layoutInCell="1" allowOverlap="1" wp14:editId="374D5604" wp14:anchorId="689856F8">
                 <wp:simplePos x="0" y="0"/>
                 <wp:positionH relativeFrom="column">
                   <wp:posOffset>6193790</wp:posOffset>
@@ -5511,7 +5524,7 @@
           </mc:Choice>
           <mc:Fallback>
             <w:pict>
-              <v:shape id="Text Box 228" style="position:absolute;left:0;text-align:left;margin-left:487.7pt;margin-top:6.05pt;width:76.5pt;height:21.75pt;z-index:251678720;visibility:visible;mso-wrap-style:square;mso-width-percent:0;mso-height-percent:0;mso-wrap-distance-left:9pt;mso-wrap-distance-top:0;mso-wrap-distance-right:9pt;mso-wrap-distance-bottom:0;mso-position-horizontal:absolute;mso-position-horizontal-relative:text;mso-position-vertical:absolute;mso-position-vertical-relative:text;mso-width-percent:0;mso-height-percent:0;mso-width-relative:margin;mso-height-relative:margin;v-text-anchor:top" o:spid="_x0000_s1044" fillcolor="white [3201]" stroked="f" strokeweight=".5pt" type="#_x0000_t202" o:gfxdata="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" w14:anchorId="2969802A">
+              <v:shape id="Text Box 228" style="position:absolute;left:0;text-align:left;margin-left:487.7pt;margin-top:6.05pt;width:76.5pt;height:21.75pt;z-index:251678720;visibility:visible;mso-wrap-style:square;mso-width-percent:0;mso-height-percent:0;mso-wrap-distance-left:9pt;mso-wrap-distance-top:0;mso-wrap-distance-right:9pt;mso-wrap-distance-bottom:0;mso-position-horizontal:absolute;mso-position-horizontal-relative:text;mso-position-vertical:absolute;mso-position-vertical-relative:text;mso-width-percent:0;mso-height-percent:0;mso-width-relative:margin;mso-height-relative:margin;v-text-anchor:top" o:spid="_x0000_s1044" fillcolor="white [3201]" stroked="f" strokeweight=".5pt" type="#_x0000_t202" o:gfxdata="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" w14:anchorId="689856F8">
                 <v:textbox>
                   <w:txbxContent>
                     <w:p>
@@ -5570,7 +5583,7 @@
         <mc:AlternateContent>
           <mc:Choice Requires="wps">
             <w:drawing>
-              <wp:anchor distT="0" distB="0" distL="114300" distR="114300" simplePos="0" relativeHeight="251680768" behindDoc="0" locked="0" layoutInCell="1" allowOverlap="1" wp14:editId="18D786AD" wp14:anchorId="2B4F3601">
+              <wp:anchor distT="0" distB="0" distL="114300" distR="114300" simplePos="0" relativeHeight="251680768" behindDoc="0" locked="0" layoutInCell="1" allowOverlap="1" wp14:editId="19329F3A" wp14:anchorId="2CE99CD7">
                 <wp:simplePos x="0" y="0"/>
                 <wp:positionH relativeFrom="column">
                   <wp:posOffset>1338263</wp:posOffset>
@@ -5632,7 +5645,7 @@
               </wp:anchor>
             </w:drawing>
           </mc:Choice>
-          <mc:Fallback xmlns:pic="http://schemas.openxmlformats.org/drawingml/2006/picture" xmlns:a14="http://schemas.microsoft.com/office/drawing/2010/main" xmlns:a="http://schemas.openxmlformats.org/drawingml/2006/main">
+          <mc:Fallback xmlns:a="http://schemas.openxmlformats.org/drawingml/2006/main" xmlns:a14="http://schemas.microsoft.com/office/drawing/2010/main" xmlns:pic="http://schemas.openxmlformats.org/drawingml/2006/picture">
             <w:pict>
               <v:line id="Straight Connector 232" style="position:absolute;flip:y;z-index:251680768;visibility:visible;mso-wrap-style:square;mso-width-percent:0;mso-height-percent:0;mso-wrap-distance-left:9pt;mso-wrap-distance-top:0;mso-wrap-distance-right:9pt;mso-wrap-distance-bottom:0;mso-position-horizontal:absolute;mso-position-horizontal-relative:text;mso-position-vertical:absolute;mso-position-vertical-relative:text;mso-width-percent:0;mso-height-percent:0;mso-width-relative:margin;mso-height-relative:margin" o:spid="_x0000_s1026" strokecolor="silver" o:gfxdata="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" from="105.4pt,3.55pt" to="526.9pt,4.7pt" w14:anchorId="18254DBF">
                 <v:stroke dashstyle="dash"/>
@@ -5650,7 +5663,7 @@
         <mc:AlternateContent>
           <mc:Choice Requires="wps">
             <w:drawing>
-              <wp:anchor distT="0" distB="0" distL="114300" distR="114300" simplePos="0" relativeHeight="251682816" behindDoc="0" locked="0" layoutInCell="1" allowOverlap="1" wp14:editId="515A4608" wp14:anchorId="1F566B2C">
+              <wp:anchor distT="0" distB="0" distL="114300" distR="114300" simplePos="0" relativeHeight="251682816" behindDoc="0" locked="0" layoutInCell="1" allowOverlap="1" wp14:editId="69AFC2B5" wp14:anchorId="4613339C">
                 <wp:simplePos x="0" y="0"/>
                 <wp:positionH relativeFrom="column">
                   <wp:posOffset>2685097</wp:posOffset>
@@ -5727,7 +5740,7 @@
           </mc:Choice>
           <mc:Fallback>
             <w:pict>
-              <v:shape id="Text Box 234" style="position:absolute;left:0;text-align:left;margin-left:211.4pt;margin-top:33.85pt;width:63.35pt;height:21pt;z-index:251682816;visibility:visible;mso-wrap-style:square;mso-width-percent:0;mso-wrap-distance-left:9pt;mso-wrap-distance-top:0;mso-wrap-distance-right:9pt;mso-wrap-distance-bottom:0;mso-position-horizontal:absolute;mso-position-horizontal-relative:text;mso-position-vertical:absolute;mso-position-vertical-relative:text;mso-width-percent:0;mso-width-relative:margin;v-text-anchor:top" o:spid="_x0000_s1045" fillcolor="white [3201]" stroked="f" strokeweight=".5pt" type="#_x0000_t202" o:gfxdata="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" w14:anchorId="1F566B2C">
+              <v:shape id="Text Box 234" style="position:absolute;left:0;text-align:left;margin-left:211.4pt;margin-top:33.85pt;width:63.35pt;height:21pt;z-index:251682816;visibility:visible;mso-wrap-style:square;mso-width-percent:0;mso-wrap-distance-left:9pt;mso-wrap-distance-top:0;mso-wrap-distance-right:9pt;mso-wrap-distance-bottom:0;mso-position-horizontal:absolute;mso-position-horizontal-relative:text;mso-position-vertical:absolute;mso-position-vertical-relative:text;mso-width-percent:0;mso-width-relative:margin;v-text-anchor:top" o:spid="_x0000_s1045" fillcolor="white [3201]" stroked="f" strokeweight=".5pt" type="#_x0000_t202" o:gfxdata="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" w14:anchorId="4613339C">
                 <v:textbox>
                   <w:txbxContent>
                     <w:p>
@@ -5771,7 +5784,7 @@
         <mc:AlternateContent>
           <mc:Choice Requires="wps">
             <w:drawing>
-              <wp:anchor distT="0" distB="0" distL="114300" distR="114300" simplePos="0" relativeHeight="251681792" behindDoc="0" locked="0" layoutInCell="1" allowOverlap="1" wp14:editId="483B3949" wp14:anchorId="0F3D92F3">
+              <wp:anchor distT="0" distB="0" distL="114300" distR="114300" simplePos="0" relativeHeight="251681792" behindDoc="0" locked="0" layoutInCell="1" allowOverlap="1" wp14:editId="66D4D1FA" wp14:anchorId="16CD8E32">
                 <wp:simplePos x="0" y="0"/>
                 <wp:positionH relativeFrom="column">
                   <wp:posOffset>1620520</wp:posOffset>
@@ -5833,7 +5846,7 @@
               </wp:anchor>
             </w:drawing>
           </mc:Choice>
-          <mc:Fallback xmlns:pic="http://schemas.openxmlformats.org/drawingml/2006/picture" xmlns:a14="http://schemas.microsoft.com/office/drawing/2010/main" xmlns:a="http://schemas.openxmlformats.org/drawingml/2006/main">
+          <mc:Fallback xmlns:a="http://schemas.openxmlformats.org/drawingml/2006/main" xmlns:a14="http://schemas.microsoft.com/office/drawing/2010/main" xmlns:pic="http://schemas.openxmlformats.org/drawingml/2006/picture">
             <w:pict>
               <v:line id="Straight Connector 233" style="position:absolute;flip:y;z-index:251681792;visibility:visible;mso-wrap-style:square;mso-width-percent:0;mso-height-percent:0;mso-wrap-distance-left:9pt;mso-wrap-distance-top:0;mso-wrap-distance-right:9pt;mso-wrap-distance-bottom:0;mso-position-horizontal:absolute;mso-position-horizontal-relative:text;mso-position-vertical:absolute;mso-position-vertical-relative:text;mso-width-percent:0;mso-height-percent:0;mso-width-relative:margin;mso-height-relative:margin" o:spid="_x0000_s1026" strokecolor="silver" o:gfxdata="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" from="127.6pt,25.05pt" to="490.6pt,27.55pt" w14:anchorId="113D1DDF">
                 <v:stroke dashstyle="dash"/>
@@ -5860,144 +5873,6 @@
       </w:pPr>
       <w:r>
         <w:rPr>
-          <w:rFonts w:ascii="Times New Roman"/>
-          <w:noProof/>
-          <w:sz w:val="20"/>
-        </w:rPr>
-        <mc:AlternateContent>
-          <mc:Choice Requires="wps">
-            <w:drawing>
-              <wp:anchor distT="0" distB="0" distL="114300" distR="114300" simplePos="0" relativeHeight="251684864" behindDoc="0" locked="0" layoutInCell="1" allowOverlap="1" wp14:editId="72FC0AD2" wp14:anchorId="23118A86">
-                <wp:simplePos x="0" y="0"/>
-                <wp:positionH relativeFrom="column">
-                  <wp:posOffset>6247130</wp:posOffset>
-                </wp:positionH>
-                <wp:positionV relativeFrom="paragraph">
-                  <wp:posOffset>121920</wp:posOffset>
-                </wp:positionV>
-                <wp:extent cx="918210" cy="252413"/>
-                <wp:effectExtent l="0" t="0" r="0" b="0"/>
-                <wp:wrapNone/>
-                <wp:docPr id="236" name="Text Box 236"/>
-                <wp:cNvGraphicFramePr/>
-                <a:graphic xmlns:a="http://schemas.openxmlformats.org/drawingml/2006/main">
-                  <a:graphicData uri="http://schemas.microsoft.com/office/word/2010/wordprocessingShape">
-                    <wps:wsp>
-                      <wps:cNvSpPr txBox="1"/>
-                      <wps:spPr>
-                        <a:xfrm>
-                          <a:off x="0" y="0"/>
-                          <a:ext cx="918210" cy="252413"/>
-                        </a:xfrm>
-                        <a:prstGeom prst="rect">
-                          <a:avLst/>
-                        </a:prstGeom>
-                        <a:solidFill>
-                          <a:schemeClr val="lt1"/>
-                        </a:solidFill>
-                        <a:ln w="6350">
-                          <a:noFill/>
-                        </a:ln>
-                      </wps:spPr>
-                      <wps:txbx>
-                        <w:txbxContent>
-                          <w:p>
-                            <w:pPr>
-                              <w:rPr>
-                                <w:rFonts w:ascii="Microsoft Sans Serif" w:hAnsi="Microsoft Sans Serif" w:cs="Microsoft Sans Serif"/>
-                              </w:rPr>
-                            </w:pPr>
-                            <w:proofErr w:type="spellStart"/>
-                            <w:r>
-                              <w:rPr>
-                                <w:rFonts w:ascii="Microsoft Sans Serif" w:hAnsi="Microsoft Sans Serif" w:cs="Microsoft Sans Serif"/>
-                                <w:color w:val="002060"/>
-                              </w:rPr>
-                              <w:t>سلطة</w:t>
-                            </w:r>
-                            <w:proofErr w:type="spellEnd"/>
-                            <w:r>
-                              <w:rPr>
-                                <w:rFonts w:ascii="Microsoft Sans Serif" w:hAnsi="Microsoft Sans Serif" w:cs="Microsoft Sans Serif"/>
-                                <w:color w:val="002060"/>
-                              </w:rPr>
-                              <w:t xml:space="preserve"> </w:t>
-                            </w:r>
-                            <w:proofErr w:type="spellStart"/>
-                            <w:r>
-                              <w:rPr>
-                                <w:rFonts w:ascii="Microsoft Sans Serif" w:hAnsi="Microsoft Sans Serif" w:cs="Microsoft Sans Serif"/>
-                                <w:color w:val="002060"/>
-                              </w:rPr>
-                              <w:t>الترخيص</w:t>
-                            </w:r>
-                            <w:proofErr w:type="spellEnd"/>
-                          </w:p>
-                          <w:p/>
-                        </w:txbxContent>
-                      </wps:txbx>
-                      <wps:bodyPr rot="0" spcFirstLastPara="0" vertOverflow="overflow" horzOverflow="overflow" vert="horz" wrap="square" lIns="91440" tIns="45720" rIns="91440" bIns="45720" numCol="1" spcCol="0" rtlCol="0" fromWordArt="0" anchor="t" anchorCtr="0" forceAA="0" compatLnSpc="1">
-                        <a:prstTxWarp prst="textNoShape">
-                          <a:avLst/>
-                        </a:prstTxWarp>
-                        <a:noAutofit/>
-                      </wps:bodyPr>
-                    </wps:wsp>
-                  </a:graphicData>
-                </a:graphic>
-                <wp14:sizeRelH relativeFrom="margin">
-                  <wp14:pctWidth>0</wp14:pctWidth>
-                </wp14:sizeRelH>
-              </wp:anchor>
-            </w:drawing>
-          </mc:Choice>
-          <mc:Fallback>
-            <w:pict>
-              <v:shape id="Text Box 236" style="position:absolute;margin-left:491.9pt;margin-top:9.6pt;width:72.3pt;height:19.9pt;z-index:251684864;visibility:visible;mso-wrap-style:square;mso-width-percent:0;mso-wrap-distance-left:9pt;mso-wrap-distance-top:0;mso-wrap-distance-right:9pt;mso-wrap-distance-bottom:0;mso-position-horizontal:absolute;mso-position-horizontal-relative:text;mso-position-vertical:absolute;mso-position-vertical-relative:text;mso-width-percent:0;mso-width-relative:margin;v-text-anchor:top" o:spid="_x0000_s1046" fillcolor="white [3201]" stroked="f" strokeweight=".5pt" type="#_x0000_t202" o:gfxdata="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" w14:anchorId="23118A86">
-                <v:textbox>
-                  <w:txbxContent>
-                    <w:p>
-                      <w:pPr>
-                        <w:rPr>
-                          <w:rFonts w:ascii="Microsoft Sans Serif" w:hAnsi="Microsoft Sans Serif" w:cs="Microsoft Sans Serif"/>
-                        </w:rPr>
-                      </w:pPr>
-                      <w:proofErr w:type="spellStart"/>
-                      <w:r>
-                        <w:rPr>
-                          <w:rFonts w:ascii="Microsoft Sans Serif" w:hAnsi="Microsoft Sans Serif" w:cs="Microsoft Sans Serif"/>
-                          <w:color w:val="002060"/>
-                        </w:rPr>
-                        <w:t>سلطة</w:t>
-                      </w:r>
-                      <w:proofErr w:type="spellEnd"/>
-                      <w:r>
-                        <w:rPr>
-                          <w:rFonts w:ascii="Microsoft Sans Serif" w:hAnsi="Microsoft Sans Serif" w:cs="Microsoft Sans Serif"/>
-                          <w:color w:val="002060"/>
-                        </w:rPr>
-                        <w:t xml:space="preserve"> </w:t>
-                      </w:r>
-                      <w:proofErr w:type="spellStart"/>
-                      <w:r>
-                        <w:rPr>
-                          <w:rFonts w:ascii="Microsoft Sans Serif" w:hAnsi="Microsoft Sans Serif" w:cs="Microsoft Sans Serif"/>
-                          <w:color w:val="002060"/>
-                        </w:rPr>
-                        <w:t>الترخيص</w:t>
-                      </w:r>
-                      <w:proofErr w:type="spellEnd"/>
-                    </w:p>
-                    <w:p/>
-                  </w:txbxContent>
-                </v:textbox>
-              </v:shape>
-            </w:pict>
-          </mc:Fallback>
-        </mc:AlternateContent>
-      </w:r>
-      <w:r>
-        <w:rPr>
           <w:rFonts w:ascii="Arial"/>
           <w:noProof/>
           <w:sz w:val="20"/>
@@ -6005,23 +5880,23 @@
         <mc:AlternateContent>
           <mc:Choice Requires="wps">
             <w:drawing>
-              <wp:anchor distT="0" distB="0" distL="114300" distR="114300" simplePos="0" relativeHeight="251692032" behindDoc="1" locked="0" layoutInCell="1" allowOverlap="1" wp14:editId="654346C2" wp14:anchorId="4A3819D1">
+              <wp:anchor distT="0" distB="0" distL="114300" distR="114300" simplePos="0" relativeHeight="251692032" behindDoc="1" locked="0" layoutInCell="1" allowOverlap="1" wp14:editId="3E655E80" wp14:anchorId="179C7DCA">
                 <wp:simplePos x="0" y="0"/>
                 <wp:positionH relativeFrom="column">
                   <wp:posOffset>4581525</wp:posOffset>
                 </wp:positionH>
                 <wp:positionV relativeFrom="paragraph">
-                  <wp:posOffset>99695</wp:posOffset>
+                  <wp:posOffset>146685</wp:posOffset>
                 </wp:positionV>
-                <wp:extent cx="1728470" cy="247015"/>
-                <wp:effectExtent l="0" t="0" r="5080" b="635"/>
+                <wp:extent cx="2466975" cy="247015"/>
+                <wp:effectExtent l="0" t="0" r="0" b="635"/>
                 <wp:wrapThrough wrapText="bothSides">
                   <wp:wrapPolygon edited="0">
-                    <wp:start x="0" y="0"/>
-                    <wp:lineTo x="0" y="19990"/>
-                    <wp:lineTo x="21425" y="19990"/>
-                    <wp:lineTo x="21425" y="0"/>
-                    <wp:lineTo x="0" y="0"/>
+                    <wp:start x="500" y="0"/>
+                    <wp:lineTo x="500" y="19990"/>
+                    <wp:lineTo x="21016" y="19990"/>
+                    <wp:lineTo x="21016" y="0"/>
+                    <wp:lineTo x="500" y="0"/>
                   </wp:wrapPolygon>
                 </wp:wrapThrough>
                 <wp:docPr id="244" name="Text Box 244"/>
@@ -6033,14 +5908,12 @@
                       <wps:spPr>
                         <a:xfrm>
                           <a:off x="0" y="0"/>
-                          <a:ext cx="1728470" cy="247015"/>
+                          <a:ext cx="2466975" cy="247015"/>
                         </a:xfrm>
                         <a:prstGeom prst="rect">
                           <a:avLst/>
                         </a:prstGeom>
-                        <a:solidFill>
-                          <a:schemeClr val="lt1"/>
-                        </a:solidFill>
+                        <a:noFill/>
                         <a:ln w="6350">
                           <a:noFill/>
                         </a:ln>
@@ -6096,7 +5969,7 @@
           </mc:Choice>
           <mc:Fallback>
             <w:pict>
-              <v:shape id="Text Box 244" style="position:absolute;margin-left:360.75pt;margin-top:7.85pt;width:136.1pt;height:19.45pt;z-index:-251624448;visibility:visible;mso-wrap-style:square;mso-width-percent:0;mso-height-percent:0;mso-wrap-distance-left:9pt;mso-wrap-distance-top:0;mso-wrap-distance-right:9pt;mso-wrap-distance-bottom:0;mso-position-horizontal:absolute;mso-position-horizontal-relative:text;mso-position-vertical:absolute;mso-position-vertical-relative:text;mso-width-percent:0;mso-height-percent:0;mso-width-relative:margin;mso-height-relative:margin;v-text-anchor:top" o:spid="_x0000_s1047" fillcolor="white [3201]" stroked="f" strokeweight=".5pt" type="#_x0000_t202" o:gfxdata="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" w14:anchorId="4A3819D1">
+              <v:shape id="Text Box 244" style="position:absolute;margin-left:360.75pt;margin-top:11.55pt;width:194.25pt;height:19.45pt;z-index:-251624448;visibility:visible;mso-wrap-style:square;mso-width-percent:0;mso-height-percent:0;mso-wrap-distance-left:9pt;mso-wrap-distance-top:0;mso-wrap-distance-right:9pt;mso-wrap-distance-bottom:0;mso-position-horizontal:absolute;mso-position-horizontal-relative:text;mso-position-vertical:absolute;mso-position-vertical-relative:text;mso-width-percent:0;mso-height-percent:0;mso-width-relative:margin;mso-height-relative:margin;v-text-anchor:top" o:spid="_x0000_s1046" filled="f" stroked="f" strokeweight=".5pt" type="#_x0000_t202" o:gfxdata="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" w14:anchorId="179C7DCA">
                 <v:textbox>
                   <w:txbxContent>
                     <w:sdt>
@@ -6136,6 +6009,144 @@
       </w:r>
       <w:r>
         <w:rPr>
+          <w:rFonts w:ascii="Times New Roman"/>
+          <w:noProof/>
+          <w:sz w:val="20"/>
+        </w:rPr>
+        <mc:AlternateContent>
+          <mc:Choice Requires="wps">
+            <w:drawing>
+              <wp:anchor distT="0" distB="0" distL="114300" distR="114300" simplePos="0" relativeHeight="251684864" behindDoc="0" locked="0" layoutInCell="1" allowOverlap="1" wp14:editId="78D769CD" wp14:anchorId="0D885E68">
+                <wp:simplePos x="0" y="0"/>
+                <wp:positionH relativeFrom="column">
+                  <wp:posOffset>6247130</wp:posOffset>
+                </wp:positionH>
+                <wp:positionV relativeFrom="paragraph">
+                  <wp:posOffset>121920</wp:posOffset>
+                </wp:positionV>
+                <wp:extent cx="918210" cy="252413"/>
+                <wp:effectExtent l="0" t="0" r="0" b="0"/>
+                <wp:wrapNone/>
+                <wp:docPr id="236" name="Text Box 236"/>
+                <wp:cNvGraphicFramePr/>
+                <a:graphic xmlns:a="http://schemas.openxmlformats.org/drawingml/2006/main">
+                  <a:graphicData uri="http://schemas.microsoft.com/office/word/2010/wordprocessingShape">
+                    <wps:wsp>
+                      <wps:cNvSpPr txBox="1"/>
+                      <wps:spPr>
+                        <a:xfrm>
+                          <a:off x="0" y="0"/>
+                          <a:ext cx="918210" cy="252413"/>
+                        </a:xfrm>
+                        <a:prstGeom prst="rect">
+                          <a:avLst/>
+                        </a:prstGeom>
+                        <a:solidFill>
+                          <a:schemeClr val="lt1"/>
+                        </a:solidFill>
+                        <a:ln w="6350">
+                          <a:noFill/>
+                        </a:ln>
+                      </wps:spPr>
+                      <wps:txbx>
+                        <w:txbxContent>
+                          <w:p>
+                            <w:pPr>
+                              <w:rPr>
+                                <w:rFonts w:ascii="Microsoft Sans Serif" w:hAnsi="Microsoft Sans Serif" w:cs="Microsoft Sans Serif"/>
+                              </w:rPr>
+                            </w:pPr>
+                            <w:proofErr w:type="spellStart"/>
+                            <w:r>
+                              <w:rPr>
+                                <w:rFonts w:ascii="Microsoft Sans Serif" w:hAnsi="Microsoft Sans Serif" w:cs="Microsoft Sans Serif"/>
+                                <w:color w:val="002060"/>
+                              </w:rPr>
+                              <w:t>سلطة</w:t>
+                            </w:r>
+                            <w:proofErr w:type="spellEnd"/>
+                            <w:r>
+                              <w:rPr>
+                                <w:rFonts w:ascii="Microsoft Sans Serif" w:hAnsi="Microsoft Sans Serif" w:cs="Microsoft Sans Serif"/>
+                                <w:color w:val="002060"/>
+                              </w:rPr>
+                              <w:t xml:space="preserve"> </w:t>
+                            </w:r>
+                            <w:proofErr w:type="spellStart"/>
+                            <w:r>
+                              <w:rPr>
+                                <w:rFonts w:ascii="Microsoft Sans Serif" w:hAnsi="Microsoft Sans Serif" w:cs="Microsoft Sans Serif"/>
+                                <w:color w:val="002060"/>
+                              </w:rPr>
+                              <w:t>الترخيص</w:t>
+                            </w:r>
+                            <w:proofErr w:type="spellEnd"/>
+                          </w:p>
+                          <w:p/>
+                        </w:txbxContent>
+                      </wps:txbx>
+                      <wps:bodyPr rot="0" spcFirstLastPara="0" vertOverflow="overflow" horzOverflow="overflow" vert="horz" wrap="square" lIns="91440" tIns="45720" rIns="91440" bIns="45720" numCol="1" spcCol="0" rtlCol="0" fromWordArt="0" anchor="t" anchorCtr="0" forceAA="0" compatLnSpc="1">
+                        <a:prstTxWarp prst="textNoShape">
+                          <a:avLst/>
+                        </a:prstTxWarp>
+                        <a:noAutofit/>
+                      </wps:bodyPr>
+                    </wps:wsp>
+                  </a:graphicData>
+                </a:graphic>
+                <wp14:sizeRelH relativeFrom="margin">
+                  <wp14:pctWidth>0</wp14:pctWidth>
+                </wp14:sizeRelH>
+              </wp:anchor>
+            </w:drawing>
+          </mc:Choice>
+          <mc:Fallback>
+            <w:pict>
+              <v:shape id="Text Box 236" style="position:absolute;margin-left:491.9pt;margin-top:9.6pt;width:72.3pt;height:19.9pt;z-index:251684864;visibility:visible;mso-wrap-style:square;mso-width-percent:0;mso-wrap-distance-left:9pt;mso-wrap-distance-top:0;mso-wrap-distance-right:9pt;mso-wrap-distance-bottom:0;mso-position-horizontal:absolute;mso-position-horizontal-relative:text;mso-position-vertical:absolute;mso-position-vertical-relative:text;mso-width-percent:0;mso-width-relative:margin;v-text-anchor:top" o:spid="_x0000_s1047" fillcolor="white [3201]" stroked="f" strokeweight=".5pt" type="#_x0000_t202" o:gfxdata="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" w14:anchorId="0D885E68">
+                <v:textbox>
+                  <w:txbxContent>
+                    <w:p>
+                      <w:pPr>
+                        <w:rPr>
+                          <w:rFonts w:ascii="Microsoft Sans Serif" w:hAnsi="Microsoft Sans Serif" w:cs="Microsoft Sans Serif"/>
+                        </w:rPr>
+                      </w:pPr>
+                      <w:proofErr w:type="spellStart"/>
+                      <w:r>
+                        <w:rPr>
+                          <w:rFonts w:ascii="Microsoft Sans Serif" w:hAnsi="Microsoft Sans Serif" w:cs="Microsoft Sans Serif"/>
+                          <w:color w:val="002060"/>
+                        </w:rPr>
+                        <w:t>سلطة</w:t>
+                      </w:r>
+                      <w:proofErr w:type="spellEnd"/>
+                      <w:r>
+                        <w:rPr>
+                          <w:rFonts w:ascii="Microsoft Sans Serif" w:hAnsi="Microsoft Sans Serif" w:cs="Microsoft Sans Serif"/>
+                          <w:color w:val="002060"/>
+                        </w:rPr>
+                        <w:t xml:space="preserve"> </w:t>
+                      </w:r>
+                      <w:proofErr w:type="spellStart"/>
+                      <w:r>
+                        <w:rPr>
+                          <w:rFonts w:ascii="Microsoft Sans Serif" w:hAnsi="Microsoft Sans Serif" w:cs="Microsoft Sans Serif"/>
+                          <w:color w:val="002060"/>
+                        </w:rPr>
+                        <w:t>الترخيص</w:t>
+                      </w:r>
+                      <w:proofErr w:type="spellEnd"/>
+                    </w:p>
+                    <w:p/>
+                  </w:txbxContent>
+                </v:textbox>
+              </v:shape>
+            </w:pict>
+          </mc:Fallback>
+        </mc:AlternateContent>
+      </w:r>
+      <w:r>
+        <w:rPr>
           <w:rFonts w:ascii="Arial"/>
           <w:noProof/>
           <w:sz w:val="20"/>
@@ -6143,7 +6154,7 @@
         <mc:AlternateContent>
           <mc:Choice Requires="wps">
             <w:drawing>
-              <wp:anchor distT="0" distB="0" distL="114300" distR="114300" simplePos="0" relativeHeight="251691008" behindDoc="0" locked="0" layoutInCell="1" allowOverlap="1" wp14:editId="1AB03205" wp14:anchorId="60FE6687">
+              <wp:anchor distT="0" distB="0" distL="114300" distR="114300" simplePos="0" relativeHeight="251691008" behindDoc="0" locked="0" layoutInCell="1" allowOverlap="1" wp14:editId="5A335C93" wp14:anchorId="2F8D48EC">
                 <wp:simplePos x="0" y="0"/>
                 <wp:positionH relativeFrom="column">
                   <wp:posOffset>3381375</wp:posOffset>
@@ -6207,7 +6218,7 @@
           </mc:Choice>
           <mc:Fallback>
             <w:pict>
-              <v:shape id="Text Box 243" style="position:absolute;margin-left:266.25pt;margin-top:11.2pt;width:101.25pt;height:21.75pt;z-index:251691008;visibility:visible;mso-wrap-style:square;mso-width-percent:0;mso-height-percent:0;mso-wrap-distance-left:9pt;mso-wrap-distance-top:0;mso-wrap-distance-right:9pt;mso-wrap-distance-bottom:0;mso-position-horizontal:absolute;mso-position-horizontal-relative:text;mso-position-vertical:absolute;mso-position-vertical-relative:text;mso-width-percent:0;mso-height-percent:0;mso-width-relative:margin;mso-height-relative:margin;v-text-anchor:top" o:spid="_x0000_s1048" fillcolor="white [3201]" stroked="f" strokeweight=".5pt" type="#_x0000_t202" o:gfxdata="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" w14:anchorId="60FE6687">
+              <v:shape id="Text Box 243" style="position:absolute;margin-left:266.25pt;margin-top:11.2pt;width:101.25pt;height:21.75pt;z-index:251691008;visibility:visible;mso-wrap-style:square;mso-width-percent:0;mso-height-percent:0;mso-wrap-distance-left:9pt;mso-wrap-distance-top:0;mso-wrap-distance-right:9pt;mso-wrap-distance-bottom:0;mso-position-horizontal:absolute;mso-position-horizontal-relative:text;mso-position-vertical:absolute;mso-position-vertical-relative:text;mso-width-percent:0;mso-height-percent:0;mso-width-relative:margin;mso-height-relative:margin;v-text-anchor:top" o:spid="_x0000_s1048" fillcolor="white [3201]" stroked="f" strokeweight=".5pt" type="#_x0000_t202" o:gfxdata="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" w14:anchorId="2F8D48EC">
                 <v:textbox>
                   <w:txbxContent>
                     <w:p>
@@ -6242,7 +6253,7 @@
         <mc:AlternateContent>
           <mc:Choice Requires="wps">
             <w:drawing>
-              <wp:anchor distT="0" distB="0" distL="114300" distR="114300" simplePos="0" relativeHeight="251686912" behindDoc="0" locked="0" layoutInCell="1" allowOverlap="1" wp14:editId="480E583C" wp14:anchorId="747BAFA6">
+              <wp:anchor distT="0" distB="0" distL="114300" distR="114300" simplePos="0" relativeHeight="251686912" behindDoc="0" locked="0" layoutInCell="1" allowOverlap="1" wp14:editId="086692AB" wp14:anchorId="7F73613E">
                 <wp:simplePos x="0" y="0"/>
                 <wp:positionH relativeFrom="column">
                   <wp:posOffset>5816600</wp:posOffset>
@@ -6346,7 +6357,7 @@
           </mc:Choice>
           <mc:Fallback>
             <w:pict>
-              <v:shape id="Text Box 239" style="position:absolute;margin-left:458pt;margin-top:11.7pt;width:106.2pt;height:22pt;z-index:251686912;visibility:visible;mso-wrap-style:square;mso-width-percent:0;mso-height-percent:0;mso-wrap-distance-left:9pt;mso-wrap-distance-top:0;mso-wrap-distance-right:9pt;mso-wrap-distance-bottom:0;mso-position-horizontal:absolute;mso-position-horizontal-relative:text;mso-position-vertical:absolute;mso-position-vertical-relative:text;mso-width-percent:0;mso-height-percent:0;mso-width-relative:margin;mso-height-relative:margin;v-text-anchor:top" o:spid="_x0000_s1049" fillcolor="white [3201]" stroked="f" strokeweight=".5pt" type="#_x0000_t202" o:gfxdata="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" w14:anchorId="747BAFA6">
+              <v:shape id="Text Box 239" style="position:absolute;margin-left:458pt;margin-top:11.7pt;width:106.2pt;height:22pt;z-index:251686912;visibility:visible;mso-wrap-style:square;mso-width-percent:0;mso-height-percent:0;mso-wrap-distance-left:9pt;mso-wrap-distance-top:0;mso-wrap-distance-right:9pt;mso-wrap-distance-bottom:0;mso-position-horizontal:absolute;mso-position-horizontal-relative:text;mso-position-vertical:absolute;mso-position-vertical-relative:text;mso-width-percent:0;mso-height-percent:0;mso-width-relative:margin;mso-height-relative:margin;v-text-anchor:top" o:spid="_x0000_s1049" fillcolor="white [3201]" stroked="f" strokeweight=".5pt" type="#_x0000_t202" o:gfxdata="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" w14:anchorId="7F73613E">
                 <v:textbox>
                   <w:txbxContent>
                     <w:p>
@@ -6413,7 +6424,7 @@
         <mc:AlternateContent>
           <mc:Choice Requires="wps">
             <w:drawing>
-              <wp:anchor distT="0" distB="0" distL="114300" distR="114300" simplePos="0" relativeHeight="251683840" behindDoc="0" locked="0" layoutInCell="1" allowOverlap="1" wp14:editId="0056879E" wp14:anchorId="695BC30C">
+              <wp:anchor distT="0" distB="0" distL="114300" distR="114300" simplePos="0" relativeHeight="251683840" behindDoc="0" locked="0" layoutInCell="1" allowOverlap="1" wp14:editId="6A7AB3D1" wp14:anchorId="6215696F">
                 <wp:simplePos x="0" y="0"/>
                 <wp:positionH relativeFrom="column">
                   <wp:posOffset>1076325</wp:posOffset>
@@ -6475,7 +6486,7 @@
               </wp:anchor>
             </w:drawing>
           </mc:Choice>
-          <mc:Fallback xmlns:pic="http://schemas.openxmlformats.org/drawingml/2006/picture" xmlns:a14="http://schemas.microsoft.com/office/drawing/2010/main" xmlns:a="http://schemas.openxmlformats.org/drawingml/2006/main">
+          <mc:Fallback xmlns:a="http://schemas.openxmlformats.org/drawingml/2006/main" xmlns:a14="http://schemas.microsoft.com/office/drawing/2010/main" xmlns:pic="http://schemas.openxmlformats.org/drawingml/2006/picture">
             <w:pict>
               <v:line id="Straight Connector 235" style="position:absolute;z-index:251683840;visibility:visible;mso-wrap-style:square;mso-width-percent:0;mso-height-percent:0;mso-wrap-distance-left:9pt;mso-wrap-distance-top:0;mso-wrap-distance-right:9pt;mso-wrap-distance-bottom:0;mso-position-horizontal:absolute;mso-position-horizontal-relative:text;mso-position-vertical:absolute;mso-position-vertical-relative:text;mso-width-percent:0;mso-height-percent:0;mso-width-relative:margin;mso-height-relative:margin" o:spid="_x0000_s1026" strokecolor="silver" o:gfxdata="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" from="84.75pt,9.15pt" to="3in,9.15pt" w14:anchorId="26ED0323">
                 <v:stroke dashstyle="dash"/>
@@ -6493,7 +6504,7 @@
         <mc:AlternateContent>
           <mc:Choice Requires="wps">
             <w:drawing>
-              <wp:anchor distT="0" distB="0" distL="114300" distR="114300" simplePos="0" relativeHeight="251685888" behindDoc="0" locked="0" layoutInCell="1" allowOverlap="1" wp14:editId="3C73FFB9" wp14:anchorId="129D6D3A">
+              <wp:anchor distT="0" distB="0" distL="114300" distR="114300" simplePos="0" relativeHeight="251685888" behindDoc="0" locked="0" layoutInCell="1" allowOverlap="1" wp14:editId="4BEC17A0" wp14:anchorId="005159BB">
                 <wp:simplePos x="0" y="0"/>
                 <wp:positionH relativeFrom="column">
                   <wp:posOffset>4533900</wp:posOffset>
@@ -6555,7 +6566,7 @@
               </wp:anchor>
             </w:drawing>
           </mc:Choice>
-          <mc:Fallback xmlns:pic="http://schemas.openxmlformats.org/drawingml/2006/picture" xmlns:a14="http://schemas.microsoft.com/office/drawing/2010/main" xmlns:a="http://schemas.openxmlformats.org/drawingml/2006/main">
+          <mc:Fallback xmlns:a="http://schemas.openxmlformats.org/drawingml/2006/main" xmlns:a14="http://schemas.microsoft.com/office/drawing/2010/main" xmlns:pic="http://schemas.openxmlformats.org/drawingml/2006/picture">
             <w:pict>
               <v:line id="Straight Connector 237" style="position:absolute;flip:y;z-index:251685888;visibility:visible;mso-wrap-style:square;mso-width-percent:0;mso-height-percent:0;mso-wrap-distance-left:9pt;mso-wrap-distance-top:0;mso-wrap-distance-right:9pt;mso-wrap-distance-bottom:0;mso-position-horizontal:absolute;mso-position-horizontal-relative:text;mso-position-vertical:absolute;mso-position-vertical-relative:text;mso-width-percent:0;mso-height-percent:0;mso-width-relative:margin;mso-height-relative:margin" o:spid="_x0000_s1026" strokecolor="silver" o:gfxdata="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" from="357pt,8.45pt" to="496.8pt,8.85pt" w14:anchorId="60B20738">
                 <v:stroke dashstyle="dash"/>
@@ -6581,7 +6592,7 @@
         <mc:AlternateContent>
           <mc:Choice Requires="wps">
             <w:drawing>
-              <wp:anchor distT="0" distB="0" distL="114300" distR="114300" simplePos="0" relativeHeight="251688960" behindDoc="0" locked="0" layoutInCell="1" allowOverlap="1" wp14:editId="56AC29D8" wp14:anchorId="49262026">
+              <wp:anchor distT="0" distB="0" distL="114300" distR="114300" simplePos="0" relativeHeight="251688960" behindDoc="0" locked="0" layoutInCell="1" allowOverlap="1" wp14:editId="01FB5142" wp14:anchorId="3B5333E9">
                 <wp:simplePos x="0" y="0"/>
                 <wp:positionH relativeFrom="column">
                   <wp:posOffset>6146800</wp:posOffset>
@@ -6685,7 +6696,7 @@
           </mc:Choice>
           <mc:Fallback>
             <w:pict>
-              <v:shape id="Text Box 241" style="position:absolute;margin-left:484pt;margin-top:15.8pt;width:78.5pt;height:20.6pt;z-index:251688960;visibility:visible;mso-wrap-style:square;mso-width-percent:0;mso-height-percent:0;mso-wrap-distance-left:9pt;mso-wrap-distance-top:0;mso-wrap-distance-right:9pt;mso-wrap-distance-bottom:0;mso-position-horizontal:absolute;mso-position-horizontal-relative:text;mso-position-vertical:absolute;mso-position-vertical-relative:text;mso-width-percent:0;mso-height-percent:0;mso-width-relative:margin;mso-height-relative:margin;v-text-anchor:top" o:spid="_x0000_s1050" fillcolor="white [3201]" stroked="f" strokeweight=".5pt" type="#_x0000_t202" o:gfxdata="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" w14:anchorId="49262026">
+              <v:shape id="Text Box 241" style="position:absolute;margin-left:484pt;margin-top:15.8pt;width:78.5pt;height:20.6pt;z-index:251688960;visibility:visible;mso-wrap-style:square;mso-width-percent:0;mso-height-percent:0;mso-wrap-distance-left:9pt;mso-wrap-distance-top:0;mso-wrap-distance-right:9pt;mso-wrap-distance-bottom:0;mso-position-horizontal:absolute;mso-position-horizontal-relative:text;mso-position-vertical:absolute;mso-position-vertical-relative:text;mso-width-percent:0;mso-height-percent:0;mso-width-relative:margin;mso-height-relative:margin;v-text-anchor:top" o:spid="_x0000_s1050" fillcolor="white [3201]" stroked="f" strokeweight=".5pt" type="#_x0000_t202" o:gfxdata="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" w14:anchorId="3B5333E9">
                 <v:textbox>
                   <w:txbxContent>
                     <w:p>
@@ -6752,7 +6763,7 @@
         <mc:AlternateContent>
           <mc:Choice Requires="wps">
             <w:drawing>
-              <wp:anchor distT="0" distB="0" distL="114300" distR="114300" simplePos="0" relativeHeight="251687936" behindDoc="0" locked="0" layoutInCell="1" allowOverlap="1" wp14:editId="71BCB50C" wp14:anchorId="25CE2DB8">
+              <wp:anchor distT="0" distB="0" distL="114300" distR="114300" simplePos="0" relativeHeight="251687936" behindDoc="0" locked="0" layoutInCell="1" allowOverlap="1" wp14:editId="538F36D1" wp14:anchorId="2168FBC3">
                 <wp:simplePos x="0" y="0"/>
                 <wp:positionH relativeFrom="column">
                   <wp:posOffset>1257300</wp:posOffset>
@@ -6814,7 +6825,7 @@
               </wp:anchor>
             </w:drawing>
           </mc:Choice>
-          <mc:Fallback xmlns:pic="http://schemas.openxmlformats.org/drawingml/2006/picture" xmlns:a14="http://schemas.microsoft.com/office/drawing/2010/main" xmlns:a="http://schemas.openxmlformats.org/drawingml/2006/main">
+          <mc:Fallback xmlns:a="http://schemas.openxmlformats.org/drawingml/2006/main" xmlns:a14="http://schemas.microsoft.com/office/drawing/2010/main" xmlns:pic="http://schemas.openxmlformats.org/drawingml/2006/picture">
             <w:pict>
               <v:line id="Straight Connector 240" style="position:absolute;z-index:251687936;visibility:visible;mso-wrap-style:square;mso-width-percent:0;mso-height-percent:0;mso-wrap-distance-left:9pt;mso-wrap-distance-top:0;mso-wrap-distance-right:9pt;mso-wrap-distance-bottom:0;mso-position-horizontal:absolute;mso-position-horizontal-relative:text;mso-position-vertical:absolute;mso-position-vertical-relative:text;mso-width-percent:0;mso-height-percent:0;mso-width-relative:margin;mso-height-relative:margin" o:spid="_x0000_s1026" strokecolor="silver" o:gfxdata="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" from="99pt,11.7pt" to="459.7pt,12.1pt" w14:anchorId="65B5EF80">
                 <v:stroke dashstyle="dash"/>
@@ -6840,7 +6851,7 @@
         <mc:AlternateContent>
           <mc:Choice Requires="wps">
             <w:drawing>
-              <wp:anchor distT="0" distB="0" distL="114300" distR="114300" simplePos="0" relativeHeight="251689984" behindDoc="0" locked="0" layoutInCell="1" allowOverlap="1" wp14:editId="487F228C" wp14:anchorId="6F7A78F4">
+              <wp:anchor distT="0" distB="0" distL="114300" distR="114300" simplePos="0" relativeHeight="251689984" behindDoc="0" locked="0" layoutInCell="1" allowOverlap="1" wp14:editId="292F12A5" wp14:anchorId="3836CBA4">
                 <wp:simplePos x="0" y="0"/>
                 <wp:positionH relativeFrom="column">
                   <wp:posOffset>1338263</wp:posOffset>
@@ -6902,7 +6913,7 @@
               </wp:anchor>
             </w:drawing>
           </mc:Choice>
-          <mc:Fallback xmlns:pic="http://schemas.openxmlformats.org/drawingml/2006/picture" xmlns:a14="http://schemas.microsoft.com/office/drawing/2010/main" xmlns:a="http://schemas.openxmlformats.org/drawingml/2006/main">
+          <mc:Fallback xmlns:a="http://schemas.openxmlformats.org/drawingml/2006/main" xmlns:a14="http://schemas.microsoft.com/office/drawing/2010/main" xmlns:pic="http://schemas.openxmlformats.org/drawingml/2006/picture">
             <w:pict>
               <v:line id="Straight Connector 242" style="position:absolute;z-index:251689984;visibility:visible;mso-wrap-style:square;mso-width-percent:0;mso-height-percent:0;mso-wrap-distance-left:9pt;mso-wrap-distance-top:0;mso-wrap-distance-right:9pt;mso-wrap-distance-bottom:0;mso-position-horizontal:absolute;mso-position-horizontal-relative:text;mso-position-vertical:absolute;mso-position-vertical-relative:text;mso-width-percent:0;mso-height-percent:0;mso-width-relative:margin;mso-height-relative:margin" o:spid="_x0000_s1026" strokecolor="silver" o:gfxdata="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" from="105.4pt,13.05pt" to="495pt,13.05pt" w14:anchorId="5E23C785">
                 <v:stroke dashstyle="dash"/>
@@ -6936,7 +6947,7 @@
         <mc:AlternateContent>
           <mc:Choice Requires="wps">
             <w:drawing>
-              <wp:anchor distT="45720" distB="45720" distL="114300" distR="114300" simplePos="0" relativeHeight="251694080" behindDoc="0" locked="0" layoutInCell="1" allowOverlap="1" wp14:editId="44FBF9B7" wp14:anchorId="2D8F4AF8">
+              <wp:anchor distT="45720" distB="45720" distL="114300" distR="114300" simplePos="0" relativeHeight="251694080" behindDoc="0" locked="0" layoutInCell="1" allowOverlap="1" wp14:editId="0BE02180" wp14:anchorId="0DEB0309">
                 <wp:simplePos x="0" y="0"/>
                 <wp:positionH relativeFrom="column">
                   <wp:posOffset>387350</wp:posOffset>
@@ -7028,7 +7039,7 @@
           </mc:Choice>
           <mc:Fallback>
             <w:pict>
-              <v:shape id="_x0000_s1051" style="position:absolute;margin-left:30.5pt;margin-top:13pt;width:128.25pt;height:22.35pt;z-index:251694080;visibility:visible;mso-wrap-style:square;mso-width-percent:0;mso-height-percent:0;mso-wrap-distance-left:9pt;mso-wrap-distance-top:3.6pt;mso-wrap-distance-right:9pt;mso-wrap-distance-bottom:3.6pt;mso-position-horizontal:absolute;mso-position-horizontal-relative:text;mso-position-vertical:absolute;mso-position-vertical-relative:text;mso-width-percent:0;mso-height-percent:0;mso-width-relative:margin;mso-height-relative:margin;v-text-anchor:top" fillcolor="#002060" stroked="f" type="#_x0000_t202" o:gfxdata="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" w14:anchorId="2D8F4AF8">
+              <v:shape id="_x0000_s1051" style="position:absolute;margin-left:30.5pt;margin-top:13pt;width:128.25pt;height:22.35pt;z-index:251694080;visibility:visible;mso-wrap-style:square;mso-width-percent:0;mso-height-percent:0;mso-wrap-distance-left:9pt;mso-wrap-distance-top:3.6pt;mso-wrap-distance-right:9pt;mso-wrap-distance-bottom:3.6pt;mso-position-horizontal:absolute;mso-position-horizontal-relative:text;mso-position-vertical:absolute;mso-position-vertical-relative:text;mso-width-percent:0;mso-height-percent:0;mso-width-relative:margin;mso-height-relative:margin;v-text-anchor:top" fillcolor="#002060" stroked="f" type="#_x0000_t202" o:gfxdata="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" w14:anchorId="0DEB0309">
                 <v:textbox>
                   <w:txbxContent>
                     <w:p>
@@ -7066,117 +7077,6 @@
                   </w:txbxContent>
                 </v:textbox>
                 <w10:wrap type="square"/>
-              </v:shape>
-            </w:pict>
-          </mc:Fallback>
-        </mc:AlternateContent>
-      </w:r>
-      <w:r>
-        <w:rPr>
-          <w:rFonts w:ascii="Arial"/>
-          <w:noProof/>
-          <w:sz w:val="20"/>
-        </w:rPr>
-        <mc:AlternateContent>
-          <mc:Choice Requires="wps">
-            <w:drawing>
-              <wp:anchor distT="0" distB="0" distL="114300" distR="114300" simplePos="0" relativeHeight="251709440" behindDoc="0" locked="0" layoutInCell="1" allowOverlap="1" wp14:editId="24E33786" wp14:anchorId="505D4314">
-                <wp:simplePos x="0" y="0"/>
-                <wp:positionH relativeFrom="column">
-                  <wp:posOffset>4467225</wp:posOffset>
-                </wp:positionH>
-                <wp:positionV relativeFrom="paragraph">
-                  <wp:posOffset>944562</wp:posOffset>
-                </wp:positionV>
-                <wp:extent cx="1847850" cy="261937"/>
-                <wp:effectExtent l="0" t="0" r="0" b="5080"/>
-                <wp:wrapNone/>
-                <wp:docPr id="283" name="Text Box 283"/>
-                <wp:cNvGraphicFramePr/>
-                <a:graphic xmlns:a="http://schemas.openxmlformats.org/drawingml/2006/main">
-                  <a:graphicData uri="http://schemas.microsoft.com/office/word/2010/wordprocessingShape">
-                    <wps:wsp>
-                      <wps:cNvSpPr txBox="1"/>
-                      <wps:spPr>
-                        <a:xfrm>
-                          <a:off x="0" y="0"/>
-                          <a:ext cx="1847850" cy="261937"/>
-                        </a:xfrm>
-                        <a:prstGeom prst="rect">
-                          <a:avLst/>
-                        </a:prstGeom>
-                        <a:solidFill>
-                          <a:schemeClr val="lt1"/>
-                        </a:solidFill>
-                        <a:ln w="6350">
-                          <a:noFill/>
-                        </a:ln>
-                      </wps:spPr>
-                      <wps:txbx>
-                        <w:txbxContent>
-                          <w:sdt>
-                            <w:sdtPr>
-                              <w:alias w:val="#Nav: /TenancyContract/Tenant_Licensing_Authority"/>
-                              <w:tag w:val="#Nav: Tenancy_Contract/50101"/>
-                              <w:id w:val="-137874661"/>
-                              <w:dataBinding w:prefixMappings="xmlns:ns0='urn:microsoft-dynamics-nav/reports/Tenancy_Contract/50101/'" w:xpath="/ns0:NavWordReportXmlPart[1]/ns0:TenancyContract[1]/ns0:Tenant_Licensing_Authority[1]" w:storeItemID="{B8787D49-5AAC-4AAC-A9D8-A7D9793FE4D0}"/>
-                              <w:text/>
-                            </w:sdtPr>
-                            <w:sdtContent>
-                              <w:p>
-                                <w:proofErr w:type="spellStart"/>
-                                <w:r>
-                                  <w:t>Tenant_Licensing_Authority</w:t>
-                                </w:r>
-                                <w:proofErr w:type="spellEnd"/>
-                              </w:p>
-                            </w:sdtContent>
-                          </w:sdt>
-                        </w:txbxContent>
-                      </wps:txbx>
-                      <wps:bodyPr rot="0" spcFirstLastPara="0" vertOverflow="overflow" horzOverflow="overflow" vert="horz" wrap="square" lIns="91440" tIns="45720" rIns="91440" bIns="45720" numCol="1" spcCol="0" rtlCol="0" fromWordArt="0" anchor="t" anchorCtr="0" forceAA="0" compatLnSpc="1">
-                        <a:prstTxWarp prst="textNoShape">
-                          <a:avLst/>
-                        </a:prstTxWarp>
-                        <a:noAutofit/>
-                      </wps:bodyPr>
-                    </wps:wsp>
-                  </a:graphicData>
-                </a:graphic>
-                <wp14:sizeRelH relativeFrom="margin">
-                  <wp14:pctWidth>0</wp14:pctWidth>
-                </wp14:sizeRelH>
-                <wp14:sizeRelV relativeFrom="margin">
-                  <wp14:pctHeight>0</wp14:pctHeight>
-                </wp14:sizeRelV>
-              </wp:anchor>
-            </w:drawing>
-          </mc:Choice>
-          <mc:Fallback>
-            <w:pict>
-              <v:shape id="Text Box 283" style="position:absolute;margin-left:351.75pt;margin-top:74.35pt;width:145.5pt;height:20.6pt;z-index:251709440;visibility:visible;mso-wrap-style:square;mso-width-percent:0;mso-height-percent:0;mso-wrap-distance-left:9pt;mso-wrap-distance-top:0;mso-wrap-distance-right:9pt;mso-wrap-distance-bottom:0;mso-position-horizontal:absolute;mso-position-horizontal-relative:text;mso-position-vertical:absolute;mso-position-vertical-relative:text;mso-width-percent:0;mso-height-percent:0;mso-width-relative:margin;mso-height-relative:margin;v-text-anchor:top" o:spid="_x0000_s1052" fillcolor="white [3201]" stroked="f" strokeweight=".5pt" type="#_x0000_t202" o:gfxdata="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" w14:anchorId="505D4314">
-                <v:textbox>
-                  <w:txbxContent>
-                    <w:sdt>
-                      <w:sdtPr>
-                        <w:alias w:val="#Nav: /TenancyContract/Tenant_Licensing_Authority"/>
-                        <w:tag w:val="#Nav: Tenancy_Contract/50101"/>
-                        <w:id w:val="-137874661"/>
-                        <w:dataBinding w:prefixMappings="xmlns:ns0='urn:microsoft-dynamics-nav/reports/Tenancy_Contract/50101/'" w:xpath="/ns0:NavWordReportXmlPart[1]/ns0:TenancyContract[1]/ns0:Tenant_Licensing_Authority[1]" w:storeItemID="{B8787D49-5AAC-4AAC-A9D8-A7D9793FE4D0}"/>
-                        <w:text/>
-                      </w:sdtPr>
-                      <w:sdtContent>
-                        <w:p>
-                          <w:proofErr w:type="spellStart"/>
-                          <w:r>
-                            <w:t>Tenant_Licensing_Authority</w:t>
-                          </w:r>
-                          <w:proofErr w:type="spellEnd"/>
-                        </w:p>
-                      </w:sdtContent>
-                    </w:sdt>
-                  </w:txbxContent>
-                </v:textbox>
               </v:shape>
             </w:pict>
           </mc:Fallback>
@@ -7192,7 +7092,7 @@
         <mc:AlternateContent>
           <mc:Choice Requires="wps">
             <w:drawing>
-              <wp:anchor distT="45720" distB="45720" distL="114300" distR="114300" simplePos="0" relativeHeight="251695104" behindDoc="0" locked="0" layoutInCell="1" allowOverlap="1" wp14:editId="17193440" wp14:anchorId="3BD5E0AE">
+              <wp:anchor distT="45720" distB="45720" distL="114300" distR="114300" simplePos="0" relativeHeight="251695104" behindDoc="0" locked="0" layoutInCell="1" allowOverlap="1" wp14:editId="1D75381F" wp14:anchorId="3071EBF1">
                 <wp:simplePos x="0" y="0"/>
                 <wp:positionH relativeFrom="margin">
                   <wp:posOffset>385445</wp:posOffset>
@@ -7442,12 +7342,21 @@
                               </w:rPr>
                               <w:t xml:space="preserve">                                  </w:t>
                             </w:r>
+                            <w:proofErr w:type="spellStart"/>
                             <w:r>
                               <w:rPr>
                                 <w:color w:val="002060"/>
                                 <w:sz w:val="12"/>
                               </w:rPr>
-                              <w:t>Incase of a Company</w:t>
+                              <w:t>Incase</w:t>
+                            </w:r>
+                            <w:proofErr w:type="spellEnd"/>
+                            <w:r>
+                              <w:rPr>
+                                <w:color w:val="002060"/>
+                                <w:sz w:val="12"/>
+                              </w:rPr>
+                              <w:t xml:space="preserve"> of a Company</w:t>
                             </w:r>
                             <w:r>
                               <w:rPr>
@@ -7822,7 +7731,7 @@
           </mc:Choice>
           <mc:Fallback>
             <w:pict>
-              <v:shape id="_x0000_s1053" style="position:absolute;margin-left:30.35pt;margin-top:34.6pt;width:535.2pt;height:112.85pt;z-index:251695104;visibility:visible;mso-wrap-style:square;mso-width-percent:0;mso-height-percent:0;mso-wrap-distance-left:9pt;mso-wrap-distance-top:3.6pt;mso-wrap-distance-right:9pt;mso-wrap-distance-bottom:3.6pt;mso-position-horizontal:absolute;mso-position-horizontal-relative:margin;mso-position-vertical:absolute;mso-position-vertical-relative:text;mso-width-percent:0;mso-height-percent:0;mso-width-relative:margin;mso-height-relative:margin;v-text-anchor:top" strokecolor="#cfcdcd [2894]" type="#_x0000_t202" o:gfxdata="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" w14:anchorId="3BD5E0AE">
+              <v:shape id="_x0000_s1052" style="position:absolute;margin-left:30.35pt;margin-top:34.6pt;width:535.2pt;height:112.85pt;z-index:251695104;visibility:visible;mso-wrap-style:square;mso-width-percent:0;mso-height-percent:0;mso-wrap-distance-left:9pt;mso-wrap-distance-top:3.6pt;mso-wrap-distance-right:9pt;mso-wrap-distance-bottom:3.6pt;mso-position-horizontal:absolute;mso-position-horizontal-relative:margin;mso-position-vertical:absolute;mso-position-vertical-relative:text;mso-width-percent:0;mso-height-percent:0;mso-width-relative:margin;mso-height-relative:margin;v-text-anchor:top" strokecolor="#cfcdcd [2894]" type="#_x0000_t202" o:gfxdata="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" w14:anchorId="3071EBF1">
                 <v:textbox>
                   <w:txbxContent>
                     <w:p>
@@ -8030,12 +7939,21 @@
                         </w:rPr>
                         <w:t xml:space="preserve">                                  </w:t>
                       </w:r>
+                      <w:proofErr w:type="spellStart"/>
                       <w:r>
                         <w:rPr>
                           <w:color w:val="002060"/>
                           <w:sz w:val="12"/>
                         </w:rPr>
-                        <w:t>Incase of a Company</w:t>
+                        <w:t>Incase</w:t>
+                      </w:r>
+                      <w:proofErr w:type="spellEnd"/>
+                      <w:r>
+                        <w:rPr>
+                          <w:color w:val="002060"/>
+                          <w:sz w:val="12"/>
+                        </w:rPr>
+                        <w:t xml:space="preserve"> of a Company</w:t>
                       </w:r>
                       <w:r>
                         <w:rPr>
@@ -8409,7 +8327,7 @@
         <mc:AlternateContent>
           <mc:Choice Requires="wps">
             <w:drawing>
-              <wp:anchor distT="0" distB="0" distL="114300" distR="114300" simplePos="0" relativeHeight="251708416" behindDoc="0" locked="0" layoutInCell="1" allowOverlap="1" wp14:editId="4F3CBB45" wp14:anchorId="3CF64834">
+              <wp:anchor distT="0" distB="0" distL="114300" distR="114300" simplePos="0" relativeHeight="251708416" behindDoc="0" locked="0" layoutInCell="1" allowOverlap="1" wp14:editId="793A198F" wp14:anchorId="34F6C040">
                 <wp:simplePos x="0" y="0"/>
                 <wp:positionH relativeFrom="column">
                   <wp:posOffset>1323976</wp:posOffset>
@@ -8471,7 +8389,7 @@
               </wp:anchor>
             </w:drawing>
           </mc:Choice>
-          <mc:Fallback xmlns:pic="http://schemas.openxmlformats.org/drawingml/2006/picture" xmlns:a14="http://schemas.microsoft.com/office/drawing/2010/main" xmlns:a="http://schemas.openxmlformats.org/drawingml/2006/main">
+          <mc:Fallback xmlns:a="http://schemas.openxmlformats.org/drawingml/2006/main" xmlns:a14="http://schemas.microsoft.com/office/drawing/2010/main" xmlns:pic="http://schemas.openxmlformats.org/drawingml/2006/picture">
             <w:pict>
               <v:line id="Straight Connector 282" style="position:absolute;flip:y;z-index:251708416;visibility:visible;mso-wrap-style:square;mso-width-percent:0;mso-height-percent:0;mso-wrap-distance-left:9pt;mso-wrap-distance-top:0;mso-wrap-distance-right:9pt;mso-wrap-distance-bottom:0;mso-position-horizontal:absolute;mso-position-horizontal-relative:text;mso-position-vertical:absolute;mso-position-vertical-relative:text;mso-width-percent:0;mso-height-percent:0;mso-width-relative:margin;mso-height-relative:margin" o:spid="_x0000_s1026" strokecolor="silver" o:gfxdata="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" from="104.25pt,139.25pt" to="504.4pt,141.15pt" w14:anchorId="486B6538">
                 <v:stroke dashstyle="dash"/>
@@ -8490,7 +8408,7 @@
         <mc:AlternateContent>
           <mc:Choice Requires="wps">
             <w:drawing>
-              <wp:anchor distT="0" distB="0" distL="114300" distR="114300" simplePos="0" relativeHeight="251707392" behindDoc="0" locked="0" layoutInCell="1" allowOverlap="1" wp14:editId="7825FA2C" wp14:anchorId="67E931BC">
+              <wp:anchor distT="0" distB="0" distL="114300" distR="114300" simplePos="0" relativeHeight="251707392" behindDoc="0" locked="0" layoutInCell="1" allowOverlap="1" wp14:editId="4B8E3144" wp14:anchorId="44F379A3">
                 <wp:simplePos x="0" y="0"/>
                 <wp:positionH relativeFrom="column">
                   <wp:posOffset>6291263</wp:posOffset>
@@ -8525,6 +8443,8 @@
                       <wps:txbx>
                         <w:txbxContent>
                           <w:p>
+                            <w:proofErr w:type="spellStart"/>
+                            <w:proofErr w:type="gramStart"/>
                             <w:r>
                               <w:rPr>
                                 <w:rFonts w:ascii="Microsoft Sans Serif" w:hAnsi="Microsoft Sans Serif" w:cs="Microsoft Sans Serif"/>
@@ -8536,6 +8456,7 @@
                               </w:rPr>
                               <w:t>رﻗﻢ</w:t>
                             </w:r>
+                            <w:proofErr w:type="spellEnd"/>
                             <w:r>
                               <w:rPr>
                                 <w:rFonts w:ascii="Microsoft Sans Serif" w:hAnsi="Microsoft Sans Serif" w:cs="Microsoft Sans Serif"/>
@@ -8557,8 +8478,22 @@
                                 <w:szCs w:val="13"/>
                                 <w:rtl/>
                               </w:rPr>
-                              <w:t xml:space="preserve"> ﻫﺎﺗﻒ</w:t>
+                              <w:t xml:space="preserve"> </w:t>
                             </w:r>
+                            <w:proofErr w:type="spellStart"/>
+                            <w:r>
+                              <w:rPr>
+                                <w:rFonts w:ascii="Microsoft Sans Serif" w:hAnsi="Microsoft Sans Serif" w:cs="Microsoft Sans Serif"/>
+                                <w:color w:val="002060"/>
+                                <w:w w:val="125"/>
+                                <w:sz w:val="13"/>
+                                <w:szCs w:val="13"/>
+                                <w:rtl/>
+                              </w:rPr>
+                              <w:t>ﻫﺎﺗﻒ</w:t>
+                            </w:r>
+                            <w:proofErr w:type="spellEnd"/>
+                            <w:proofErr w:type="gramEnd"/>
                             <w:r>
                               <w:rPr>
                                 <w:rFonts w:ascii="Microsoft Sans Serif" w:hAnsi="Microsoft Sans Serif" w:cs="Microsoft Sans Serif"/>
@@ -8580,8 +8515,21 @@
                                 <w:szCs w:val="13"/>
                                 <w:rtl/>
                               </w:rPr>
-                              <w:t xml:space="preserve"> اﻟﻤﺆﺟﺮ</w:t>
+                              <w:t xml:space="preserve"> </w:t>
                             </w:r>
+                            <w:proofErr w:type="spellStart"/>
+                            <w:r>
+                              <w:rPr>
+                                <w:rFonts w:ascii="Microsoft Sans Serif" w:hAnsi="Microsoft Sans Serif" w:cs="Microsoft Sans Serif"/>
+                                <w:color w:val="002060"/>
+                                <w:w w:val="125"/>
+                                <w:sz w:val="13"/>
+                                <w:szCs w:val="13"/>
+                                <w:rtl/>
+                              </w:rPr>
+                              <w:t>اﻟﻤﺆﺟﺮ</w:t>
+                            </w:r>
+                            <w:proofErr w:type="spellEnd"/>
                           </w:p>
                         </w:txbxContent>
                       </wps:txbx>
@@ -8605,10 +8553,12 @@
           </mc:Choice>
           <mc:Fallback>
             <w:pict>
-              <v:shape id="Text Box 281" style="position:absolute;margin-left:495.4pt;margin-top:123.5pt;width:69.65pt;height:16.5pt;z-index:251707392;visibility:visible;mso-wrap-style:square;mso-width-percent:0;mso-height-percent:0;mso-wrap-distance-left:9pt;mso-wrap-distance-top:0;mso-wrap-distance-right:9pt;mso-wrap-distance-bottom:0;mso-position-horizontal:absolute;mso-position-horizontal-relative:text;mso-position-vertical:absolute;mso-position-vertical-relative:text;mso-width-percent:0;mso-height-percent:0;mso-width-relative:margin;mso-height-relative:margin;v-text-anchor:top" o:spid="_x0000_s1054" fillcolor="white [3201]" stroked="f" strokeweight=".5pt" type="#_x0000_t202" o:gfxdata="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" w14:anchorId="67E931BC">
+              <v:shape id="Text Box 281" style="position:absolute;margin-left:495.4pt;margin-top:123.5pt;width:69.65pt;height:16.5pt;z-index:251707392;visibility:visible;mso-wrap-style:square;mso-width-percent:0;mso-height-percent:0;mso-wrap-distance-left:9pt;mso-wrap-distance-top:0;mso-wrap-distance-right:9pt;mso-wrap-distance-bottom:0;mso-position-horizontal:absolute;mso-position-horizontal-relative:text;mso-position-vertical:absolute;mso-position-vertical-relative:text;mso-width-percent:0;mso-height-percent:0;mso-width-relative:margin;mso-height-relative:margin;v-text-anchor:top" o:spid="_x0000_s1053" fillcolor="white [3201]" stroked="f" strokeweight=".5pt" type="#_x0000_t202" o:gfxdata="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" w14:anchorId="44F379A3">
                 <v:textbox>
                   <w:txbxContent>
                     <w:p>
+                      <w:proofErr w:type="spellStart"/>
+                      <w:proofErr w:type="gramStart"/>
                       <w:r>
                         <w:rPr>
                           <w:rFonts w:ascii="Microsoft Sans Serif" w:hAnsi="Microsoft Sans Serif" w:cs="Microsoft Sans Serif"/>
@@ -8620,6 +8570,7 @@
                         </w:rPr>
                         <w:t>رﻗﻢ</w:t>
                       </w:r>
+                      <w:proofErr w:type="spellEnd"/>
                       <w:r>
                         <w:rPr>
                           <w:rFonts w:ascii="Microsoft Sans Serif" w:hAnsi="Microsoft Sans Serif" w:cs="Microsoft Sans Serif"/>
@@ -8641,8 +8592,22 @@
                           <w:szCs w:val="13"/>
                           <w:rtl/>
                         </w:rPr>
-                        <w:t xml:space="preserve"> ﻫﺎﺗﻒ</w:t>
+                        <w:t xml:space="preserve"> </w:t>
                       </w:r>
+                      <w:proofErr w:type="spellStart"/>
+                      <w:r>
+                        <w:rPr>
+                          <w:rFonts w:ascii="Microsoft Sans Serif" w:hAnsi="Microsoft Sans Serif" w:cs="Microsoft Sans Serif"/>
+                          <w:color w:val="002060"/>
+                          <w:w w:val="125"/>
+                          <w:sz w:val="13"/>
+                          <w:szCs w:val="13"/>
+                          <w:rtl/>
+                        </w:rPr>
+                        <w:t>ﻫﺎﺗﻒ</w:t>
+                      </w:r>
+                      <w:proofErr w:type="spellEnd"/>
+                      <w:proofErr w:type="gramEnd"/>
                       <w:r>
                         <w:rPr>
                           <w:rFonts w:ascii="Microsoft Sans Serif" w:hAnsi="Microsoft Sans Serif" w:cs="Microsoft Sans Serif"/>
@@ -8664,8 +8629,21 @@
                           <w:szCs w:val="13"/>
                           <w:rtl/>
                         </w:rPr>
-                        <w:t xml:space="preserve"> اﻟﻤﺆﺟﺮ</w:t>
+                        <w:t xml:space="preserve"> </w:t>
                       </w:r>
+                      <w:proofErr w:type="spellStart"/>
+                      <w:r>
+                        <w:rPr>
+                          <w:rFonts w:ascii="Microsoft Sans Serif" w:hAnsi="Microsoft Sans Serif" w:cs="Microsoft Sans Serif"/>
+                          <w:color w:val="002060"/>
+                          <w:w w:val="125"/>
+                          <w:sz w:val="13"/>
+                          <w:szCs w:val="13"/>
+                          <w:rtl/>
+                        </w:rPr>
+                        <w:t>اﻟﻤﺆﺟﺮ</w:t>
+                      </w:r>
+                      <w:proofErr w:type="spellEnd"/>
                     </w:p>
                   </w:txbxContent>
                 </v:textbox>
@@ -8684,7 +8662,7 @@
         <mc:AlternateContent>
           <mc:Choice Requires="wps">
             <w:drawing>
-              <wp:anchor distT="0" distB="0" distL="114300" distR="114300" simplePos="0" relativeHeight="251705344" behindDoc="0" locked="0" layoutInCell="1" allowOverlap="1" wp14:editId="3BD2AB77" wp14:anchorId="63FB5402">
+              <wp:anchor distT="0" distB="0" distL="114300" distR="114300" simplePos="0" relativeHeight="251705344" behindDoc="0" locked="0" layoutInCell="1" allowOverlap="1" wp14:editId="37AE799D" wp14:anchorId="2904C962">
                 <wp:simplePos x="0" y="0"/>
                 <wp:positionH relativeFrom="column">
                   <wp:posOffset>1266825</wp:posOffset>
@@ -8746,7 +8724,7 @@
               </wp:anchor>
             </w:drawing>
           </mc:Choice>
-          <mc:Fallback xmlns:pic="http://schemas.openxmlformats.org/drawingml/2006/picture" xmlns:a14="http://schemas.microsoft.com/office/drawing/2010/main" xmlns:a="http://schemas.openxmlformats.org/drawingml/2006/main">
+          <mc:Fallback xmlns:a="http://schemas.openxmlformats.org/drawingml/2006/main" xmlns:a14="http://schemas.microsoft.com/office/drawing/2010/main" xmlns:pic="http://schemas.openxmlformats.org/drawingml/2006/picture">
             <w:pict>
               <v:line id="Straight Connector 279" style="position:absolute;flip:y;z-index:251705344;visibility:visible;mso-wrap-style:square;mso-width-percent:0;mso-height-percent:0;mso-wrap-distance-left:9pt;mso-wrap-distance-top:0;mso-wrap-distance-right:9pt;mso-wrap-distance-bottom:0;mso-position-horizontal:absolute;mso-position-horizontal-relative:text;mso-position-vertical:absolute;mso-position-vertical-relative:text;mso-width-percent:0;mso-height-percent:0;mso-width-relative:margin;mso-height-relative:margin" o:spid="_x0000_s1026" strokecolor="silver" o:gfxdata="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" from="99.75pt,117.85pt" to="485.65pt,118.6pt" w14:anchorId="5BB12C44">
                 <v:stroke dashstyle="dash"/>
@@ -8765,7 +8743,7 @@
         <mc:AlternateContent>
           <mc:Choice Requires="wps">
             <w:drawing>
-              <wp:anchor distT="0" distB="0" distL="114300" distR="114300" simplePos="0" relativeHeight="251700224" behindDoc="0" locked="0" layoutInCell="1" allowOverlap="1" wp14:editId="18A57C6A" wp14:anchorId="1C08CCCC">
+              <wp:anchor distT="0" distB="0" distL="114300" distR="114300" simplePos="0" relativeHeight="251700224" behindDoc="0" locked="0" layoutInCell="1" allowOverlap="1" wp14:editId="27E3D2FE" wp14:anchorId="3B7C3AAD">
                 <wp:simplePos x="0" y="0"/>
                 <wp:positionH relativeFrom="column">
                   <wp:posOffset>2544763</wp:posOffset>
@@ -8854,7 +8832,7 @@
           </mc:Choice>
           <mc:Fallback>
             <w:pict>
-              <v:shape id="Text Box 274" style="position:absolute;margin-left:200.4pt;margin-top:80.75pt;width:62.55pt;height:21.75pt;z-index:251700224;visibility:visible;mso-wrap-style:square;mso-width-percent:0;mso-height-percent:0;mso-wrap-distance-left:9pt;mso-wrap-distance-top:0;mso-wrap-distance-right:9pt;mso-wrap-distance-bottom:0;mso-position-horizontal:absolute;mso-position-horizontal-relative:text;mso-position-vertical:absolute;mso-position-vertical-relative:text;mso-width-percent:0;mso-height-percent:0;mso-width-relative:margin;mso-height-relative:margin;v-text-anchor:top" o:spid="_x0000_s1055" fillcolor="white [3201]" stroked="f" strokeweight=".5pt" type="#_x0000_t202" o:gfxdata="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" w14:anchorId="1C08CCCC">
+              <v:shape id="Text Box 274" style="position:absolute;margin-left:200.4pt;margin-top:80.75pt;width:62.55pt;height:21.75pt;z-index:251700224;visibility:visible;mso-wrap-style:square;mso-width-percent:0;mso-height-percent:0;mso-wrap-distance-left:9pt;mso-wrap-distance-top:0;mso-wrap-distance-right:9pt;mso-wrap-distance-bottom:0;mso-position-horizontal:absolute;mso-position-horizontal-relative:text;mso-position-vertical:absolute;mso-position-vertical-relative:text;mso-width-percent:0;mso-height-percent:0;mso-width-relative:margin;mso-height-relative:margin;v-text-anchor:top" o:spid="_x0000_s1054" fillcolor="white [3201]" stroked="f" strokeweight=".5pt" type="#_x0000_t202" o:gfxdata="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" w14:anchorId="3B7C3AAD">
                 <v:textbox>
                   <w:txbxContent>
                     <w:p>
@@ -8907,7 +8885,7 @@
         <mc:AlternateContent>
           <mc:Choice Requires="wps">
             <w:drawing>
-              <wp:anchor distT="0" distB="0" distL="114300" distR="114300" simplePos="0" relativeHeight="251701248" behindDoc="0" locked="0" layoutInCell="1" allowOverlap="1" wp14:editId="3C1BFE81" wp14:anchorId="1FA29ADE">
+              <wp:anchor distT="0" distB="0" distL="114300" distR="114300" simplePos="0" relativeHeight="251701248" behindDoc="0" locked="0" layoutInCell="1" allowOverlap="1" wp14:editId="3D1C2F5F" wp14:anchorId="6A223370">
                 <wp:simplePos x="0" y="0"/>
                 <wp:positionH relativeFrom="column">
                   <wp:posOffset>3261995</wp:posOffset>
@@ -8975,7 +8953,7 @@
           </mc:Choice>
           <mc:Fallback>
             <w:pict>
-              <v:shape id="Text Box 275" style="position:absolute;margin-left:256.85pt;margin-top:80.4pt;width:101.6pt;height:21.35pt;z-index:251701248;visibility:visible;mso-wrap-style:square;mso-width-percent:0;mso-wrap-distance-left:9pt;mso-wrap-distance-top:0;mso-wrap-distance-right:9pt;mso-wrap-distance-bottom:0;mso-position-horizontal:absolute;mso-position-horizontal-relative:text;mso-position-vertical:absolute;mso-position-vertical-relative:text;mso-width-percent:0;mso-width-relative:margin;v-text-anchor:top" o:spid="_x0000_s1056" fillcolor="white [3201]" stroked="f" strokeweight=".5pt" type="#_x0000_t202" o:gfxdata="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" w14:anchorId="1FA29ADE">
+              <v:shape id="Text Box 275" style="position:absolute;margin-left:256.85pt;margin-top:80.4pt;width:101.6pt;height:21.35pt;z-index:251701248;visibility:visible;mso-wrap-style:square;mso-width-percent:0;mso-wrap-distance-left:9pt;mso-wrap-distance-top:0;mso-wrap-distance-right:9pt;mso-wrap-distance-bottom:0;mso-position-horizontal:absolute;mso-position-horizontal-relative:text;mso-position-vertical:absolute;mso-position-vertical-relative:text;mso-width-percent:0;mso-width-relative:margin;v-text-anchor:top" o:spid="_x0000_s1055" fillcolor="white [3201]" stroked="f" strokeweight=".5pt" type="#_x0000_t202" o:gfxdata="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" w14:anchorId="6A223370">
                 <v:textbox>
                   <w:txbxContent>
                     <w:p>
@@ -9010,7 +8988,7 @@
         <mc:AlternateContent>
           <mc:Choice Requires="wps">
             <w:drawing>
-              <wp:anchor distT="0" distB="0" distL="114300" distR="114300" simplePos="0" relativeHeight="251704320" behindDoc="0" locked="0" layoutInCell="1" allowOverlap="1" wp14:editId="1C498243" wp14:anchorId="18FF7C1F">
+              <wp:anchor distT="0" distB="0" distL="114300" distR="114300" simplePos="0" relativeHeight="251704320" behindDoc="0" locked="0" layoutInCell="1" allowOverlap="1" wp14:editId="53C71657" wp14:anchorId="7D5227A0">
                 <wp:simplePos x="0" y="0"/>
                 <wp:positionH relativeFrom="column">
                   <wp:posOffset>4452938</wp:posOffset>
@@ -9072,9 +9050,9 @@
               </wp:anchor>
             </w:drawing>
           </mc:Choice>
-          <mc:Fallback xmlns:pic="http://schemas.openxmlformats.org/drawingml/2006/picture" xmlns:a14="http://schemas.microsoft.com/office/drawing/2010/main" xmlns:a="http://schemas.openxmlformats.org/drawingml/2006/main">
+          <mc:Fallback xmlns:a="http://schemas.openxmlformats.org/drawingml/2006/main" xmlns:a14="http://schemas.microsoft.com/office/drawing/2010/main" xmlns:pic="http://schemas.openxmlformats.org/drawingml/2006/picture">
             <w:pict>
-              <v:line id="Straight Connector 278" style="position:absolute;flip:y;z-index:251704320;visibility:visible;mso-wrap-style:square;mso-width-percent:0;mso-height-percent:0;mso-wrap-distance-left:9pt;mso-wrap-distance-top:0;mso-wrap-distance-right:9pt;mso-wrap-distance-bottom:0;mso-position-horizontal:absolute;mso-position-horizontal-relative:text;mso-position-vertical:absolute;mso-position-vertical-relative:text;mso-width-percent:0;mso-height-percent:0;mso-width-relative:margin;mso-height-relative:margin" o:spid="_x0000_s1026" strokecolor="silver" o:gfxdata="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" from="350.65pt,96.1pt" to="501pt,96.8pt" w14:anchorId="371A2695">
+              <v:line id="Straight Connector 278" style="position:absolute;flip:y;z-index:251704320;visibility:visible;mso-wrap-style:square;mso-width-percent:0;mso-height-percent:0;mso-wrap-distance-left:9pt;mso-wrap-distance-top:0;mso-wrap-distance-right:9pt;mso-wrap-distance-bottom:0;mso-position-horizontal:absolute;mso-position-horizontal-relative:text;mso-position-vertical:absolute;mso-position-vertical-relative:text;mso-width-percent:0;mso-height-percent:0;mso-width-relative:margin;mso-height-relative:margin" o:spid="_x0000_s1026" strokecolor="silver" o:gfxdata="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" from="350.65pt,96.1pt" to="501pt,96.8pt" w14:anchorId="3A9E2584">
                 <v:stroke dashstyle="dash"/>
               </v:line>
             </w:pict>
@@ -9091,7 +9069,7 @@
         <mc:AlternateContent>
           <mc:Choice Requires="wps">
             <w:drawing>
-              <wp:anchor distT="0" distB="0" distL="114300" distR="114300" simplePos="0" relativeHeight="251703296" behindDoc="0" locked="0" layoutInCell="1" allowOverlap="1" wp14:editId="4D362730" wp14:anchorId="4B170561">
+              <wp:anchor distT="0" distB="0" distL="114300" distR="114300" simplePos="0" relativeHeight="251703296" behindDoc="0" locked="0" layoutInCell="1" allowOverlap="1" wp14:editId="7A6C0590" wp14:anchorId="17B0F321">
                 <wp:simplePos x="0" y="0"/>
                 <wp:positionH relativeFrom="column">
                   <wp:posOffset>1100137</wp:posOffset>
@@ -9153,7 +9131,7 @@
               </wp:anchor>
             </w:drawing>
           </mc:Choice>
-          <mc:Fallback xmlns:pic="http://schemas.openxmlformats.org/drawingml/2006/picture" xmlns:a14="http://schemas.microsoft.com/office/drawing/2010/main" xmlns:a="http://schemas.openxmlformats.org/drawingml/2006/main">
+          <mc:Fallback xmlns:a="http://schemas.openxmlformats.org/drawingml/2006/main" xmlns:a14="http://schemas.microsoft.com/office/drawing/2010/main" xmlns:pic="http://schemas.openxmlformats.org/drawingml/2006/picture">
             <w:pict>
               <v:line id="Straight Connector 277" style="position:absolute;z-index:251703296;visibility:visible;mso-wrap-style:square;mso-width-percent:0;mso-height-percent:0;mso-wrap-distance-left:9pt;mso-wrap-distance-top:0;mso-wrap-distance-right:9pt;mso-wrap-distance-bottom:0;mso-position-horizontal:absolute;mso-position-horizontal-relative:text;mso-position-vertical:absolute;mso-position-vertical-relative:text;mso-width-percent:0;mso-height-percent:0;mso-width-relative:margin;mso-height-relative:margin" o:spid="_x0000_s1026" strokecolor="silver" o:gfxdata="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" from="86.6pt,97.25pt" to="202.85pt,97.65pt" w14:anchorId="3A887180">
                 <v:stroke dashstyle="dash"/>
@@ -9172,151 +9150,7 @@
         <mc:AlternateContent>
           <mc:Choice Requires="wps">
             <w:drawing>
-              <wp:anchor distT="0" distB="0" distL="114300" distR="114300" simplePos="0" relativeHeight="251702272" behindDoc="0" locked="0" layoutInCell="1" allowOverlap="1" wp14:editId="21730F63" wp14:anchorId="318A4B2F">
-                <wp:simplePos x="0" y="0"/>
-                <wp:positionH relativeFrom="column">
-                  <wp:posOffset>6247447</wp:posOffset>
-                </wp:positionH>
-                <wp:positionV relativeFrom="paragraph">
-                  <wp:posOffset>992187</wp:posOffset>
-                </wp:positionV>
-                <wp:extent cx="909637" cy="257175"/>
-                <wp:effectExtent l="0" t="0" r="5080" b="9525"/>
-                <wp:wrapNone/>
-                <wp:docPr id="276" name="Text Box 276"/>
-                <wp:cNvGraphicFramePr/>
-                <a:graphic xmlns:a="http://schemas.openxmlformats.org/drawingml/2006/main">
-                  <a:graphicData uri="http://schemas.microsoft.com/office/word/2010/wordprocessingShape">
-                    <wps:wsp>
-                      <wps:cNvSpPr txBox="1"/>
-                      <wps:spPr>
-                        <a:xfrm>
-                          <a:off x="0" y="0"/>
-                          <a:ext cx="909637" cy="257175"/>
-                        </a:xfrm>
-                        <a:prstGeom prst="rect">
-                          <a:avLst/>
-                        </a:prstGeom>
-                        <a:solidFill>
-                          <a:schemeClr val="lt1"/>
-                        </a:solidFill>
-                        <a:ln w="6350">
-                          <a:noFill/>
-                        </a:ln>
-                      </wps:spPr>
-                      <wps:txbx>
-                        <w:txbxContent>
-                          <w:p>
-                            <w:pPr>
-                              <w:rPr>
-                                <w:rFonts w:ascii="Microsoft Sans Serif" w:hAnsi="Microsoft Sans Serif" w:cs="Microsoft Sans Serif"/>
-                                <w:color w:val="002060"/>
-                              </w:rPr>
-                            </w:pPr>
-                            <w:proofErr w:type="spellStart"/>
-                            <w:r>
-                              <w:rPr>
-                                <w:rFonts w:ascii="Microsoft Sans Serif" w:hAnsi="Microsoft Sans Serif" w:cs="Microsoft Sans Serif"/>
-                                <w:color w:val="002060"/>
-                              </w:rPr>
-                              <w:t>سلطة</w:t>
-                            </w:r>
-                            <w:proofErr w:type="spellEnd"/>
-                            <w:r>
-                              <w:rPr>
-                                <w:rFonts w:ascii="Microsoft Sans Serif" w:hAnsi="Microsoft Sans Serif" w:cs="Microsoft Sans Serif"/>
-                                <w:color w:val="002060"/>
-                              </w:rPr>
-                              <w:t xml:space="preserve"> </w:t>
-                            </w:r>
-                            <w:proofErr w:type="spellStart"/>
-                            <w:r>
-                              <w:rPr>
-                                <w:rFonts w:ascii="Microsoft Sans Serif" w:hAnsi="Microsoft Sans Serif" w:cs="Microsoft Sans Serif"/>
-                                <w:color w:val="002060"/>
-                              </w:rPr>
-                              <w:t>الترخيص</w:t>
-                            </w:r>
-                            <w:proofErr w:type="spellEnd"/>
-                          </w:p>
-                          <w:p/>
-                        </w:txbxContent>
-                      </wps:txbx>
-                      <wps:bodyPr rot="0" spcFirstLastPara="0" vertOverflow="overflow" horzOverflow="overflow" vert="horz" wrap="square" lIns="91440" tIns="45720" rIns="91440" bIns="45720" numCol="1" spcCol="0" rtlCol="0" fromWordArt="0" anchor="t" anchorCtr="0" forceAA="0" compatLnSpc="1">
-                        <a:prstTxWarp prst="textNoShape">
-                          <a:avLst/>
-                        </a:prstTxWarp>
-                        <a:noAutofit/>
-                      </wps:bodyPr>
-                    </wps:wsp>
-                  </a:graphicData>
-                </a:graphic>
-                <wp14:sizeRelH relativeFrom="margin">
-                  <wp14:pctWidth>0</wp14:pctWidth>
-                </wp14:sizeRelH>
-                <wp14:sizeRelV relativeFrom="margin">
-                  <wp14:pctHeight>0</wp14:pctHeight>
-                </wp14:sizeRelV>
-              </wp:anchor>
-            </w:drawing>
-          </mc:Choice>
-          <mc:Fallback>
-            <w:pict>
-              <v:shape id="Text Box 276" style="position:absolute;margin-left:491.9pt;margin-top:78.1pt;width:71.6pt;height:20.25pt;z-index:251702272;visibility:visible;mso-wrap-style:square;mso-width-percent:0;mso-height-percent:0;mso-wrap-distance-left:9pt;mso-wrap-distance-top:0;mso-wrap-distance-right:9pt;mso-wrap-distance-bottom:0;mso-position-horizontal:absolute;mso-position-horizontal-relative:text;mso-position-vertical:absolute;mso-position-vertical-relative:text;mso-width-percent:0;mso-height-percent:0;mso-width-relative:margin;mso-height-relative:margin;v-text-anchor:top" o:spid="_x0000_s1057" fillcolor="white [3201]" stroked="f" strokeweight=".5pt" type="#_x0000_t202" o:gfxdata="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" w14:anchorId="318A4B2F">
-                <v:textbox>
-                  <w:txbxContent>
-                    <w:p>
-                      <w:pPr>
-                        <w:rPr>
-                          <w:rFonts w:ascii="Microsoft Sans Serif" w:hAnsi="Microsoft Sans Serif" w:cs="Microsoft Sans Serif"/>
-                          <w:color w:val="002060"/>
-                        </w:rPr>
-                      </w:pPr>
-                      <w:proofErr w:type="spellStart"/>
-                      <w:r>
-                        <w:rPr>
-                          <w:rFonts w:ascii="Microsoft Sans Serif" w:hAnsi="Microsoft Sans Serif" w:cs="Microsoft Sans Serif"/>
-                          <w:color w:val="002060"/>
-                        </w:rPr>
-                        <w:t>سلطة</w:t>
-                      </w:r>
-                      <w:proofErr w:type="spellEnd"/>
-                      <w:r>
-                        <w:rPr>
-                          <w:rFonts w:ascii="Microsoft Sans Serif" w:hAnsi="Microsoft Sans Serif" w:cs="Microsoft Sans Serif"/>
-                          <w:color w:val="002060"/>
-                        </w:rPr>
-                        <w:t xml:space="preserve"> </w:t>
-                      </w:r>
-                      <w:proofErr w:type="spellStart"/>
-                      <w:r>
-                        <w:rPr>
-                          <w:rFonts w:ascii="Microsoft Sans Serif" w:hAnsi="Microsoft Sans Serif" w:cs="Microsoft Sans Serif"/>
-                          <w:color w:val="002060"/>
-                        </w:rPr>
-                        <w:t>الترخيص</w:t>
-                      </w:r>
-                      <w:proofErr w:type="spellEnd"/>
-                    </w:p>
-                    <w:p/>
-                  </w:txbxContent>
-                </v:textbox>
-              </v:shape>
-            </w:pict>
-          </mc:Fallback>
-        </mc:AlternateContent>
-      </w:r>
-      <w:r>
-        <w:rPr>
-          <w:rFonts w:ascii="Times New Roman"/>
-          <w:noProof/>
-          <w:spacing w:val="53"/>
-          <w:sz w:val="20"/>
-        </w:rPr>
-        <mc:AlternateContent>
-          <mc:Choice Requires="wps">
-            <w:drawing>
-              <wp:anchor distT="0" distB="0" distL="114300" distR="114300" simplePos="0" relativeHeight="251698176" behindDoc="0" locked="0" layoutInCell="1" allowOverlap="1" wp14:editId="70F82B8E" wp14:anchorId="5621FD1D">
+              <wp:anchor distT="0" distB="0" distL="114300" distR="114300" simplePos="0" relativeHeight="251698176" behindDoc="0" locked="0" layoutInCell="1" allowOverlap="1" wp14:editId="3012A2C1" wp14:anchorId="1D1E5795">
                 <wp:simplePos x="0" y="0"/>
                 <wp:positionH relativeFrom="column">
                   <wp:posOffset>1652589</wp:posOffset>
@@ -9378,9 +9212,9 @@
               </wp:anchor>
             </w:drawing>
           </mc:Choice>
-          <mc:Fallback xmlns:pic="http://schemas.openxmlformats.org/drawingml/2006/picture" xmlns:a14="http://schemas.microsoft.com/office/drawing/2010/main" xmlns:a="http://schemas.openxmlformats.org/drawingml/2006/main">
+          <mc:Fallback xmlns:a="http://schemas.openxmlformats.org/drawingml/2006/main" xmlns:a14="http://schemas.microsoft.com/office/drawing/2010/main" xmlns:pic="http://schemas.openxmlformats.org/drawingml/2006/picture">
             <w:pict>
-              <v:line id="Straight Connector 272" style="position:absolute;flip:y;z-index:251698176;visibility:visible;mso-wrap-style:square;mso-width-percent:0;mso-height-percent:0;mso-wrap-distance-left:9pt;mso-wrap-distance-top:0;mso-wrap-distance-right:9pt;mso-wrap-distance-bottom:0;mso-position-horizontal:absolute;mso-position-horizontal-relative:text;mso-position-vertical:absolute;mso-position-vertical-relative:text;mso-width-percent:0;mso-height-percent:0;mso-width-relative:margin;mso-height-relative:margin" o:spid="_x0000_s1026" strokecolor="silver" o:gfxdata="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" from="130.15pt,70.65pt" to="475.5pt,71.8pt" w14:anchorId="10DE1305">
+              <v:line id="Straight Connector 272" style="position:absolute;flip:y;z-index:251698176;visibility:visible;mso-wrap-style:square;mso-width-percent:0;mso-height-percent:0;mso-wrap-distance-left:9pt;mso-wrap-distance-top:0;mso-wrap-distance-right:9pt;mso-wrap-distance-bottom:0;mso-position-horizontal:absolute;mso-position-horizontal-relative:text;mso-position-vertical:absolute;mso-position-vertical-relative:text;mso-width-percent:0;mso-height-percent:0;mso-width-relative:margin;mso-height-relative:margin" o:spid="_x0000_s1026" strokecolor="silver" o:gfxdata="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" from="130.15pt,70.65pt" to="475.5pt,71.8pt" w14:anchorId="3D19D55E">
                 <v:stroke dashstyle="dash"/>
               </v:line>
             </w:pict>
@@ -9397,7 +9231,7 @@
         <mc:AlternateContent>
           <mc:Choice Requires="wps">
             <w:drawing>
-              <wp:anchor distT="0" distB="0" distL="114300" distR="114300" simplePos="0" relativeHeight="251699200" behindDoc="0" locked="0" layoutInCell="1" allowOverlap="1" wp14:editId="0CE143C9" wp14:anchorId="7BABE79C">
+              <wp:anchor distT="0" distB="0" distL="114300" distR="114300" simplePos="0" relativeHeight="251699200" behindDoc="0" locked="0" layoutInCell="1" allowOverlap="1" wp14:editId="0BB47B5C" wp14:anchorId="55FAA5B9">
                 <wp:simplePos x="0" y="0"/>
                 <wp:positionH relativeFrom="column">
                   <wp:posOffset>5949950</wp:posOffset>
@@ -9438,6 +9272,7 @@
                                 <w:color w:val="002060"/>
                               </w:rPr>
                             </w:pPr>
+                            <w:proofErr w:type="spellStart"/>
                             <w:r>
                               <w:rPr>
                                 <w:rFonts w:ascii="Microsoft Sans Serif" w:hAnsi="Microsoft Sans Serif" w:cs="Microsoft Sans Serif"/>
@@ -9449,6 +9284,7 @@
                               </w:rPr>
                               <w:t>اﻟﻬﻮﻳﺔ</w:t>
                             </w:r>
+                            <w:proofErr w:type="spellEnd"/>
                             <w:r>
                               <w:rPr>
                                 <w:rFonts w:ascii="Microsoft Sans Serif" w:hAnsi="Microsoft Sans Serif" w:cs="Microsoft Sans Serif"/>
@@ -9470,8 +9306,21 @@
                                 <w:szCs w:val="13"/>
                                 <w:rtl/>
                               </w:rPr>
-                              <w:t xml:space="preserve">   اﻹﻣﺎراﺗﻴﺔ</w:t>
+                              <w:t xml:space="preserve">   </w:t>
                             </w:r>
+                            <w:proofErr w:type="spellStart"/>
+                            <w:r>
+                              <w:rPr>
+                                <w:rFonts w:ascii="Microsoft Sans Serif" w:hAnsi="Microsoft Sans Serif" w:cs="Microsoft Sans Serif"/>
+                                <w:color w:val="002060"/>
+                                <w:w w:val="125"/>
+                                <w:sz w:val="13"/>
+                                <w:szCs w:val="13"/>
+                                <w:rtl/>
+                              </w:rPr>
+                              <w:t>اﻹﻣﺎراﺗﻴﺔ</w:t>
+                            </w:r>
+                            <w:proofErr w:type="spellEnd"/>
                             <w:r>
                               <w:rPr>
                                 <w:rFonts w:ascii="Microsoft Sans Serif" w:hAnsi="Microsoft Sans Serif" w:cs="Microsoft Sans Serif"/>
@@ -9493,7 +9342,19 @@
                                 <w:szCs w:val="13"/>
                                 <w:rtl/>
                               </w:rPr>
-                              <w:t xml:space="preserve">   ﻟﻠﻤﺴﺘﺄﺟ</w:t>
+                              <w:t xml:space="preserve">   </w:t>
+                            </w:r>
+                            <w:proofErr w:type="spellStart"/>
+                            <w:r>
+                              <w:rPr>
+                                <w:rFonts w:ascii="Microsoft Sans Serif" w:hAnsi="Microsoft Sans Serif" w:cs="Microsoft Sans Serif"/>
+                                <w:color w:val="002060"/>
+                                <w:w w:val="125"/>
+                                <w:sz w:val="13"/>
+                                <w:szCs w:val="13"/>
+                                <w:rtl/>
+                              </w:rPr>
+                              <w:t>ﻟﻠﻤﺴﺘﺄﺟ</w:t>
                             </w:r>
                             <w:r>
                               <w:rPr>
@@ -9507,6 +9368,7 @@
                               </w:rPr>
                               <w:t>ﺮ</w:t>
                             </w:r>
+                            <w:proofErr w:type="spellEnd"/>
                             <w:r>
                               <w:rPr>
                                 <w:rFonts w:ascii="Microsoft Sans Serif" w:hAnsi="Microsoft Sans Serif" w:cs="Microsoft Sans Serif"/>
@@ -9538,7 +9400,7 @@
           </mc:Choice>
           <mc:Fallback>
             <w:pict>
-              <v:shape id="Text Box 273" style="position:absolute;margin-left:468.5pt;margin-top:55.2pt;width:96.35pt;height:16.9pt;z-index:251699200;visibility:visible;mso-wrap-style:square;mso-width-percent:0;mso-height-percent:0;mso-wrap-distance-left:9pt;mso-wrap-distance-top:0;mso-wrap-distance-right:9pt;mso-wrap-distance-bottom:0;mso-position-horizontal:absolute;mso-position-horizontal-relative:text;mso-position-vertical:absolute;mso-position-vertical-relative:text;mso-width-percent:0;mso-height-percent:0;mso-width-relative:margin;mso-height-relative:margin;v-text-anchor:top" o:spid="_x0000_s1058" fillcolor="white [3201]" stroked="f" strokeweight=".5pt" type="#_x0000_t202" o:gfxdata="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" w14:anchorId="7BABE79C">
+              <v:shape id="Text Box 273" style="position:absolute;margin-left:468.5pt;margin-top:55.2pt;width:96.35pt;height:16.9pt;z-index:251699200;visibility:visible;mso-wrap-style:square;mso-width-percent:0;mso-height-percent:0;mso-wrap-distance-left:9pt;mso-wrap-distance-top:0;mso-wrap-distance-right:9pt;mso-wrap-distance-bottom:0;mso-position-horizontal:absolute;mso-position-horizontal-relative:text;mso-position-vertical:absolute;mso-position-vertical-relative:text;mso-width-percent:0;mso-height-percent:0;mso-width-relative:margin;mso-height-relative:margin;v-text-anchor:top" o:spid="_x0000_s1056" fillcolor="white [3201]" stroked="f" strokeweight=".5pt" type="#_x0000_t202" o:gfxdata="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" w14:anchorId="55FAA5B9">
                 <v:textbox>
                   <w:txbxContent>
                     <w:p>
@@ -9548,6 +9410,7 @@
                           <w:color w:val="002060"/>
                         </w:rPr>
                       </w:pPr>
+                      <w:proofErr w:type="spellStart"/>
                       <w:r>
                         <w:rPr>
                           <w:rFonts w:ascii="Microsoft Sans Serif" w:hAnsi="Microsoft Sans Serif" w:cs="Microsoft Sans Serif"/>
@@ -9559,6 +9422,7 @@
                         </w:rPr>
                         <w:t>اﻟﻬﻮﻳﺔ</w:t>
                       </w:r>
+                      <w:proofErr w:type="spellEnd"/>
                       <w:r>
                         <w:rPr>
                           <w:rFonts w:ascii="Microsoft Sans Serif" w:hAnsi="Microsoft Sans Serif" w:cs="Microsoft Sans Serif"/>
@@ -9580,8 +9444,21 @@
                           <w:szCs w:val="13"/>
                           <w:rtl/>
                         </w:rPr>
-                        <w:t xml:space="preserve">   اﻹﻣﺎراﺗﻴﺔ</w:t>
+                        <w:t xml:space="preserve">   </w:t>
                       </w:r>
+                      <w:proofErr w:type="spellStart"/>
+                      <w:r>
+                        <w:rPr>
+                          <w:rFonts w:ascii="Microsoft Sans Serif" w:hAnsi="Microsoft Sans Serif" w:cs="Microsoft Sans Serif"/>
+                          <w:color w:val="002060"/>
+                          <w:w w:val="125"/>
+                          <w:sz w:val="13"/>
+                          <w:szCs w:val="13"/>
+                          <w:rtl/>
+                        </w:rPr>
+                        <w:t>اﻹﻣﺎراﺗﻴﺔ</w:t>
+                      </w:r>
+                      <w:proofErr w:type="spellEnd"/>
                       <w:r>
                         <w:rPr>
                           <w:rFonts w:ascii="Microsoft Sans Serif" w:hAnsi="Microsoft Sans Serif" w:cs="Microsoft Sans Serif"/>
@@ -9603,7 +9480,19 @@
                           <w:szCs w:val="13"/>
                           <w:rtl/>
                         </w:rPr>
-                        <w:t xml:space="preserve">   ﻟﻠﻤﺴﺘﺄﺟ</w:t>
+                        <w:t xml:space="preserve">   </w:t>
+                      </w:r>
+                      <w:proofErr w:type="spellStart"/>
+                      <w:r>
+                        <w:rPr>
+                          <w:rFonts w:ascii="Microsoft Sans Serif" w:hAnsi="Microsoft Sans Serif" w:cs="Microsoft Sans Serif"/>
+                          <w:color w:val="002060"/>
+                          <w:w w:val="125"/>
+                          <w:sz w:val="13"/>
+                          <w:szCs w:val="13"/>
+                          <w:rtl/>
+                        </w:rPr>
+                        <w:t>ﻟﻠﻤﺴﺘﺄﺟ</w:t>
                       </w:r>
                       <w:r>
                         <w:rPr>
@@ -9617,6 +9506,7 @@
                         </w:rPr>
                         <w:t>ﺮ</w:t>
                       </w:r>
+                      <w:proofErr w:type="spellEnd"/>
                       <w:r>
                         <w:rPr>
                           <w:rFonts w:ascii="Microsoft Sans Serif" w:hAnsi="Microsoft Sans Serif" w:cs="Microsoft Sans Serif"/>
@@ -9643,7 +9533,7 @@
         <mc:AlternateContent>
           <mc:Choice Requires="wps">
             <w:drawing>
-              <wp:anchor distT="0" distB="0" distL="114300" distR="114300" simplePos="0" relativeHeight="251696128" behindDoc="0" locked="0" layoutInCell="1" allowOverlap="1" wp14:editId="1BBFDF48" wp14:anchorId="38F23017">
+              <wp:anchor distT="0" distB="0" distL="114300" distR="114300" simplePos="0" relativeHeight="251696128" behindDoc="0" locked="0" layoutInCell="1" allowOverlap="1" wp14:editId="15191AFB" wp14:anchorId="25ED2109">
                 <wp:simplePos x="0" y="0"/>
                 <wp:positionH relativeFrom="column">
                   <wp:posOffset>1338263</wp:posOffset>
@@ -9705,7 +9595,7 @@
               </wp:anchor>
             </w:drawing>
           </mc:Choice>
-          <mc:Fallback xmlns:a="http://schemas.openxmlformats.org/drawingml/2006/main" xmlns:a14="http://schemas.microsoft.com/office/drawing/2010/main" xmlns:pic="http://schemas.openxmlformats.org/drawingml/2006/picture">
+          <mc:Fallback xmlns:pic="http://schemas.openxmlformats.org/drawingml/2006/picture" xmlns:a14="http://schemas.microsoft.com/office/drawing/2010/main" xmlns:a="http://schemas.openxmlformats.org/drawingml/2006/main">
             <w:pict>
               <v:line id="Straight Connector 270" style="position:absolute;flip:y;z-index:251696128;visibility:visible;mso-wrap-style:square;mso-width-percent:0;mso-height-percent:0;mso-wrap-distance-left:9pt;mso-wrap-distance-top:0;mso-wrap-distance-right:9pt;mso-wrap-distance-bottom:0;mso-position-horizontal:absolute;mso-position-horizontal-relative:text;mso-position-vertical:absolute;mso-position-vertical-relative:text;mso-width-percent:0;mso-height-percent:0;mso-width-relative:margin;mso-height-relative:margin" o:spid="_x0000_s1026" strokecolor="silver" o:gfxdata="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" from="105.4pt,50.75pt" to="512.65pt,52.2pt" w14:anchorId="6FF8CCCE">
                 <v:stroke dashstyle="dash"/>
@@ -9723,7 +9613,7 @@
         <mc:AlternateContent>
           <mc:Choice Requires="wps">
             <w:drawing>
-              <wp:anchor distT="45720" distB="45720" distL="114300" distR="114300" simplePos="0" relativeHeight="251693056" behindDoc="0" locked="0" layoutInCell="1" allowOverlap="1" wp14:editId="427EA36C" wp14:anchorId="2B6450DB">
+              <wp:anchor distT="45720" distB="45720" distL="114300" distR="114300" simplePos="0" relativeHeight="251693056" behindDoc="0" locked="0" layoutInCell="1" allowOverlap="1" wp14:editId="767359B0" wp14:anchorId="7F2CD84F">
                 <wp:simplePos x="0" y="0"/>
                 <wp:positionH relativeFrom="margin">
                   <wp:align>center</wp:align>
@@ -9865,7 +9755,7 @@
           </mc:Choice>
           <mc:Fallback>
             <w:pict>
-              <v:shape id="_x0000_s1059" style="position:absolute;margin-left:0;margin-top:11pt;width:535.85pt;height:23.6pt;z-index:251693056;visibility:visible;mso-wrap-style:square;mso-width-percent:0;mso-height-percent:0;mso-wrap-distance-left:9pt;mso-wrap-distance-top:3.6pt;mso-wrap-distance-right:9pt;mso-wrap-distance-bottom:3.6pt;mso-position-horizontal:center;mso-position-horizontal-relative:margin;mso-position-vertical:absolute;mso-position-vertical-relative:text;mso-width-percent:0;mso-height-percent:0;mso-width-relative:margin;mso-height-relative:margin;v-text-anchor:top" fillcolor="#002060" stroked="f" type="#_x0000_t202" o:gfxdata="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" w14:anchorId="2B6450DB">
+              <v:shape id="_x0000_s1057" style="position:absolute;margin-left:0;margin-top:11pt;width:535.85pt;height:23.6pt;z-index:251693056;visibility:visible;mso-wrap-style:square;mso-width-percent:0;mso-height-percent:0;mso-wrap-distance-left:9pt;mso-wrap-distance-top:3.6pt;mso-wrap-distance-right:9pt;mso-wrap-distance-bottom:3.6pt;mso-position-horizontal:center;mso-position-horizontal-relative:margin;mso-position-vertical:absolute;mso-position-vertical-relative:text;mso-width-percent:0;mso-height-percent:0;mso-width-relative:margin;mso-height-relative:margin;v-text-anchor:top" fillcolor="#002060" stroked="f" type="#_x0000_t202" o:gfxdata="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" w14:anchorId="7F2CD84F">
                 <v:textbox>
                   <w:txbxContent>
                     <w:p>
@@ -9979,7 +9869,7 @@
         <mc:AlternateContent>
           <mc:Choice Requires="wps">
             <w:drawing>
-              <wp:anchor distT="0" distB="0" distL="114300" distR="114300" simplePos="0" relativeHeight="251697152" behindDoc="0" locked="0" layoutInCell="1" allowOverlap="1" wp14:editId="62176984" wp14:anchorId="491913BF">
+              <wp:anchor distT="0" distB="0" distL="114300" distR="114300" simplePos="0" relativeHeight="251697152" behindDoc="0" locked="0" layoutInCell="1" allowOverlap="1" wp14:editId="60957B72" wp14:anchorId="4244B30B">
                 <wp:simplePos x="0" y="0"/>
                 <wp:positionH relativeFrom="column">
                   <wp:posOffset>6405476</wp:posOffset>
@@ -10017,6 +9907,7 @@
                                 <w:color w:val="002060"/>
                               </w:rPr>
                             </w:pPr>
+                            <w:proofErr w:type="spellStart"/>
                             <w:r>
                               <w:rPr>
                                 <w:rFonts w:ascii="Microsoft Sans Serif" w:hAnsi="Microsoft Sans Serif" w:cs="Microsoft Sans Serif"/>
@@ -10028,6 +9919,7 @@
                               </w:rPr>
                               <w:t>اﺳﻢ</w:t>
                             </w:r>
+                            <w:proofErr w:type="spellEnd"/>
                             <w:r>
                               <w:rPr>
                                 <w:rFonts w:ascii="Microsoft Sans Serif" w:hAnsi="Microsoft Sans Serif" w:cs="Microsoft Sans Serif"/>
@@ -10049,8 +9941,21 @@
                                 <w:szCs w:val="13"/>
                                 <w:rtl/>
                               </w:rPr>
-                              <w:t xml:space="preserve">  اﻟﻤﺴﺘﺄﺟﺮ</w:t>
+                              <w:t xml:space="preserve">  </w:t>
                             </w:r>
+                            <w:proofErr w:type="spellStart"/>
+                            <w:r>
+                              <w:rPr>
+                                <w:rFonts w:ascii="Microsoft Sans Serif" w:hAnsi="Microsoft Sans Serif" w:cs="Microsoft Sans Serif"/>
+                                <w:color w:val="002060"/>
+                                <w:w w:val="135"/>
+                                <w:sz w:val="13"/>
+                                <w:szCs w:val="13"/>
+                                <w:rtl/>
+                              </w:rPr>
+                              <w:t>اﻟﻤﺴﺘﺄﺟﺮ</w:t>
+                            </w:r>
+                            <w:proofErr w:type="spellEnd"/>
                           </w:p>
                         </w:txbxContent>
                       </wps:txbx>
@@ -10074,7 +9979,7 @@
           </mc:Choice>
           <mc:Fallback>
             <w:pict>
-              <v:shape id="Text Box 271" style="position:absolute;margin-left:504.35pt;margin-top:15.05pt;width:58.9pt;height:15.75pt;z-index:251697152;visibility:visible;mso-wrap-style:square;mso-width-percent:0;mso-height-percent:0;mso-wrap-distance-left:9pt;mso-wrap-distance-top:0;mso-wrap-distance-right:9pt;mso-wrap-distance-bottom:0;mso-position-horizontal:absolute;mso-position-horizontal-relative:text;mso-position-vertical:absolute;mso-position-vertical-relative:text;mso-width-percent:0;mso-height-percent:0;mso-width-relative:margin;mso-height-relative:margin;v-text-anchor:top" o:spid="_x0000_s1060" filled="f" stroked="f" strokeweight=".5pt" type="#_x0000_t202" o:gfxdata="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" w14:anchorId="491913BF">
+              <v:shape id="Text Box 271" style="position:absolute;margin-left:504.35pt;margin-top:15.05pt;width:58.9pt;height:15.75pt;z-index:251697152;visibility:visible;mso-wrap-style:square;mso-width-percent:0;mso-height-percent:0;mso-wrap-distance-left:9pt;mso-wrap-distance-top:0;mso-wrap-distance-right:9pt;mso-wrap-distance-bottom:0;mso-position-horizontal:absolute;mso-position-horizontal-relative:text;mso-position-vertical:absolute;mso-position-vertical-relative:text;mso-width-percent:0;mso-height-percent:0;mso-width-relative:margin;mso-height-relative:margin;v-text-anchor:top" o:spid="_x0000_s1058" filled="f" stroked="f" strokeweight=".5pt" type="#_x0000_t202" o:gfxdata="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" w14:anchorId="4244B30B">
                 <v:textbox>
                   <w:txbxContent>
                     <w:p>
@@ -10083,6 +9988,7 @@
                           <w:color w:val="002060"/>
                         </w:rPr>
                       </w:pPr>
+                      <w:proofErr w:type="spellStart"/>
                       <w:r>
                         <w:rPr>
                           <w:rFonts w:ascii="Microsoft Sans Serif" w:hAnsi="Microsoft Sans Serif" w:cs="Microsoft Sans Serif"/>
@@ -10094,6 +10000,7 @@
                         </w:rPr>
                         <w:t>اﺳﻢ</w:t>
                       </w:r>
+                      <w:proofErr w:type="spellEnd"/>
                       <w:r>
                         <w:rPr>
                           <w:rFonts w:ascii="Microsoft Sans Serif" w:hAnsi="Microsoft Sans Serif" w:cs="Microsoft Sans Serif"/>
@@ -10115,8 +10022,21 @@
                           <w:szCs w:val="13"/>
                           <w:rtl/>
                         </w:rPr>
-                        <w:t xml:space="preserve">  اﻟﻤﺴﺘﺄﺟﺮ</w:t>
+                        <w:t xml:space="preserve">  </w:t>
                       </w:r>
+                      <w:proofErr w:type="spellStart"/>
+                      <w:r>
+                        <w:rPr>
+                          <w:rFonts w:ascii="Microsoft Sans Serif" w:hAnsi="Microsoft Sans Serif" w:cs="Microsoft Sans Serif"/>
+                          <w:color w:val="002060"/>
+                          <w:w w:val="135"/>
+                          <w:sz w:val="13"/>
+                          <w:szCs w:val="13"/>
+                          <w:rtl/>
+                        </w:rPr>
+                        <w:t>اﻟﻤﺴﺘﺄﺟﺮ</w:t>
+                      </w:r>
+                      <w:proofErr w:type="spellEnd"/>
                     </w:p>
                   </w:txbxContent>
                 </v:textbox>
@@ -10133,264 +10053,6 @@
           <w:sz w:val="20"/>
         </w:rPr>
         <w:t xml:space="preserve"> </w:t>
-      </w:r>
-      <w:r>
-        <w:rPr>
-          <w:rFonts w:ascii="Times New Roman"/>
-          <w:noProof/>
-          <w:spacing w:val="53"/>
-          <w:sz w:val="20"/>
-        </w:rPr>
-        <mc:AlternateContent>
-          <mc:Choice Requires="wps">
-            <w:drawing>
-              <wp:anchor distT="0" distB="0" distL="114300" distR="114300" simplePos="0" relativeHeight="251706368" behindDoc="0" locked="0" layoutInCell="1" allowOverlap="1" wp14:editId="739B36DA" wp14:anchorId="3737D2B5">
-                <wp:simplePos x="0" y="0"/>
-                <wp:positionH relativeFrom="column">
-                  <wp:posOffset>5986145</wp:posOffset>
-                </wp:positionH>
-                <wp:positionV relativeFrom="paragraph">
-                  <wp:posOffset>1030605</wp:posOffset>
-                </wp:positionV>
-                <wp:extent cx="1169352" cy="195263"/>
-                <wp:effectExtent l="0" t="0" r="0" b="0"/>
-                <wp:wrapNone/>
-                <wp:docPr id="280" name="Text Box 280"/>
-                <wp:cNvGraphicFramePr/>
-                <a:graphic xmlns:a="http://schemas.openxmlformats.org/drawingml/2006/main">
-                  <a:graphicData uri="http://schemas.microsoft.com/office/word/2010/wordprocessingShape">
-                    <wps:wsp>
-                      <wps:cNvSpPr txBox="1"/>
-                      <wps:spPr>
-                        <a:xfrm>
-                          <a:off x="0" y="0"/>
-                          <a:ext cx="1169352" cy="195263"/>
-                        </a:xfrm>
-                        <a:prstGeom prst="rect">
-                          <a:avLst/>
-                        </a:prstGeom>
-                        <a:solidFill>
-                          <a:schemeClr val="lt1"/>
-                        </a:solidFill>
-                        <a:ln w="6350">
-                          <a:noFill/>
-                        </a:ln>
-                      </wps:spPr>
-                      <wps:txbx>
-                        <w:txbxContent>
-                          <w:p>
-                            <w:r>
-                              <w:rPr>
-                                <w:rFonts w:ascii="Microsoft Sans Serif" w:hAnsi="Microsoft Sans Serif" w:cs="Microsoft Sans Serif"/>
-                                <w:b/>
-                                <w:bCs/>
-                                <w:color w:val="002060"/>
-                                <w:w w:val="125"/>
-                                <w:sz w:val="12"/>
-                                <w:szCs w:val="12"/>
-                                <w:rtl/>
-                              </w:rPr>
-                              <w:t>ا</w:t>
-                            </w:r>
-                            <w:r>
-                              <w:rPr>
-                                <w:rFonts w:ascii="Microsoft Sans Serif" w:hAnsi="Microsoft Sans Serif" w:cs="Microsoft Sans Serif"/>
-                                <w:color w:val="002060"/>
-                                <w:w w:val="125"/>
-                                <w:sz w:val="12"/>
-                                <w:szCs w:val="12"/>
-                                <w:rtl/>
-                              </w:rPr>
-                              <w:t>ﻟﺒﺮﻳﺪ</w:t>
-                            </w:r>
-                            <w:r>
-                              <w:rPr>
-                                <w:rFonts w:ascii="Microsoft Sans Serif" w:hAnsi="Microsoft Sans Serif" w:cs="Microsoft Sans Serif"/>
-                                <w:color w:val="002060"/>
-                                <w:spacing w:val="15"/>
-                                <w:w w:val="125"/>
-                                <w:sz w:val="12"/>
-                                <w:szCs w:val="12"/>
-                                <w:rtl/>
-                              </w:rPr>
-                              <w:t xml:space="preserve"> </w:t>
-                            </w:r>
-                            <w:r>
-                              <w:rPr>
-                                <w:rFonts w:ascii="Microsoft Sans Serif" w:hAnsi="Microsoft Sans Serif" w:cs="Microsoft Sans Serif"/>
-                                <w:color w:val="002060"/>
-                                <w:w w:val="125"/>
-                                <w:sz w:val="12"/>
-                                <w:szCs w:val="12"/>
-                                <w:rtl/>
-                              </w:rPr>
-                              <w:t xml:space="preserve">  اﻟﻺﻟﻜﺘﺮوﻧﻲ</w:t>
-                            </w:r>
-                            <w:r>
-                              <w:rPr>
-                                <w:rFonts w:ascii="Microsoft Sans Serif" w:hAnsi="Microsoft Sans Serif" w:cs="Microsoft Sans Serif"/>
-                                <w:color w:val="002060"/>
-                                <w:spacing w:val="17"/>
-                                <w:w w:val="125"/>
-                                <w:sz w:val="12"/>
-                                <w:szCs w:val="12"/>
-                                <w:rtl/>
-                              </w:rPr>
-                              <w:t xml:space="preserve"> </w:t>
-                            </w:r>
-                            <w:r>
-                              <w:rPr>
-                                <w:rFonts w:ascii="Microsoft Sans Serif" w:hAnsi="Microsoft Sans Serif" w:cs="Microsoft Sans Serif"/>
-                                <w:color w:val="002060"/>
-                                <w:w w:val="125"/>
-                                <w:sz w:val="12"/>
-                                <w:szCs w:val="12"/>
-                                <w:rtl/>
-                              </w:rPr>
-                              <w:t xml:space="preserve">  ﻟﻠﻤﺆﺟ</w:t>
-                            </w:r>
-                            <w:r>
-                              <w:rPr>
-                                <w:rFonts w:ascii="Microsoft Sans Serif" w:hAnsi="Microsoft Sans Serif" w:cs="Microsoft Sans Serif"/>
-                                <w:color w:val="002060"/>
-                                <w:w w:val="125"/>
-                                <w:sz w:val="12"/>
-                                <w:szCs w:val="12"/>
-                                <w:u w:val="dotted" w:color="9D9D9D"/>
-                                <w:rtl/>
-                              </w:rPr>
-                              <w:t>ﺮ</w:t>
-                            </w:r>
-                            <w:r>
-                              <w:rPr>
-                                <w:rFonts w:ascii="Microsoft Sans Serif" w:hAnsi="Microsoft Sans Serif" w:cs="Microsoft Sans Serif"/>
-                                <w:color w:val="002060"/>
-                              </w:rPr>
-                              <w:t xml:space="preserve">         </w:t>
-                            </w:r>
-                          </w:p>
-                        </w:txbxContent>
-                      </wps:txbx>
-                      <wps:bodyPr rot="0" spcFirstLastPara="0" vertOverflow="overflow" horzOverflow="overflow" vert="horz" wrap="square" lIns="91440" tIns="45720" rIns="91440" bIns="45720" numCol="1" spcCol="0" rtlCol="0" fromWordArt="0" anchor="t" anchorCtr="0" forceAA="0" compatLnSpc="1">
-                        <a:prstTxWarp prst="textNoShape">
-                          <a:avLst/>
-                        </a:prstTxWarp>
-                        <a:noAutofit/>
-                      </wps:bodyPr>
-                    </wps:wsp>
-                  </a:graphicData>
-                </a:graphic>
-                <wp14:sizeRelH relativeFrom="margin">
-                  <wp14:pctWidth>0</wp14:pctWidth>
-                </wp14:sizeRelH>
-                <wp14:sizeRelV relativeFrom="margin">
-                  <wp14:pctHeight>0</wp14:pctHeight>
-                </wp14:sizeRelV>
-              </wp:anchor>
-            </w:drawing>
-          </mc:Choice>
-          <mc:Fallback>
-            <w:pict>
-              <v:shape id="Text Box 280" style="position:absolute;margin-left:471.35pt;margin-top:81.15pt;width:92.05pt;height:15.4pt;z-index:251706368;visibility:visible;mso-wrap-style:square;mso-width-percent:0;mso-height-percent:0;mso-wrap-distance-left:9pt;mso-wrap-distance-top:0;mso-wrap-distance-right:9pt;mso-wrap-distance-bottom:0;mso-position-horizontal:absolute;mso-position-horizontal-relative:text;mso-position-vertical:absolute;mso-position-vertical-relative:text;mso-width-percent:0;mso-height-percent:0;mso-width-relative:margin;mso-height-relative:margin;v-text-anchor:top" o:spid="_x0000_s1061" fillcolor="white [3201]" stroked="f" strokeweight=".5pt" type="#_x0000_t202" o:gfxdata="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" w14:anchorId="3737D2B5">
-                <v:textbox>
-                  <w:txbxContent>
-                    <w:p>
-                      <w:r>
-                        <w:rPr>
-                          <w:rFonts w:ascii="Microsoft Sans Serif" w:hAnsi="Microsoft Sans Serif" w:cs="Microsoft Sans Serif"/>
-                          <w:b/>
-                          <w:bCs/>
-                          <w:color w:val="002060"/>
-                          <w:w w:val="125"/>
-                          <w:sz w:val="12"/>
-                          <w:szCs w:val="12"/>
-                          <w:rtl/>
-                        </w:rPr>
-                        <w:t>ا</w:t>
-                      </w:r>
-                      <w:r>
-                        <w:rPr>
-                          <w:rFonts w:ascii="Microsoft Sans Serif" w:hAnsi="Microsoft Sans Serif" w:cs="Microsoft Sans Serif"/>
-                          <w:color w:val="002060"/>
-                          <w:w w:val="125"/>
-                          <w:sz w:val="12"/>
-                          <w:szCs w:val="12"/>
-                          <w:rtl/>
-                        </w:rPr>
-                        <w:t>ﻟﺒﺮﻳﺪ</w:t>
-                      </w:r>
-                      <w:r>
-                        <w:rPr>
-                          <w:rFonts w:ascii="Microsoft Sans Serif" w:hAnsi="Microsoft Sans Serif" w:cs="Microsoft Sans Serif"/>
-                          <w:color w:val="002060"/>
-                          <w:spacing w:val="15"/>
-                          <w:w w:val="125"/>
-                          <w:sz w:val="12"/>
-                          <w:szCs w:val="12"/>
-                          <w:rtl/>
-                        </w:rPr>
-                        <w:t xml:space="preserve"> </w:t>
-                      </w:r>
-                      <w:r>
-                        <w:rPr>
-                          <w:rFonts w:ascii="Microsoft Sans Serif" w:hAnsi="Microsoft Sans Serif" w:cs="Microsoft Sans Serif"/>
-                          <w:color w:val="002060"/>
-                          <w:w w:val="125"/>
-                          <w:sz w:val="12"/>
-                          <w:szCs w:val="12"/>
-                          <w:rtl/>
-                        </w:rPr>
-                        <w:t xml:space="preserve">  اﻟﻺﻟﻜﺘﺮوﻧﻲ</w:t>
-                      </w:r>
-                      <w:r>
-                        <w:rPr>
-                          <w:rFonts w:ascii="Microsoft Sans Serif" w:hAnsi="Microsoft Sans Serif" w:cs="Microsoft Sans Serif"/>
-                          <w:color w:val="002060"/>
-                          <w:spacing w:val="17"/>
-                          <w:w w:val="125"/>
-                          <w:sz w:val="12"/>
-                          <w:szCs w:val="12"/>
-                          <w:rtl/>
-                        </w:rPr>
-                        <w:t xml:space="preserve"> </w:t>
-                      </w:r>
-                      <w:r>
-                        <w:rPr>
-                          <w:rFonts w:ascii="Microsoft Sans Serif" w:hAnsi="Microsoft Sans Serif" w:cs="Microsoft Sans Serif"/>
-                          <w:color w:val="002060"/>
-                          <w:w w:val="125"/>
-                          <w:sz w:val="12"/>
-                          <w:szCs w:val="12"/>
-                          <w:rtl/>
-                        </w:rPr>
-                        <w:t xml:space="preserve">  ﻟﻠﻤﺆﺟ</w:t>
-                      </w:r>
-                      <w:r>
-                        <w:rPr>
-                          <w:rFonts w:ascii="Microsoft Sans Serif" w:hAnsi="Microsoft Sans Serif" w:cs="Microsoft Sans Serif"/>
-                          <w:color w:val="002060"/>
-                          <w:w w:val="125"/>
-                          <w:sz w:val="12"/>
-                          <w:szCs w:val="12"/>
-                          <w:u w:val="dotted" w:color="9D9D9D"/>
-                          <w:rtl/>
-                        </w:rPr>
-                        <w:t>ﺮ</w:t>
-                      </w:r>
-                      <w:r>
-                        <w:rPr>
-                          <w:rFonts w:ascii="Microsoft Sans Serif" w:hAnsi="Microsoft Sans Serif" w:cs="Microsoft Sans Serif"/>
-                          <w:color w:val="002060"/>
-                        </w:rPr>
-                        <w:t xml:space="preserve">         </w:t>
-                      </w:r>
-                    </w:p>
-                  </w:txbxContent>
-                </v:textbox>
-              </v:shape>
-            </w:pict>
-          </mc:Fallback>
-        </mc:AlternateContent>
       </w:r>
       <w:r>
         <w:rPr>
@@ -10422,6 +10084,289 @@
           <w:sz w:val="20"/>
         </w:rPr>
       </w:pPr>
+      <w:r>
+        <w:rPr>
+          <w:rFonts w:ascii="Arial"/>
+          <w:noProof/>
+          <w:sz w:val="20"/>
+        </w:rPr>
+        <mc:AlternateContent>
+          <mc:Choice Requires="wps">
+            <w:drawing>
+              <wp:anchor distT="0" distB="0" distL="114300" distR="114300" simplePos="0" relativeHeight="251709440" behindDoc="0" locked="0" layoutInCell="1" allowOverlap="1" wp14:editId="7C5A3CDB" wp14:anchorId="61ADA512">
+                <wp:simplePos x="0" y="0"/>
+                <wp:positionH relativeFrom="column">
+                  <wp:posOffset>4457700</wp:posOffset>
+                </wp:positionH>
+                <wp:positionV relativeFrom="paragraph">
+                  <wp:posOffset>220345</wp:posOffset>
+                </wp:positionV>
+                <wp:extent cx="2590800" cy="261620"/>
+                <wp:effectExtent l="0" t="0" r="0" b="5080"/>
+                <wp:wrapNone/>
+                <wp:docPr id="283" name="Text Box 283"/>
+                <wp:cNvGraphicFramePr/>
+                <a:graphic xmlns:a="http://schemas.openxmlformats.org/drawingml/2006/main">
+                  <a:graphicData uri="http://schemas.microsoft.com/office/word/2010/wordprocessingShape">
+                    <wps:wsp>
+                      <wps:cNvSpPr txBox="1"/>
+                      <wps:spPr>
+                        <a:xfrm>
+                          <a:off x="0" y="0"/>
+                          <a:ext cx="2590800" cy="261620"/>
+                        </a:xfrm>
+                        <a:prstGeom prst="rect">
+                          <a:avLst/>
+                        </a:prstGeom>
+                        <a:noFill/>
+                        <a:ln w="6350">
+                          <a:noFill/>
+                        </a:ln>
+                      </wps:spPr>
+                      <wps:txbx>
+                        <w:txbxContent>
+                          <w:sdt>
+                            <w:sdtPr>
+                              <w:alias w:val="#Nav: /TenancyContract/Tenant_Licensing_Authority"/>
+                              <w:tag w:val="#Nav: Tenancy_Contract/50101"/>
+                              <w:id w:val="-137874661"/>
+                              <w:dataBinding w:prefixMappings="xmlns:ns0='urn:microsoft-dynamics-nav/reports/Tenancy_Contract/50101/'" w:xpath="/ns0:NavWordReportXmlPart[1]/ns0:TenancyContract[1]/ns0:Tenant_Licensing_Authority[1]" w:storeItemID="{B8787D49-5AAC-4AAC-A9D8-A7D9793FE4D0}"/>
+                              <w:text/>
+                            </w:sdtPr>
+                            <w:sdtContent>
+                              <w:p>
+                                <w:proofErr w:type="spellStart"/>
+                                <w:r>
+                                  <w:t>Tenant_Licensing_Authority</w:t>
+                                </w:r>
+                                <w:proofErr w:type="spellEnd"/>
+                              </w:p>
+                            </w:sdtContent>
+                          </w:sdt>
+                        </w:txbxContent>
+                      </wps:txbx>
+                      <wps:bodyPr rot="0" spcFirstLastPara="0" vertOverflow="overflow" horzOverflow="overflow" vert="horz" wrap="square" lIns="91440" tIns="45720" rIns="91440" bIns="45720" numCol="1" spcCol="0" rtlCol="0" fromWordArt="0" anchor="t" anchorCtr="0" forceAA="0" compatLnSpc="1">
+                        <a:prstTxWarp prst="textNoShape">
+                          <a:avLst/>
+                        </a:prstTxWarp>
+                        <a:noAutofit/>
+                      </wps:bodyPr>
+                    </wps:wsp>
+                  </a:graphicData>
+                </a:graphic>
+                <wp14:sizeRelH relativeFrom="margin">
+                  <wp14:pctWidth>0</wp14:pctWidth>
+                </wp14:sizeRelH>
+                <wp14:sizeRelV relativeFrom="margin">
+                  <wp14:pctHeight>0</wp14:pctHeight>
+                </wp14:sizeRelV>
+              </wp:anchor>
+            </w:drawing>
+          </mc:Choice>
+          <mc:Fallback>
+            <w:pict>
+              <v:shape id="Text Box 283" style="position:absolute;margin-left:351pt;margin-top:17.35pt;width:204pt;height:20.6pt;z-index:251709440;visibility:visible;mso-wrap-style:square;mso-width-percent:0;mso-height-percent:0;mso-wrap-distance-left:9pt;mso-wrap-distance-top:0;mso-wrap-distance-right:9pt;mso-wrap-distance-bottom:0;mso-position-horizontal:absolute;mso-position-horizontal-relative:text;mso-position-vertical:absolute;mso-position-vertical-relative:text;mso-width-percent:0;mso-height-percent:0;mso-width-relative:margin;mso-height-relative:margin;v-text-anchor:top" o:spid="_x0000_s1059" filled="f" stroked="f" strokeweight=".5pt" type="#_x0000_t202" o:gfxdata="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" w14:anchorId="61ADA512">
+                <v:textbox>
+                  <w:txbxContent>
+                    <w:sdt>
+                      <w:sdtPr>
+                        <w:alias w:val="#Nav: /TenancyContract/Tenant_Licensing_Authority"/>
+                        <w:tag w:val="#Nav: Tenancy_Contract/50101"/>
+                        <w:id w:val="-137874661"/>
+                        <w:dataBinding w:prefixMappings="xmlns:ns0='urn:microsoft-dynamics-nav/reports/Tenancy_Contract/50101/'" w:xpath="/ns0:NavWordReportXmlPart[1]/ns0:TenancyContract[1]/ns0:Tenant_Licensing_Authority[1]" w:storeItemID="{B8787D49-5AAC-4AAC-A9D8-A7D9793FE4D0}"/>
+                        <w:text/>
+                      </w:sdtPr>
+                      <w:sdtContent>
+                        <w:p>
+                          <w:proofErr w:type="spellStart"/>
+                          <w:r>
+                            <w:t>Tenant_Licensing_Authority</w:t>
+                          </w:r>
+                          <w:proofErr w:type="spellEnd"/>
+                        </w:p>
+                      </w:sdtContent>
+                    </w:sdt>
+                  </w:txbxContent>
+                </v:textbox>
+              </v:shape>
+            </w:pict>
+          </mc:Fallback>
+        </mc:AlternateContent>
+      </w:r>
+      <w:r>
+        <w:rPr>
+          <w:rFonts w:ascii="Times New Roman"/>
+          <w:noProof/>
+          <w:spacing w:val="53"/>
+          <w:sz w:val="20"/>
+        </w:rPr>
+        <mc:AlternateContent>
+          <mc:Choice Requires="wps">
+            <w:drawing>
+              <wp:anchor distT="0" distB="0" distL="114300" distR="114300" simplePos="0" relativeHeight="251702272" behindDoc="0" locked="0" layoutInCell="1" allowOverlap="1" wp14:editId="09E79D53" wp14:anchorId="3F826EF6">
+                <wp:simplePos x="0" y="0"/>
+                <wp:positionH relativeFrom="column">
+                  <wp:posOffset>6321425</wp:posOffset>
+                </wp:positionH>
+                <wp:positionV relativeFrom="paragraph">
+                  <wp:posOffset>215900</wp:posOffset>
+                </wp:positionV>
+                <wp:extent cx="845820" cy="257175"/>
+                <wp:effectExtent l="0" t="0" r="0" b="9525"/>
+                <wp:wrapNone/>
+                <wp:docPr id="276" name="Text Box 276"/>
+                <wp:cNvGraphicFramePr/>
+                <a:graphic xmlns:a="http://schemas.openxmlformats.org/drawingml/2006/main">
+                  <a:graphicData uri="http://schemas.microsoft.com/office/word/2010/wordprocessingShape">
+                    <wps:wsp>
+                      <wps:cNvSpPr txBox="1"/>
+                      <wps:spPr>
+                        <a:xfrm>
+                          <a:off x="0" y="0"/>
+                          <a:ext cx="845820" cy="257175"/>
+                        </a:xfrm>
+                        <a:prstGeom prst="rect">
+                          <a:avLst/>
+                        </a:prstGeom>
+                        <a:solidFill>
+                          <a:schemeClr val="lt1"/>
+                        </a:solidFill>
+                        <a:ln w="6350">
+                          <a:noFill/>
+                        </a:ln>
+                      </wps:spPr>
+                      <wps:txbx>
+                        <w:txbxContent>
+                          <w:p>
+                            <w:pPr>
+                              <w:rPr>
+                                <w:rFonts w:ascii="Microsoft Sans Serif" w:hAnsi="Microsoft Sans Serif" w:cs="Microsoft Sans Serif"/>
+                                <w:color w:val="002060"/>
+                                <w:sz w:val="20"/>
+                                <w:szCs w:val="20"/>
+                              </w:rPr>
+                            </w:pPr>
+                            <w:proofErr w:type="spellStart"/>
+                            <w:r>
+                              <w:rPr>
+                                <w:rFonts w:ascii="Microsoft Sans Serif" w:hAnsi="Microsoft Sans Serif" w:cs="Microsoft Sans Serif"/>
+                                <w:color w:val="002060"/>
+                                <w:sz w:val="20"/>
+                                <w:szCs w:val="20"/>
+                              </w:rPr>
+                              <w:t>سلطة</w:t>
+                            </w:r>
+                            <w:proofErr w:type="spellEnd"/>
+                            <w:r>
+                              <w:rPr>
+                                <w:rFonts w:ascii="Microsoft Sans Serif" w:hAnsi="Microsoft Sans Serif" w:cs="Microsoft Sans Serif"/>
+                                <w:color w:val="002060"/>
+                                <w:sz w:val="20"/>
+                                <w:szCs w:val="20"/>
+                              </w:rPr>
+                              <w:t xml:space="preserve"> </w:t>
+                            </w:r>
+                            <w:proofErr w:type="spellStart"/>
+                            <w:r>
+                              <w:rPr>
+                                <w:rFonts w:ascii="Microsoft Sans Serif" w:hAnsi="Microsoft Sans Serif" w:cs="Microsoft Sans Serif"/>
+                                <w:color w:val="002060"/>
+                                <w:sz w:val="20"/>
+                                <w:szCs w:val="20"/>
+                              </w:rPr>
+                              <w:t>الترخيص</w:t>
+                            </w:r>
+                            <w:proofErr w:type="spellEnd"/>
+                          </w:p>
+                          <w:p>
+                            <w:pPr>
+                              <w:rPr>
+                                <w:sz w:val="20"/>
+                                <w:szCs w:val="20"/>
+                              </w:rPr>
+                            </w:pPr>
+                          </w:p>
+                        </w:txbxContent>
+                      </wps:txbx>
+                      <wps:bodyPr rot="0" spcFirstLastPara="0" vertOverflow="overflow" horzOverflow="overflow" vert="horz" wrap="square" lIns="91440" tIns="45720" rIns="91440" bIns="45720" numCol="1" spcCol="0" rtlCol="0" fromWordArt="0" anchor="t" anchorCtr="0" forceAA="0" compatLnSpc="1">
+                        <a:prstTxWarp prst="textNoShape">
+                          <a:avLst/>
+                        </a:prstTxWarp>
+                        <a:noAutofit/>
+                      </wps:bodyPr>
+                    </wps:wsp>
+                  </a:graphicData>
+                </a:graphic>
+                <wp14:sizeRelH relativeFrom="margin">
+                  <wp14:pctWidth>0</wp14:pctWidth>
+                </wp14:sizeRelH>
+                <wp14:sizeRelV relativeFrom="margin">
+                  <wp14:pctHeight>0</wp14:pctHeight>
+                </wp14:sizeRelV>
+              </wp:anchor>
+            </w:drawing>
+          </mc:Choice>
+          <mc:Fallback>
+            <w:pict>
+              <v:shape id="Text Box 276" style="position:absolute;margin-left:497.75pt;margin-top:17pt;width:66.6pt;height:20.25pt;z-index:251702272;visibility:visible;mso-wrap-style:square;mso-width-percent:0;mso-height-percent:0;mso-wrap-distance-left:9pt;mso-wrap-distance-top:0;mso-wrap-distance-right:9pt;mso-wrap-distance-bottom:0;mso-position-horizontal:absolute;mso-position-horizontal-relative:text;mso-position-vertical:absolute;mso-position-vertical-relative:text;mso-width-percent:0;mso-height-percent:0;mso-width-relative:margin;mso-height-relative:margin;v-text-anchor:top" o:spid="_x0000_s1060" fillcolor="white [3201]" stroked="f" strokeweight=".5pt" type="#_x0000_t202" o:gfxdata="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" w14:anchorId="3F826EF6">
+                <v:textbox>
+                  <w:txbxContent>
+                    <w:p>
+                      <w:pPr>
+                        <w:rPr>
+                          <w:rFonts w:ascii="Microsoft Sans Serif" w:hAnsi="Microsoft Sans Serif" w:cs="Microsoft Sans Serif"/>
+                          <w:color w:val="002060"/>
+                          <w:sz w:val="20"/>
+                          <w:szCs w:val="20"/>
+                        </w:rPr>
+                      </w:pPr>
+                      <w:proofErr w:type="spellStart"/>
+                      <w:r>
+                        <w:rPr>
+                          <w:rFonts w:ascii="Microsoft Sans Serif" w:hAnsi="Microsoft Sans Serif" w:cs="Microsoft Sans Serif"/>
+                          <w:color w:val="002060"/>
+                          <w:sz w:val="20"/>
+                          <w:szCs w:val="20"/>
+                        </w:rPr>
+                        <w:t>سلطة</w:t>
+                      </w:r>
+                      <w:proofErr w:type="spellEnd"/>
+                      <w:r>
+                        <w:rPr>
+                          <w:rFonts w:ascii="Microsoft Sans Serif" w:hAnsi="Microsoft Sans Serif" w:cs="Microsoft Sans Serif"/>
+                          <w:color w:val="002060"/>
+                          <w:sz w:val="20"/>
+                          <w:szCs w:val="20"/>
+                        </w:rPr>
+                        <w:t xml:space="preserve"> </w:t>
+                      </w:r>
+                      <w:proofErr w:type="spellStart"/>
+                      <w:r>
+                        <w:rPr>
+                          <w:rFonts w:ascii="Microsoft Sans Serif" w:hAnsi="Microsoft Sans Serif" w:cs="Microsoft Sans Serif"/>
+                          <w:color w:val="002060"/>
+                          <w:sz w:val="20"/>
+                          <w:szCs w:val="20"/>
+                        </w:rPr>
+                        <w:t>الترخيص</w:t>
+                      </w:r>
+                      <w:proofErr w:type="spellEnd"/>
+                    </w:p>
+                    <w:p>
+                      <w:pPr>
+                        <w:rPr>
+                          <w:sz w:val="20"/>
+                          <w:szCs w:val="20"/>
+                        </w:rPr>
+                      </w:pPr>
+                    </w:p>
+                  </w:txbxContent>
+                </v:textbox>
+              </v:shape>
+            </w:pict>
+          </mc:Fallback>
+        </mc:AlternateContent>
+      </w:r>
     </w:p>
     <w:p>
       <w:pPr>
@@ -10444,6 +10389,320 @@
           <w:sz w:val="20"/>
         </w:rPr>
       </w:pPr>
+      <w:r>
+        <w:rPr>
+          <w:rFonts w:ascii="Times New Roman"/>
+          <w:noProof/>
+          <w:spacing w:val="53"/>
+          <w:sz w:val="20"/>
+        </w:rPr>
+        <mc:AlternateContent>
+          <mc:Choice Requires="wps">
+            <w:drawing>
+              <wp:anchor distT="0" distB="0" distL="114300" distR="114300" simplePos="0" relativeHeight="251706368" behindDoc="0" locked="0" layoutInCell="1" allowOverlap="1" wp14:editId="0D53505F" wp14:anchorId="158B3759">
+                <wp:simplePos x="0" y="0"/>
+                <wp:positionH relativeFrom="column">
+                  <wp:posOffset>6054725</wp:posOffset>
+                </wp:positionH>
+                <wp:positionV relativeFrom="paragraph">
+                  <wp:posOffset>19050</wp:posOffset>
+                </wp:positionV>
+                <wp:extent cx="1107440" cy="194945"/>
+                <wp:effectExtent l="0" t="0" r="0" b="0"/>
+                <wp:wrapNone/>
+                <wp:docPr id="280" name="Text Box 280"/>
+                <wp:cNvGraphicFramePr/>
+                <a:graphic xmlns:a="http://schemas.openxmlformats.org/drawingml/2006/main">
+                  <a:graphicData uri="http://schemas.microsoft.com/office/word/2010/wordprocessingShape">
+                    <wps:wsp>
+                      <wps:cNvSpPr txBox="1"/>
+                      <wps:spPr>
+                        <a:xfrm>
+                          <a:off x="0" y="0"/>
+                          <a:ext cx="1107440" cy="194945"/>
+                        </a:xfrm>
+                        <a:prstGeom prst="rect">
+                          <a:avLst/>
+                        </a:prstGeom>
+                        <a:solidFill>
+                          <a:schemeClr val="lt1"/>
+                        </a:solidFill>
+                        <a:ln w="6350">
+                          <a:noFill/>
+                        </a:ln>
+                      </wps:spPr>
+                      <wps:txbx>
+                        <w:txbxContent>
+                          <w:p>
+                            <w:proofErr w:type="spellStart"/>
+                            <w:r>
+                              <w:rPr>
+                                <w:rFonts w:ascii="Microsoft Sans Serif" w:hAnsi="Microsoft Sans Serif" w:cs="Microsoft Sans Serif"/>
+                                <w:b/>
+                                <w:bCs/>
+                                <w:color w:val="002060"/>
+                                <w:w w:val="125"/>
+                                <w:sz w:val="12"/>
+                                <w:szCs w:val="12"/>
+                                <w:rtl/>
+                              </w:rPr>
+                              <w:t>ا</w:t>
+                            </w:r>
+                            <w:r>
+                              <w:rPr>
+                                <w:rFonts w:ascii="Microsoft Sans Serif" w:hAnsi="Microsoft Sans Serif" w:cs="Microsoft Sans Serif"/>
+                                <w:color w:val="002060"/>
+                                <w:w w:val="125"/>
+                                <w:sz w:val="12"/>
+                                <w:szCs w:val="12"/>
+                                <w:rtl/>
+                              </w:rPr>
+                              <w:t>ﻟﺒﺮﻳﺪ</w:t>
+                            </w:r>
+                            <w:proofErr w:type="spellEnd"/>
+                            <w:r>
+                              <w:rPr>
+                                <w:rFonts w:ascii="Microsoft Sans Serif" w:hAnsi="Microsoft Sans Serif" w:cs="Microsoft Sans Serif"/>
+                                <w:color w:val="002060"/>
+                                <w:spacing w:val="15"/>
+                                <w:w w:val="125"/>
+                                <w:sz w:val="12"/>
+                                <w:szCs w:val="12"/>
+                                <w:rtl/>
+                              </w:rPr>
+                              <w:t xml:space="preserve"> </w:t>
+                            </w:r>
+                            <w:r>
+                              <w:rPr>
+                                <w:rFonts w:ascii="Microsoft Sans Serif" w:hAnsi="Microsoft Sans Serif" w:cs="Microsoft Sans Serif"/>
+                                <w:color w:val="002060"/>
+                                <w:w w:val="125"/>
+                                <w:sz w:val="12"/>
+                                <w:szCs w:val="12"/>
+                                <w:rtl/>
+                              </w:rPr>
+                              <w:t xml:space="preserve">  </w:t>
+                            </w:r>
+                            <w:proofErr w:type="spellStart"/>
+                            <w:r>
+                              <w:rPr>
+                                <w:rFonts w:ascii="Microsoft Sans Serif" w:hAnsi="Microsoft Sans Serif" w:cs="Microsoft Sans Serif"/>
+                                <w:color w:val="002060"/>
+                                <w:w w:val="125"/>
+                                <w:sz w:val="12"/>
+                                <w:szCs w:val="12"/>
+                                <w:rtl/>
+                              </w:rPr>
+                              <w:t>اﻟﻺﻟﻜﺘﺮوﻧﻲ</w:t>
+                            </w:r>
+                            <w:proofErr w:type="spellEnd"/>
+                            <w:r>
+                              <w:rPr>
+                                <w:rFonts w:ascii="Microsoft Sans Serif" w:hAnsi="Microsoft Sans Serif" w:cs="Microsoft Sans Serif"/>
+                                <w:color w:val="002060"/>
+                                <w:spacing w:val="17"/>
+                                <w:w w:val="125"/>
+                                <w:sz w:val="12"/>
+                                <w:szCs w:val="12"/>
+                                <w:rtl/>
+                              </w:rPr>
+                              <w:t xml:space="preserve"> </w:t>
+                            </w:r>
+                            <w:r>
+                              <w:rPr>
+                                <w:rFonts w:ascii="Microsoft Sans Serif" w:hAnsi="Microsoft Sans Serif" w:cs="Microsoft Sans Serif"/>
+                                <w:color w:val="002060"/>
+                                <w:w w:val="125"/>
+                                <w:sz w:val="12"/>
+                                <w:szCs w:val="12"/>
+                                <w:rtl/>
+                              </w:rPr>
+                              <w:t xml:space="preserve">  </w:t>
+                            </w:r>
+                            <w:proofErr w:type="spellStart"/>
+                            <w:r>
+                              <w:rPr>
+                                <w:rFonts w:ascii="Microsoft Sans Serif" w:hAnsi="Microsoft Sans Serif" w:cs="Microsoft Sans Serif"/>
+                                <w:color w:val="002060"/>
+                                <w:w w:val="125"/>
+                                <w:sz w:val="12"/>
+                                <w:szCs w:val="12"/>
+                                <w:rtl/>
+                              </w:rPr>
+                              <w:t>ﻟﻠﻤﺆﺟ</w:t>
+                            </w:r>
+                            <w:r>
+                              <w:rPr>
+                                <w:rFonts w:ascii="Microsoft Sans Serif" w:hAnsi="Microsoft Sans Serif" w:cs="Microsoft Sans Serif"/>
+                                <w:color w:val="002060"/>
+                                <w:w w:val="125"/>
+                                <w:sz w:val="12"/>
+                                <w:szCs w:val="12"/>
+                                <w:u w:val="dotted" w:color="9D9D9D"/>
+                                <w:rtl/>
+                              </w:rPr>
+                              <w:t>ﺮ</w:t>
+                            </w:r>
+                            <w:proofErr w:type="spellEnd"/>
+                            <w:r>
+                              <w:rPr>
+                                <w:rFonts w:ascii="Microsoft Sans Serif" w:hAnsi="Microsoft Sans Serif" w:cs="Microsoft Sans Serif"/>
+                                <w:color w:val="002060"/>
+                              </w:rPr>
+                              <w:t xml:space="preserve">         </w:t>
+                            </w:r>
+                          </w:p>
+                        </w:txbxContent>
+                      </wps:txbx>
+                      <wps:bodyPr rot="0" spcFirstLastPara="0" vertOverflow="overflow" horzOverflow="overflow" vert="horz" wrap="square" lIns="91440" tIns="45720" rIns="91440" bIns="45720" numCol="1" spcCol="0" rtlCol="0" fromWordArt="0" anchor="t" anchorCtr="0" forceAA="0" compatLnSpc="1">
+                        <a:prstTxWarp prst="textNoShape">
+                          <a:avLst/>
+                        </a:prstTxWarp>
+                        <a:noAutofit/>
+                      </wps:bodyPr>
+                    </wps:wsp>
+                  </a:graphicData>
+                </a:graphic>
+                <wp14:sizeRelH relativeFrom="margin">
+                  <wp14:pctWidth>0</wp14:pctWidth>
+                </wp14:sizeRelH>
+                <wp14:sizeRelV relativeFrom="margin">
+                  <wp14:pctHeight>0</wp14:pctHeight>
+                </wp14:sizeRelV>
+              </wp:anchor>
+            </w:drawing>
+          </mc:Choice>
+          <mc:Fallback>
+            <w:pict>
+              <v:shape id="Text Box 280" style="position:absolute;margin-left:476.75pt;margin-top:1.5pt;width:87.2pt;height:15.35pt;z-index:251706368;visibility:visible;mso-wrap-style:square;mso-width-percent:0;mso-height-percent:0;mso-wrap-distance-left:9pt;mso-wrap-distance-top:0;mso-wrap-distance-right:9pt;mso-wrap-distance-bottom:0;mso-position-horizontal:absolute;mso-position-horizontal-relative:text;mso-position-vertical:absolute;mso-position-vertical-relative:text;mso-width-percent:0;mso-height-percent:0;mso-width-relative:margin;mso-height-relative:margin;v-text-anchor:top" o:spid="_x0000_s1061" fillcolor="white [3201]" stroked="f" strokeweight=".5pt" type="#_x0000_t202" o:gfxdata="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" w14:anchorId="158B3759">
+                <v:textbox>
+                  <w:txbxContent>
+                    <w:p>
+                      <w:proofErr w:type="spellStart"/>
+                      <w:r>
+                        <w:rPr>
+                          <w:rFonts w:ascii="Microsoft Sans Serif" w:hAnsi="Microsoft Sans Serif" w:cs="Microsoft Sans Serif"/>
+                          <w:b/>
+                          <w:bCs/>
+                          <w:color w:val="002060"/>
+                          <w:w w:val="125"/>
+                          <w:sz w:val="12"/>
+                          <w:szCs w:val="12"/>
+                          <w:rtl/>
+                        </w:rPr>
+                        <w:t>ا</w:t>
+                      </w:r>
+                      <w:r>
+                        <w:rPr>
+                          <w:rFonts w:ascii="Microsoft Sans Serif" w:hAnsi="Microsoft Sans Serif" w:cs="Microsoft Sans Serif"/>
+                          <w:color w:val="002060"/>
+                          <w:w w:val="125"/>
+                          <w:sz w:val="12"/>
+                          <w:szCs w:val="12"/>
+                          <w:rtl/>
+                        </w:rPr>
+                        <w:t>ﻟﺒﺮﻳﺪ</w:t>
+                      </w:r>
+                      <w:proofErr w:type="spellEnd"/>
+                      <w:r>
+                        <w:rPr>
+                          <w:rFonts w:ascii="Microsoft Sans Serif" w:hAnsi="Microsoft Sans Serif" w:cs="Microsoft Sans Serif"/>
+                          <w:color w:val="002060"/>
+                          <w:spacing w:val="15"/>
+                          <w:w w:val="125"/>
+                          <w:sz w:val="12"/>
+                          <w:szCs w:val="12"/>
+                          <w:rtl/>
+                        </w:rPr>
+                        <w:t xml:space="preserve"> </w:t>
+                      </w:r>
+                      <w:r>
+                        <w:rPr>
+                          <w:rFonts w:ascii="Microsoft Sans Serif" w:hAnsi="Microsoft Sans Serif" w:cs="Microsoft Sans Serif"/>
+                          <w:color w:val="002060"/>
+                          <w:w w:val="125"/>
+                          <w:sz w:val="12"/>
+                          <w:szCs w:val="12"/>
+                          <w:rtl/>
+                        </w:rPr>
+                        <w:t xml:space="preserve">  </w:t>
+                      </w:r>
+                      <w:proofErr w:type="spellStart"/>
+                      <w:r>
+                        <w:rPr>
+                          <w:rFonts w:ascii="Microsoft Sans Serif" w:hAnsi="Microsoft Sans Serif" w:cs="Microsoft Sans Serif"/>
+                          <w:color w:val="002060"/>
+                          <w:w w:val="125"/>
+                          <w:sz w:val="12"/>
+                          <w:szCs w:val="12"/>
+                          <w:rtl/>
+                        </w:rPr>
+                        <w:t>اﻟﻺﻟﻜﺘﺮوﻧﻲ</w:t>
+                      </w:r>
+                      <w:proofErr w:type="spellEnd"/>
+                      <w:r>
+                        <w:rPr>
+                          <w:rFonts w:ascii="Microsoft Sans Serif" w:hAnsi="Microsoft Sans Serif" w:cs="Microsoft Sans Serif"/>
+                          <w:color w:val="002060"/>
+                          <w:spacing w:val="17"/>
+                          <w:w w:val="125"/>
+                          <w:sz w:val="12"/>
+                          <w:szCs w:val="12"/>
+                          <w:rtl/>
+                        </w:rPr>
+                        <w:t xml:space="preserve"> </w:t>
+                      </w:r>
+                      <w:r>
+                        <w:rPr>
+                          <w:rFonts w:ascii="Microsoft Sans Serif" w:hAnsi="Microsoft Sans Serif" w:cs="Microsoft Sans Serif"/>
+                          <w:color w:val="002060"/>
+                          <w:w w:val="125"/>
+                          <w:sz w:val="12"/>
+                          <w:szCs w:val="12"/>
+                          <w:rtl/>
+                        </w:rPr>
+                        <w:t xml:space="preserve">  </w:t>
+                      </w:r>
+                      <w:proofErr w:type="spellStart"/>
+                      <w:r>
+                        <w:rPr>
+                          <w:rFonts w:ascii="Microsoft Sans Serif" w:hAnsi="Microsoft Sans Serif" w:cs="Microsoft Sans Serif"/>
+                          <w:color w:val="002060"/>
+                          <w:w w:val="125"/>
+                          <w:sz w:val="12"/>
+                          <w:szCs w:val="12"/>
+                          <w:rtl/>
+                        </w:rPr>
+                        <w:t>ﻟﻠﻤﺆﺟ</w:t>
+                      </w:r>
+                      <w:r>
+                        <w:rPr>
+                          <w:rFonts w:ascii="Microsoft Sans Serif" w:hAnsi="Microsoft Sans Serif" w:cs="Microsoft Sans Serif"/>
+                          <w:color w:val="002060"/>
+                          <w:w w:val="125"/>
+                          <w:sz w:val="12"/>
+                          <w:szCs w:val="12"/>
+                          <w:u w:val="dotted" w:color="9D9D9D"/>
+                          <w:rtl/>
+                        </w:rPr>
+                        <w:t>ﺮ</w:t>
+                      </w:r>
+                      <w:proofErr w:type="spellEnd"/>
+                      <w:r>
+                        <w:rPr>
+                          <w:rFonts w:ascii="Microsoft Sans Serif" w:hAnsi="Microsoft Sans Serif" w:cs="Microsoft Sans Serif"/>
+                          <w:color w:val="002060"/>
+                        </w:rPr>
+                        <w:t xml:space="preserve">         </w:t>
+                      </w:r>
+                    </w:p>
+                  </w:txbxContent>
+                </v:textbox>
+              </v:shape>
+            </w:pict>
+          </mc:Fallback>
+        </mc:AlternateContent>
+      </w:r>
     </w:p>
     <w:p>
       <w:pPr>
@@ -10579,7 +10838,7 @@
               <mc:AlternateContent>
                 <mc:Choice Requires="wps">
                   <w:drawing>
-                    <wp:anchor distT="0" distB="0" distL="114300" distR="114300" simplePos="0" relativeHeight="251738112" behindDoc="0" locked="0" layoutInCell="1" allowOverlap="1" wp14:editId="1944371B" wp14:anchorId="7B44CB9D">
+                    <wp:anchor distT="0" distB="0" distL="114300" distR="114300" simplePos="0" relativeHeight="251738112" behindDoc="0" locked="0" layoutInCell="1" allowOverlap="1" wp14:editId="2916AFBE" wp14:anchorId="0A819AA7">
                       <wp:simplePos x="0" y="0"/>
                       <wp:positionH relativeFrom="column">
                         <wp:posOffset>992505</wp:posOffset>
@@ -10637,7 +10896,7 @@
                     </wp:anchor>
                   </w:drawing>
                 </mc:Choice>
-                <mc:Fallback xmlns:pic="http://schemas.openxmlformats.org/drawingml/2006/picture" xmlns:a14="http://schemas.microsoft.com/office/drawing/2010/main" xmlns:a="http://schemas.openxmlformats.org/drawingml/2006/main">
+                <mc:Fallback xmlns:a="http://schemas.openxmlformats.org/drawingml/2006/main" xmlns:a14="http://schemas.microsoft.com/office/drawing/2010/main" xmlns:pic="http://schemas.openxmlformats.org/drawingml/2006/picture">
                   <w:pict>
                     <v:line id="Straight Connector 111" style="position:absolute;flip:y;z-index:251738112;visibility:visible;mso-wrap-style:square;mso-wrap-distance-left:9pt;mso-wrap-distance-top:0;mso-wrap-distance-right:9pt;mso-wrap-distance-bottom:0;mso-position-horizontal:absolute;mso-position-horizontal-relative:text;mso-position-vertical:absolute;mso-position-vertical-relative:text" o:spid="_x0000_s1026" strokecolor="#cfcdcd [2894]" o:gfxdata="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" from="78.15pt,11.75pt" to="467.15pt,12.25pt" w14:anchorId="3DCA32E5">
                       <v:stroke dashstyle="dash"/>
@@ -10778,7 +11037,7 @@
               <mc:AlternateContent>
                 <mc:Choice Requires="wps">
                   <w:drawing>
-                    <wp:anchor distT="0" distB="0" distL="114300" distR="114300" simplePos="0" relativeHeight="251739136" behindDoc="0" locked="0" layoutInCell="1" allowOverlap="1" wp14:editId="29410DBA" wp14:anchorId="6902BE07">
+                    <wp:anchor distT="0" distB="0" distL="114300" distR="114300" simplePos="0" relativeHeight="251739136" behindDoc="0" locked="0" layoutInCell="1" allowOverlap="1" wp14:editId="2B87E1AE" wp14:anchorId="6660D2E7">
                       <wp:simplePos x="0" y="0"/>
                       <wp:positionH relativeFrom="column">
                         <wp:posOffset>490855</wp:posOffset>
@@ -10836,7 +11095,7 @@
                     </wp:anchor>
                   </w:drawing>
                 </mc:Choice>
-                <mc:Fallback xmlns:pic="http://schemas.openxmlformats.org/drawingml/2006/picture" xmlns:a14="http://schemas.microsoft.com/office/drawing/2010/main" xmlns:a="http://schemas.openxmlformats.org/drawingml/2006/main">
+                <mc:Fallback xmlns:a="http://schemas.openxmlformats.org/drawingml/2006/main" xmlns:a14="http://schemas.microsoft.com/office/drawing/2010/main" xmlns:pic="http://schemas.openxmlformats.org/drawingml/2006/picture">
                   <w:pict>
                     <v:line id="Straight Connector 112" style="position:absolute;flip:y;z-index:251739136;visibility:visible;mso-wrap-style:square;mso-wrap-distance-left:9pt;mso-wrap-distance-top:0;mso-wrap-distance-right:9pt;mso-wrap-distance-bottom:0;mso-position-horizontal:absolute;mso-position-horizontal-relative:text;mso-position-vertical:absolute;mso-position-vertical-relative:text" o:spid="_x0000_s1026" strokecolor="#cfcdcd [2894]" o:gfxdata="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" from="38.65pt,12.3pt" to="209.15pt,12.8pt" w14:anchorId="0CDA52D7">
                       <v:stroke dashstyle="dash"/>
@@ -10968,7 +11227,7 @@
               <mc:AlternateContent>
                 <mc:Choice Requires="wps">
                   <w:drawing>
-                    <wp:anchor distT="0" distB="0" distL="114300" distR="114300" simplePos="0" relativeHeight="251740160" behindDoc="0" locked="0" layoutInCell="1" allowOverlap="1" wp14:editId="1FD6912B" wp14:anchorId="3FB863B9">
+                    <wp:anchor distT="0" distB="0" distL="114300" distR="114300" simplePos="0" relativeHeight="251740160" behindDoc="0" locked="0" layoutInCell="1" allowOverlap="1" wp14:editId="18621D9F" wp14:anchorId="16E98A0F">
                       <wp:simplePos x="0" y="0"/>
                       <wp:positionH relativeFrom="column">
                         <wp:posOffset>680720</wp:posOffset>
@@ -11032,7 +11291,7 @@
                     </wp:anchor>
                   </w:drawing>
                 </mc:Choice>
-                <mc:Fallback xmlns:pic="http://schemas.openxmlformats.org/drawingml/2006/picture" xmlns:a14="http://schemas.microsoft.com/office/drawing/2010/main" xmlns:a="http://schemas.openxmlformats.org/drawingml/2006/main">
+                <mc:Fallback xmlns:a="http://schemas.openxmlformats.org/drawingml/2006/main" xmlns:a14="http://schemas.microsoft.com/office/drawing/2010/main" xmlns:pic="http://schemas.openxmlformats.org/drawingml/2006/picture">
                   <w:pict>
                     <v:line id="Straight Connector 112" style="position:absolute;flip:y;z-index:251740160;visibility:visible;mso-wrap-style:square;mso-width-percent:0;mso-height-percent:0;mso-wrap-distance-left:9pt;mso-wrap-distance-top:0;mso-wrap-distance-right:9pt;mso-wrap-distance-bottom:0;mso-position-horizontal:absolute;mso-position-horizontal-relative:text;mso-position-vertical:absolute;mso-position-vertical-relative:text;mso-width-percent:0;mso-height-percent:0;mso-width-relative:margin;mso-height-relative:margin" o:spid="_x0000_s1026" strokecolor="#cfcdcd [2894]" o:gfxdata="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" from="53.6pt,11.8pt" to="210.1pt,12.3pt" w14:anchorId="12D3FB53">
                       <v:stroke dashstyle="dash"/>
@@ -11162,7 +11421,7 @@
               <mc:AlternateContent>
                 <mc:Choice Requires="wps">
                   <w:drawing>
-                    <wp:anchor distT="0" distB="0" distL="114300" distR="114300" simplePos="0" relativeHeight="251741184" behindDoc="0" locked="0" layoutInCell="1" allowOverlap="1" wp14:editId="604717E8" wp14:anchorId="058BD3C0">
+                    <wp:anchor distT="0" distB="0" distL="114300" distR="114300" simplePos="0" relativeHeight="251741184" behindDoc="0" locked="0" layoutInCell="1" allowOverlap="1" wp14:editId="1A04EF47" wp14:anchorId="07170AC6">
                       <wp:simplePos x="0" y="0"/>
                       <wp:positionH relativeFrom="column">
                         <wp:posOffset>890905</wp:posOffset>
@@ -11226,7 +11485,7 @@
                     </wp:anchor>
                   </w:drawing>
                 </mc:Choice>
-                <mc:Fallback xmlns:pic="http://schemas.openxmlformats.org/drawingml/2006/picture" xmlns:a14="http://schemas.microsoft.com/office/drawing/2010/main" xmlns:a="http://schemas.openxmlformats.org/drawingml/2006/main">
+                <mc:Fallback xmlns:a="http://schemas.openxmlformats.org/drawingml/2006/main" xmlns:a14="http://schemas.microsoft.com/office/drawing/2010/main" xmlns:pic="http://schemas.openxmlformats.org/drawingml/2006/picture">
                   <w:pict>
                     <v:line id="Straight Connector 112" style="position:absolute;flip:y;z-index:251741184;visibility:visible;mso-wrap-style:square;mso-width-percent:0;mso-height-percent:0;mso-wrap-distance-left:9pt;mso-wrap-distance-top:0;mso-wrap-distance-right:9pt;mso-wrap-distance-bottom:0;mso-position-horizontal:absolute;mso-position-horizontal-relative:text;mso-position-vertical:absolute;mso-position-vertical-relative:text;mso-width-percent:0;mso-height-percent:0;mso-width-relative:margin;mso-height-relative:margin" o:spid="_x0000_s1026" strokecolor="#cfcdcd [2894]" o:gfxdata="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" from="70.15pt,12.35pt" to="217.85pt,12.35pt" w14:anchorId="0EB6BF72">
                       <v:stroke dashstyle="dash"/>
@@ -11352,7 +11611,7 @@
               <mc:AlternateContent>
                 <mc:Choice Requires="wps">
                   <w:drawing>
-                    <wp:anchor distT="0" distB="0" distL="114300" distR="114300" simplePos="0" relativeHeight="251742208" behindDoc="0" locked="0" layoutInCell="1" allowOverlap="1" wp14:editId="4D35C28C" wp14:anchorId="226D1119">
+                    <wp:anchor distT="0" distB="0" distL="114300" distR="114300" simplePos="0" relativeHeight="251742208" behindDoc="0" locked="0" layoutInCell="1" allowOverlap="1" wp14:editId="4BD455FD" wp14:anchorId="4A5C23C0">
                       <wp:simplePos x="0" y="0"/>
                       <wp:positionH relativeFrom="column">
                         <wp:posOffset>770255</wp:posOffset>
@@ -11416,7 +11675,7 @@
                     </wp:anchor>
                   </w:drawing>
                 </mc:Choice>
-                <mc:Fallback xmlns:pic="http://schemas.openxmlformats.org/drawingml/2006/picture" xmlns:a14="http://schemas.microsoft.com/office/drawing/2010/main" xmlns:a="http://schemas.openxmlformats.org/drawingml/2006/main">
+                <mc:Fallback xmlns:a="http://schemas.openxmlformats.org/drawingml/2006/main" xmlns:a14="http://schemas.microsoft.com/office/drawing/2010/main" xmlns:pic="http://schemas.openxmlformats.org/drawingml/2006/picture">
                   <w:pict>
                     <v:line id="Straight Connector 112" style="position:absolute;flip:y;z-index:251742208;visibility:visible;mso-wrap-style:square;mso-width-percent:0;mso-height-percent:0;mso-wrap-distance-left:9pt;mso-wrap-distance-top:0;mso-wrap-distance-right:9pt;mso-wrap-distance-bottom:0;mso-position-horizontal:absolute;mso-position-horizontal-relative:text;mso-position-vertical:absolute;mso-position-vertical-relative:text;mso-width-percent:0;mso-height-percent:0;mso-width-relative:margin;mso-height-relative:margin" o:spid="_x0000_s1026" strokecolor="#cfcdcd [2894]" o:gfxdata="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" from="60.65pt,11.15pt" to="217.15pt,11.65pt" w14:anchorId="248B2708">
                       <v:stroke dashstyle="dash"/>
@@ -11524,7 +11783,7 @@
               <mc:AlternateContent>
                 <mc:Choice Requires="wps">
                   <w:drawing>
-                    <wp:anchor distT="0" distB="0" distL="114300" distR="114300" simplePos="0" relativeHeight="251743232" behindDoc="0" locked="0" layoutInCell="1" allowOverlap="1" wp14:editId="0CDF9218" wp14:anchorId="2275663A">
+                    <wp:anchor distT="0" distB="0" distL="114300" distR="114300" simplePos="0" relativeHeight="251743232" behindDoc="0" locked="0" layoutInCell="1" allowOverlap="1" wp14:editId="3EEFB54F" wp14:anchorId="2BF3B190">
                       <wp:simplePos x="0" y="0"/>
                       <wp:positionH relativeFrom="column">
                         <wp:posOffset>535305</wp:posOffset>
@@ -11588,7 +11847,7 @@
                     </wp:anchor>
                   </w:drawing>
                 </mc:Choice>
-                <mc:Fallback xmlns:pic="http://schemas.openxmlformats.org/drawingml/2006/picture" xmlns:a14="http://schemas.microsoft.com/office/drawing/2010/main" xmlns:a="http://schemas.openxmlformats.org/drawingml/2006/main">
+                <mc:Fallback xmlns:a="http://schemas.openxmlformats.org/drawingml/2006/main" xmlns:a14="http://schemas.microsoft.com/office/drawing/2010/main" xmlns:pic="http://schemas.openxmlformats.org/drawingml/2006/picture">
                   <w:pict>
                     <v:line id="Straight Connector 112" style="position:absolute;z-index:251743232;visibility:visible;mso-wrap-style:square;mso-width-percent:0;mso-height-percent:0;mso-wrap-distance-left:9pt;mso-wrap-distance-top:0;mso-wrap-distance-right:9pt;mso-wrap-distance-bottom:0;mso-position-horizontal:absolute;mso-position-horizontal-relative:text;mso-position-vertical:absolute;mso-position-vertical-relative:text;mso-width-percent:0;mso-height-percent:0;mso-width-relative:margin;mso-height-relative:margin" o:spid="_x0000_s1026" strokecolor="#cfcdcd [2894]" o:gfxdata="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" from="42.15pt,12.65pt" to="232.3pt,13.1pt" w14:anchorId="25236CCE">
                       <v:stroke dashstyle="dash"/>
@@ -11699,23 +11958,16 @@
                 <w:rFonts w:ascii="Microsoft Sans Serif" w:hAnsi="Microsoft Sans Serif" w:cs="Microsoft Sans Serif"/>
                 <w:color w:val="002060"/>
               </w:rPr>
-              <w:t>No.(</w:t>
+              <w:t>No.(DEWA)</w:t>
+            </w:r>
+            <w:r>
+              <w:rPr>
+                <w:rFonts w:ascii="Microsoft Sans Serif" w:hAnsi="Microsoft Sans Serif" w:cs="Microsoft Sans Serif"/>
+                <w:color w:val="002060"/>
+              </w:rPr>
+              <w:t xml:space="preserve">   </w:t>
             </w:r>
             <w:proofErr w:type="gramEnd"/>
-            <w:r>
-              <w:rPr>
-                <w:rFonts w:ascii="Microsoft Sans Serif" w:hAnsi="Microsoft Sans Serif" w:cs="Microsoft Sans Serif"/>
-                <w:color w:val="002060"/>
-              </w:rPr>
-              <w:t>DEWA)</w:t>
-            </w:r>
-            <w:r>
-              <w:rPr>
-                <w:rFonts w:ascii="Microsoft Sans Serif" w:hAnsi="Microsoft Sans Serif" w:cs="Microsoft Sans Serif"/>
-                <w:color w:val="002060"/>
-              </w:rPr>
-              <w:t xml:space="preserve">   </w:t>
-            </w:r>
             <w:sdt>
               <w:sdtPr>
                 <w:rPr>
@@ -11772,7 +12024,7 @@
               <mc:AlternateContent>
                 <mc:Choice Requires="wps">
                   <w:drawing>
-                    <wp:anchor distT="0" distB="0" distL="114300" distR="114300" simplePos="0" relativeHeight="251744256" behindDoc="0" locked="0" layoutInCell="1" allowOverlap="1" wp14:editId="7516FCC3" wp14:anchorId="77F46015">
+                    <wp:anchor distT="0" distB="0" distL="114300" distR="114300" simplePos="0" relativeHeight="251744256" behindDoc="0" locked="0" layoutInCell="1" allowOverlap="1" wp14:editId="08DF0607" wp14:anchorId="0D0B62EE">
                       <wp:simplePos x="0" y="0"/>
                       <wp:positionH relativeFrom="column">
                         <wp:posOffset>-1360707</wp:posOffset>
@@ -11836,7 +12088,7 @@
                     </wp:anchor>
                   </w:drawing>
                 </mc:Choice>
-                <mc:Fallback xmlns:pic="http://schemas.openxmlformats.org/drawingml/2006/picture" xmlns:a14="http://schemas.microsoft.com/office/drawing/2010/main" xmlns:a="http://schemas.openxmlformats.org/drawingml/2006/main">
+                <mc:Fallback xmlns:a="http://schemas.openxmlformats.org/drawingml/2006/main" xmlns:a14="http://schemas.microsoft.com/office/drawing/2010/main" xmlns:pic="http://schemas.openxmlformats.org/drawingml/2006/picture">
                   <w:pict>
                     <v:line id="Straight Connector 112" style="position:absolute;flip:y;z-index:251744256;visibility:visible;mso-wrap-style:square;mso-width-percent:0;mso-height-percent:0;mso-wrap-distance-left:9pt;mso-wrap-distance-top:0;mso-wrap-distance-right:9pt;mso-wrap-distance-bottom:0;mso-position-horizontal:absolute;mso-position-horizontal-relative:text;mso-position-vertical:absolute;mso-position-vertical-relative:text;mso-width-percent:0;mso-height-percent:0;mso-width-relative:margin;mso-height-relative:margin" o:spid="_x0000_s1026" strokecolor="#cfcdcd [2894]" o:gfxdata="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" from="-107.15pt,12.65pt" to="5.5pt,13.1pt" w14:anchorId="2F4FA472">
                       <v:stroke dashstyle="dash"/>
@@ -11909,7 +12161,7 @@
               <mc:AlternateContent>
                 <mc:Choice Requires="wps">
                   <w:drawing>
-                    <wp:anchor distT="0" distB="0" distL="114300" distR="114300" simplePos="0" relativeHeight="251745280" behindDoc="0" locked="0" layoutInCell="1" allowOverlap="1" wp14:editId="27DF1529" wp14:anchorId="0DEBBDDA">
+                    <wp:anchor distT="0" distB="0" distL="114300" distR="114300" simplePos="0" relativeHeight="251745280" behindDoc="0" locked="0" layoutInCell="1" allowOverlap="1" wp14:editId="11B72BC2" wp14:anchorId="6EF6EB8B">
                       <wp:simplePos x="0" y="0"/>
                       <wp:positionH relativeFrom="column">
                         <wp:posOffset>1127298</wp:posOffset>
@@ -11973,7 +12225,7 @@
                     </wp:anchor>
                   </w:drawing>
                 </mc:Choice>
-                <mc:Fallback xmlns:pic="http://schemas.openxmlformats.org/drawingml/2006/picture" xmlns:a14="http://schemas.microsoft.com/office/drawing/2010/main" xmlns:a="http://schemas.openxmlformats.org/drawingml/2006/main">
+                <mc:Fallback xmlns:a="http://schemas.openxmlformats.org/drawingml/2006/main" xmlns:a14="http://schemas.microsoft.com/office/drawing/2010/main" xmlns:pic="http://schemas.openxmlformats.org/drawingml/2006/picture">
                   <w:pict>
                     <v:line id="Straight Connector 112" style="position:absolute;flip:y;z-index:251745280;visibility:visible;mso-wrap-style:square;mso-width-percent:0;mso-height-percent:0;mso-wrap-distance-left:9pt;mso-wrap-distance-top:0;mso-wrap-distance-right:9pt;mso-wrap-distance-bottom:0;mso-position-horizontal:absolute;mso-position-horizontal-relative:text;mso-position-vertical:absolute;mso-position-vertical-relative:text;mso-width-percent:0;mso-height-percent:0;mso-width-relative:margin;mso-height-relative:margin" o:spid="_x0000_s1026" strokecolor="#cfcdcd [2894]" o:gfxdata="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" from="88.75pt,13.05pt" to="477.7pt,13.05pt" w14:anchorId="6C468DB9">
                       <v:stroke dashstyle="dash"/>
@@ -12164,7 +12416,7 @@
               <mc:AlternateContent>
                 <mc:Choice Requires="wps">
                   <w:drawing>
-                    <wp:anchor distT="0" distB="0" distL="114300" distR="114300" simplePos="0" relativeHeight="251746304" behindDoc="0" locked="0" layoutInCell="1" allowOverlap="1" wp14:editId="6B72033D" wp14:anchorId="343B8BE1">
+                    <wp:anchor distT="0" distB="0" distL="114300" distR="114300" simplePos="0" relativeHeight="251746304" behindDoc="0" locked="0" layoutInCell="1" allowOverlap="1" wp14:editId="683F52E0" wp14:anchorId="3B16797C">
                       <wp:simplePos x="0" y="0"/>
                       <wp:positionH relativeFrom="column">
                         <wp:posOffset>815571</wp:posOffset>
@@ -12228,7 +12480,7 @@
                     </wp:anchor>
                   </w:drawing>
                 </mc:Choice>
-                <mc:Fallback xmlns:pic="http://schemas.openxmlformats.org/drawingml/2006/picture" xmlns:a14="http://schemas.microsoft.com/office/drawing/2010/main" xmlns:a="http://schemas.openxmlformats.org/drawingml/2006/main">
+                <mc:Fallback xmlns:a="http://schemas.openxmlformats.org/drawingml/2006/main" xmlns:a14="http://schemas.microsoft.com/office/drawing/2010/main" xmlns:pic="http://schemas.openxmlformats.org/drawingml/2006/picture">
                   <w:pict>
                     <v:line id="Straight Connector 112" style="position:absolute;flip:y;z-index:251746304;visibility:visible;mso-wrap-style:square;mso-width-percent:0;mso-height-percent:0;mso-wrap-distance-left:9pt;mso-wrap-distance-top:0;mso-wrap-distance-right:9pt;mso-wrap-distance-bottom:0;mso-position-horizontal:absolute;mso-position-horizontal-relative:text;mso-position-vertical:absolute;mso-position-vertical-relative:text;mso-width-percent:0;mso-height-percent:0;mso-width-relative:margin;mso-height-relative:margin" o:spid="_x0000_s1026" strokecolor="#cfcdcd [2894]" o:gfxdata="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" from="64.2pt,13.5pt" to="484.7pt,13.5pt" w14:anchorId="3980E3B8">
                       <v:stroke dashstyle="dash"/>
@@ -12620,7 +12872,7 @@
               <mc:AlternateContent>
                 <mc:Choice Requires="wps">
                   <w:drawing>
-                    <wp:anchor distT="0" distB="0" distL="114300" distR="114300" simplePos="0" relativeHeight="251731968" behindDoc="0" locked="0" layoutInCell="1" allowOverlap="1" wp14:editId="099EBF8F" wp14:anchorId="75EC69AB">
+                    <wp:anchor distT="0" distB="0" distL="114300" distR="114300" simplePos="0" relativeHeight="251731968" behindDoc="0" locked="0" layoutInCell="1" allowOverlap="1" wp14:editId="2945ABED" wp14:anchorId="605B4A7E">
                       <wp:simplePos x="0" y="0"/>
                       <wp:positionH relativeFrom="column">
                         <wp:posOffset>989818</wp:posOffset>
@@ -12684,7 +12936,7 @@
                     </wp:anchor>
                   </w:drawing>
                 </mc:Choice>
-                <mc:Fallback xmlns:a="http://schemas.openxmlformats.org/drawingml/2006/main" xmlns:a14="http://schemas.microsoft.com/office/drawing/2010/main" xmlns:pic="http://schemas.openxmlformats.org/drawingml/2006/picture">
+                <mc:Fallback xmlns:pic="http://schemas.openxmlformats.org/drawingml/2006/picture" xmlns:a14="http://schemas.microsoft.com/office/drawing/2010/main" xmlns:a="http://schemas.openxmlformats.org/drawingml/2006/main">
                   <w:pict>
                     <v:line id="Straight Connector 112" style="position:absolute;z-index:251731968;visibility:visible;mso-wrap-style:square;mso-width-percent:0;mso-height-percent:0;mso-wrap-distance-left:9pt;mso-wrap-distance-top:0;mso-wrap-distance-right:9pt;mso-wrap-distance-bottom:0;mso-position-horizontal:absolute;mso-position-horizontal-relative:text;mso-position-vertical:absolute;mso-position-vertical-relative:text;mso-width-percent:0;mso-height-percent:0;mso-width-relative:margin;mso-height-relative:margin" o:spid="_x0000_s1026" strokecolor="#cfcdcd [2894]" o:gfxdata="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" from="77.95pt,13.4pt" to="488.25pt,13.4pt" w14:anchorId="4AE2D5AF">
                       <v:stroke dashstyle="dash"/>
@@ -12857,7 +13109,7 @@
               <mc:AlternateContent>
                 <mc:Choice Requires="wps">
                   <w:drawing>
-                    <wp:anchor distT="0" distB="0" distL="114300" distR="114300" simplePos="0" relativeHeight="251732992" behindDoc="0" locked="0" layoutInCell="1" allowOverlap="1" wp14:editId="47F0A834" wp14:anchorId="2A277CEF">
+                    <wp:anchor distT="0" distB="0" distL="114300" distR="114300" simplePos="0" relativeHeight="251732992" behindDoc="0" locked="0" layoutInCell="1" allowOverlap="1" wp14:editId="12863743" wp14:anchorId="70E16901">
                       <wp:simplePos x="0" y="0"/>
                       <wp:positionH relativeFrom="column">
                         <wp:posOffset>937065</wp:posOffset>
@@ -12921,7 +13173,7 @@
                     </wp:anchor>
                   </w:drawing>
                 </mc:Choice>
-                <mc:Fallback xmlns:a="http://schemas.openxmlformats.org/drawingml/2006/main" xmlns:a14="http://schemas.microsoft.com/office/drawing/2010/main" xmlns:pic="http://schemas.openxmlformats.org/drawingml/2006/picture">
+                <mc:Fallback xmlns:pic="http://schemas.openxmlformats.org/drawingml/2006/picture" xmlns:a14="http://schemas.microsoft.com/office/drawing/2010/main" xmlns:a="http://schemas.openxmlformats.org/drawingml/2006/main">
                   <w:pict>
                     <v:line id="Straight Connector 112" style="position:absolute;z-index:251732992;visibility:visible;mso-wrap-style:square;mso-width-percent:0;mso-height-percent:0;mso-wrap-distance-left:9pt;mso-wrap-distance-top:0;mso-wrap-distance-right:9pt;mso-wrap-distance-bottom:0;mso-position-horizontal:absolute;mso-position-horizontal-relative:text;mso-position-vertical:absolute;mso-position-vertical-relative:text;mso-width-percent:0;mso-height-percent:0;mso-width-relative:margin;mso-height-relative:margin" o:spid="_x0000_s1026" strokecolor="#cfcdcd [2894]" o:gfxdata="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" from="73.8pt,13.25pt" to="489.2pt,13.25pt" w14:anchorId="24F9418B">
                       <v:stroke dashstyle="dash"/>
@@ -13051,7 +13303,7 @@
               <mc:AlternateContent>
                 <mc:Choice Requires="wps">
                   <w:drawing>
-                    <wp:anchor distT="0" distB="0" distL="114300" distR="114300" simplePos="0" relativeHeight="251734016" behindDoc="0" locked="0" layoutInCell="1" allowOverlap="1" wp14:editId="006FA575" wp14:anchorId="7671A263">
+                    <wp:anchor distT="0" distB="0" distL="114300" distR="114300" simplePos="0" relativeHeight="251734016" behindDoc="0" locked="0" layoutInCell="1" allowOverlap="1" wp14:editId="00B4D65B" wp14:anchorId="4202CE65">
                       <wp:simplePos x="0" y="0"/>
                       <wp:positionH relativeFrom="column">
                         <wp:posOffset>749495</wp:posOffset>
@@ -13115,7 +13367,7 @@
                     </wp:anchor>
                   </w:drawing>
                 </mc:Choice>
-                <mc:Fallback xmlns:a="http://schemas.openxmlformats.org/drawingml/2006/main" xmlns:a14="http://schemas.microsoft.com/office/drawing/2010/main" xmlns:pic="http://schemas.openxmlformats.org/drawingml/2006/picture">
+                <mc:Fallback xmlns:pic="http://schemas.openxmlformats.org/drawingml/2006/picture" xmlns:a14="http://schemas.microsoft.com/office/drawing/2010/main" xmlns:a="http://schemas.openxmlformats.org/drawingml/2006/main">
                   <w:pict>
                     <v:line id="Straight Connector 112" style="position:absolute;z-index:251734016;visibility:visible;mso-wrap-style:square;mso-width-percent:0;mso-height-percent:0;mso-wrap-distance-left:9pt;mso-wrap-distance-top:0;mso-wrap-distance-right:9pt;mso-wrap-distance-bottom:0;mso-position-horizontal:absolute;mso-position-horizontal-relative:text;mso-position-vertical:absolute;mso-position-vertical-relative:text;mso-width-percent:0;mso-height-percent:0;mso-width-relative:margin;mso-height-relative:margin" o:spid="_x0000_s1026" strokecolor="#cfcdcd [2894]" o:gfxdata="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" from="59pt,14pt" to="470.25pt,14.45pt" w14:anchorId="1CA785F9">
                       <v:stroke dashstyle="dash"/>
@@ -13144,14 +13396,14 @@
                   <w:rFonts w:ascii="Microsoft Sans Serif" w:hAnsi="Microsoft Sans Serif" w:cs="Microsoft Sans Serif"/>
                   <w:color w:val="000000" w:themeColor="text1"/>
                 </w:rPr>
-                <w:alias w:val="#Nav: /TenancyContract/AnnualRentAmount"/>
+                <w:id w:val="-1959249618"/>
+                <w:placeholder>
+                  <w:docPart w:val="DefaultPlaceholder_-1854013440"/>
+                </w:placeholder>
+                <w:dataBinding w:prefixMappings="xmlns:ns0='urn:microsoft-dynamics-nav/reports/Tenancy_Contract/50101/' " w:xpath="/ns0:NavWordReportXmlPart[1]/ns0:TenancyContract[1]/ns0:Annual_Rent_Amount[1]" w:storeItemID="{B8787D49-5AAC-4AAC-A9D8-A7D9793FE4D0}"/>
+                <w:text/>
+                <w:alias w:val="#Nav: /TenancyContract/Annual_Rent_Amount"/>
                 <w:tag w:val="#Nav: Tenancy_Contract/50101"/>
-                <w:id w:val="173089441"/>
-                <w:placeholder>
-                  <w:docPart w:val="CBEE3E49B10843E4A8C88B041E8F8857"/>
-                </w:placeholder>
-                <w:dataBinding w:prefixMappings="xmlns:ns0='urn:microsoft-dynamics-nav/reports/Tenancy_Contract/50101/'" w:xpath="/ns0:NavWordReportXmlPart[1]/ns0:TenancyContract[1]/ns0:AnnualRentAmount[1]" w:storeItemID="{B8787D49-5AAC-4AAC-A9D8-A7D9793FE4D0}"/>
-                <w:text/>
               </w:sdtPr>
               <w:sdtContent>
                 <w:proofErr w:type="spellStart"/>
@@ -13160,7 +13412,7 @@
                     <w:rFonts w:ascii="Microsoft Sans Serif" w:hAnsi="Microsoft Sans Serif" w:cs="Microsoft Sans Serif"/>
                     <w:color w:val="000000" w:themeColor="text1"/>
                   </w:rPr>
-                  <w:t>AnnualRentAmount</w:t>
+                  <w:t>Annual_Rent_Amount</w:t>
                 </w:r>
                 <w:proofErr w:type="spellEnd"/>
               </w:sdtContent>
@@ -13246,7 +13498,7 @@
               <mc:AlternateContent>
                 <mc:Choice Requires="wps">
                   <w:drawing>
-                    <wp:anchor distT="0" distB="0" distL="114300" distR="114300" simplePos="0" relativeHeight="251735040" behindDoc="0" locked="0" layoutInCell="1" allowOverlap="1" wp14:editId="50557745" wp14:anchorId="562B25C9">
+                    <wp:anchor distT="0" distB="0" distL="114300" distR="114300" simplePos="0" relativeHeight="251735040" behindDoc="0" locked="0" layoutInCell="1" allowOverlap="1" wp14:editId="16BB5A15" wp14:anchorId="3490167C">
                       <wp:simplePos x="0" y="0"/>
                       <wp:positionH relativeFrom="column">
                         <wp:posOffset>1523218</wp:posOffset>
@@ -13310,7 +13562,7 @@
                     </wp:anchor>
                   </w:drawing>
                 </mc:Choice>
-                <mc:Fallback xmlns:a="http://schemas.openxmlformats.org/drawingml/2006/main" xmlns:a14="http://schemas.microsoft.com/office/drawing/2010/main" xmlns:pic="http://schemas.openxmlformats.org/drawingml/2006/picture">
+                <mc:Fallback xmlns:pic="http://schemas.openxmlformats.org/drawingml/2006/picture" xmlns:a14="http://schemas.microsoft.com/office/drawing/2010/main" xmlns:a="http://schemas.openxmlformats.org/drawingml/2006/main">
                   <w:pict>
                     <v:line id="Straight Connector 112" style="position:absolute;z-index:251735040;visibility:visible;mso-wrap-style:square;mso-width-percent:0;mso-height-percent:0;mso-wrap-distance-left:9pt;mso-wrap-distance-top:0;mso-wrap-distance-right:9pt;mso-wrap-distance-bottom:0;mso-position-horizontal:absolute;mso-position-horizontal-relative:text;mso-position-vertical:absolute;mso-position-vertical-relative:text;mso-width-percent:0;mso-height-percent:0;mso-width-relative:margin;mso-height-relative:margin" o:spid="_x0000_s1026" strokecolor="#cfcdcd [2894]" o:gfxdata="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" from="119.95pt,13.85pt" to="457.75pt,14.75pt" w14:anchorId="6C723C8E">
                       <v:stroke dashstyle="dash"/>
@@ -13460,7 +13712,7 @@
               <mc:AlternateContent>
                 <mc:Choice Requires="wps">
                   <w:drawing>
-                    <wp:anchor distT="0" distB="0" distL="114300" distR="114300" simplePos="0" relativeHeight="251736064" behindDoc="0" locked="0" layoutInCell="1" allowOverlap="1" wp14:editId="5C23ED40" wp14:anchorId="79CD82E8">
+                    <wp:anchor distT="0" distB="0" distL="114300" distR="114300" simplePos="0" relativeHeight="251736064" behindDoc="0" locked="0" layoutInCell="1" allowOverlap="1" wp14:editId="1D6D0BB3" wp14:anchorId="2C7B9E1A">
                       <wp:simplePos x="0" y="0"/>
                       <wp:positionH relativeFrom="column">
                         <wp:posOffset>1089465</wp:posOffset>
@@ -13524,7 +13776,7 @@
                     </wp:anchor>
                   </w:drawing>
                 </mc:Choice>
-                <mc:Fallback xmlns:a="http://schemas.openxmlformats.org/drawingml/2006/main" xmlns:a14="http://schemas.microsoft.com/office/drawing/2010/main" xmlns:pic="http://schemas.openxmlformats.org/drawingml/2006/picture">
+                <mc:Fallback xmlns:pic="http://schemas.openxmlformats.org/drawingml/2006/picture" xmlns:a14="http://schemas.microsoft.com/office/drawing/2010/main" xmlns:a="http://schemas.openxmlformats.org/drawingml/2006/main">
                   <w:pict>
                     <v:line id="Straight Connector 112" style="position:absolute;z-index:251736064;visibility:visible;mso-wrap-style:square;mso-width-percent:0;mso-height-percent:0;mso-wrap-distance-left:9pt;mso-wrap-distance-top:0;mso-wrap-distance-right:9pt;mso-wrap-distance-bottom:0;mso-position-horizontal:absolute;mso-position-horizontal-relative:text;mso-position-vertical:absolute;mso-position-vertical-relative:text;mso-width-percent:0;mso-height-percent:0;mso-width-relative:margin;mso-height-relative:margin" o:spid="_x0000_s1026" strokecolor="#cfcdcd [2894]" o:gfxdata="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" from="85.8pt,13.7pt" to="462.4pt,14.15pt" w14:anchorId="178CA45B">
                       <v:stroke dashstyle="dash"/>
@@ -13805,7 +14057,7 @@
         <mc:AlternateContent>
           <mc:Choice Requires="wps">
             <w:drawing>
-              <wp:inline distT="0" distB="0" distL="0" distR="0" wp14:anchorId="6B43E075" wp14:editId="2606D30E">
+              <wp:inline distT="0" distB="0" distL="0" distR="0" wp14:anchorId="7B668F5A" wp14:editId="28967688">
                 <wp:extent cx="6845300" cy="274320"/>
                 <wp:effectExtent l="3175" t="0" r="0" b="0"/>
                 <wp:docPr id="419425808" name="Text Box 419425808"/>
@@ -13904,7 +14156,7 @@
           </mc:Choice>
           <mc:Fallback>
             <w:pict>
-              <v:shape id="Text Box 419425808" style="width:539pt;height:21.6pt;visibility:visible;mso-wrap-style:square;mso-left-percent:-10001;mso-top-percent:-10001;mso-position-horizontal:absolute;mso-position-horizontal-relative:char;mso-position-vertical:absolute;mso-position-vertical-relative:line;mso-left-percent:-10001;mso-top-percent:-10001;v-text-anchor:top" o:spid="_x0000_s1062" fillcolor="#252b4f" stroked="f" type="#_x0000_t202" o:gfxdata="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" w14:anchorId="6B43E075">
+              <v:shape id="Text Box 419425808" style="width:539pt;height:21.6pt;visibility:visible;mso-wrap-style:square;mso-left-percent:-10001;mso-top-percent:-10001;mso-position-horizontal:absolute;mso-position-horizontal-relative:char;mso-position-vertical:absolute;mso-position-vertical-relative:line;mso-left-percent:-10001;mso-top-percent:-10001;v-text-anchor:top" o:spid="_x0000_s1062" fillcolor="#252b4f" stroked="f" type="#_x0000_t202" o:gfxdata="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" w14:anchorId="7B668F5A">
                 <v:textbox inset="0,0,0,0">
                   <w:txbxContent>
                     <w:p>
@@ -13994,7 +14246,7 @@
         <mc:AlternateContent>
           <mc:Choice Requires="wps">
             <w:drawing>
-              <wp:inline distT="0" distB="0" distL="0" distR="0" wp14:anchorId="6EDB7EF3" wp14:editId="75A21953">
+              <wp:inline distT="0" distB="0" distL="0" distR="0" wp14:anchorId="2F4E00D2" wp14:editId="5E8241B8">
                 <wp:extent cx="3374390" cy="897890"/>
                 <wp:effectExtent l="12700" t="13970" r="13335" b="12065"/>
                 <wp:docPr id="719887593" name="Text Box 719887593"/>
@@ -14214,7 +14466,7 @@
           </mc:Choice>
           <mc:Fallback>
             <w:pict>
-              <v:shape id="Text Box 719887593" style="width:265.7pt;height:70.7pt;visibility:visible;mso-wrap-style:square;mso-left-percent:-10001;mso-top-percent:-10001;mso-position-horizontal:absolute;mso-position-horizontal-relative:char;mso-position-vertical:absolute;mso-position-vertical-relative:line;mso-left-percent:-10001;mso-top-percent:-10001;v-text-anchor:top" o:spid="_x0000_s1063" filled="f" strokecolor="#e1e1e1" strokeweight=".3pt" type="#_x0000_t202" o:gfxdata="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" w14:anchorId="6EDB7EF3">
+              <v:shape id="Text Box 719887593" style="width:265.7pt;height:70.7pt;visibility:visible;mso-wrap-style:square;mso-left-percent:-10001;mso-top-percent:-10001;mso-position-horizontal:absolute;mso-position-horizontal-relative:char;mso-position-vertical:absolute;mso-position-vertical-relative:line;mso-left-percent:-10001;mso-top-percent:-10001;v-text-anchor:top" o:spid="_x0000_s1063" filled="f" strokecolor="#e1e1e1" strokeweight=".3pt" type="#_x0000_t202" o:gfxdata="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" w14:anchorId="2F4E00D2">
                 <v:textbox inset="0,0,0,0">
                   <w:txbxContent>
                     <w:p>
@@ -14407,7 +14659,7 @@
         <mc:AlternateContent>
           <mc:Choice Requires="wps">
             <w:drawing>
-              <wp:inline distT="0" distB="0" distL="0" distR="0" wp14:anchorId="66B27877" wp14:editId="67C45C0C">
+              <wp:inline distT="0" distB="0" distL="0" distR="0" wp14:anchorId="462009FC" wp14:editId="562BCFBA">
                 <wp:extent cx="3374390" cy="897890"/>
                 <wp:effectExtent l="11430" t="13970" r="5080" b="12065"/>
                 <wp:docPr id="1135058509" name="Text Box 1135058509"/>
@@ -14622,7 +14874,7 @@
           </mc:Choice>
           <mc:Fallback>
             <w:pict>
-              <v:shape id="Text Box 1135058509" style="width:265.7pt;height:70.7pt;visibility:visible;mso-wrap-style:square;mso-left-percent:-10001;mso-top-percent:-10001;mso-position-horizontal:absolute;mso-position-horizontal-relative:char;mso-position-vertical:absolute;mso-position-vertical-relative:line;mso-left-percent:-10001;mso-top-percent:-10001;v-text-anchor:top" o:spid="_x0000_s1064" filled="f" strokecolor="#e1e1e1" strokeweight=".3pt" type="#_x0000_t202" o:gfxdata="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" w14:anchorId="66B27877">
+              <v:shape id="Text Box 1135058509" style="width:265.7pt;height:70.7pt;visibility:visible;mso-wrap-style:square;mso-left-percent:-10001;mso-top-percent:-10001;mso-position-horizontal:absolute;mso-position-horizontal-relative:char;mso-position-vertical:absolute;mso-position-vertical-relative:line;mso-left-percent:-10001;mso-top-percent:-10001;v-text-anchor:top" o:spid="_x0000_s1064" filled="f" strokecolor="#e1e1e1" strokeweight=".3pt" type="#_x0000_t202" o:gfxdata="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" w14:anchorId="462009FC">
                 <v:textbox inset="0,0,0,0">
                   <w:txbxContent>
                     <w:p>
@@ -14840,7 +15092,7 @@
         <mc:AlternateContent>
           <mc:Choice Requires="wps">
             <w:drawing>
-              <wp:inline distT="0" distB="0" distL="0" distR="0" wp14:anchorId="730C2AFF" wp14:editId="34DA7565">
+              <wp:inline distT="0" distB="0" distL="0" distR="0" wp14:anchorId="69CD01D6" wp14:editId="78CC64D3">
                 <wp:extent cx="6845300" cy="274320"/>
                 <wp:effectExtent l="3175" t="0" r="0" b="1905"/>
                 <wp:docPr id="92" name="Text Box 92"/>
@@ -15037,7 +15289,7 @@
           </mc:Choice>
           <mc:Fallback>
             <w:pict>
-              <v:shape id="Text Box 92" style="width:539pt;height:21.6pt;visibility:visible;mso-wrap-style:square;mso-left-percent:-10001;mso-top-percent:-10001;mso-position-horizontal:absolute;mso-position-horizontal-relative:char;mso-position-vertical:absolute;mso-position-vertical-relative:line;mso-left-percent:-10001;mso-top-percent:-10001;v-text-anchor:top" o:spid="_x0000_s1065" fillcolor="#252b4f" stroked="f" type="#_x0000_t202" o:gfxdata="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" w14:anchorId="730C2AFF">
+              <v:shape id="Text Box 92" style="width:539pt;height:21.6pt;visibility:visible;mso-wrap-style:square;mso-left-percent:-10001;mso-top-percent:-10001;mso-position-horizontal:absolute;mso-position-horizontal-relative:char;mso-position-vertical:absolute;mso-position-vertical-relative:line;mso-left-percent:-10001;mso-top-percent:-10001;v-text-anchor:top" o:spid="_x0000_s1065" fillcolor="#252b4f" stroked="f" type="#_x0000_t202" o:gfxdata="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" w14:anchorId="69CD01D6">
                 <v:textbox inset="0,0,0,0">
                   <w:txbxContent>
                     <w:p>
@@ -22860,7 +23112,7 @@
         <mc:AlternateContent>
           <mc:Choice Requires="wps">
             <w:drawing>
-              <wp:anchor distT="0" distB="0" distL="114300" distR="114300" simplePos="0" relativeHeight="251662336" behindDoc="1" locked="0" layoutInCell="1" allowOverlap="1" wp14:editId="2B590196" wp14:anchorId="3BD667CD">
+              <wp:anchor distT="0" distB="0" distL="114300" distR="114300" simplePos="0" relativeHeight="251662336" behindDoc="1" locked="0" layoutInCell="1" allowOverlap="1" wp14:editId="75AC7BB7" wp14:anchorId="5444FD0B">
                 <wp:simplePos x="0" y="0"/>
                 <wp:positionH relativeFrom="page">
                   <wp:posOffset>3384550</wp:posOffset>
@@ -22923,7 +23175,7 @@
               </wp:anchor>
             </w:drawing>
           </mc:Choice>
-          <mc:Fallback xmlns:pic="http://schemas.openxmlformats.org/drawingml/2006/picture" xmlns:a14="http://schemas.microsoft.com/office/drawing/2010/main" xmlns:a="http://schemas.openxmlformats.org/drawingml/2006/main">
+          <mc:Fallback xmlns:a="http://schemas.openxmlformats.org/drawingml/2006/main" xmlns:a14="http://schemas.microsoft.com/office/drawing/2010/main" xmlns:pic="http://schemas.openxmlformats.org/drawingml/2006/picture">
             <w:pict>
               <v:rect id="Rectangle 75" style="position:absolute;margin-left:266.5pt;margin-top:804.05pt;width:1pt;height:.2pt;z-index:-251654144;visibility:visible;mso-wrap-style:square;mso-width-percent:0;mso-height-percent:0;mso-wrap-distance-left:9pt;mso-wrap-distance-top:0;mso-wrap-distance-right:9pt;mso-wrap-distance-bottom:0;mso-position-horizontal:absolute;mso-position-horizontal-relative:page;mso-position-vertical:absolute;mso-position-vertical-relative:page;mso-width-percent:0;mso-height-percent:0;mso-width-relative:page;mso-height-relative:page;v-text-anchor:top" o:spid="_x0000_s1026" fillcolor="#9d9d9d" stroked="f" o:gfxdata="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" w14:anchorId="46C3A97C">
                 <w10:wrap anchorx="page" anchory="page"/>
@@ -22940,7 +23192,7 @@
         <mc:AlternateContent>
           <mc:Choice Requires="wps">
             <w:drawing>
-              <wp:anchor distT="0" distB="0" distL="114300" distR="114300" simplePos="0" relativeHeight="251663360" behindDoc="1" locked="0" layoutInCell="1" allowOverlap="1" wp14:editId="2E151475" wp14:anchorId="109E905E">
+              <wp:anchor distT="0" distB="0" distL="114300" distR="114300" simplePos="0" relativeHeight="251663360" behindDoc="1" locked="0" layoutInCell="1" allowOverlap="1" wp14:editId="7693177E" wp14:anchorId="75130AD2">
                 <wp:simplePos x="0" y="0"/>
                 <wp:positionH relativeFrom="page">
                   <wp:posOffset>2520950</wp:posOffset>
@@ -23003,7 +23255,7 @@
               </wp:anchor>
             </w:drawing>
           </mc:Choice>
-          <mc:Fallback xmlns:pic="http://schemas.openxmlformats.org/drawingml/2006/picture" xmlns:a14="http://schemas.microsoft.com/office/drawing/2010/main" xmlns:a="http://schemas.openxmlformats.org/drawingml/2006/main">
+          <mc:Fallback xmlns:a="http://schemas.openxmlformats.org/drawingml/2006/main" xmlns:a14="http://schemas.microsoft.com/office/drawing/2010/main" xmlns:pic="http://schemas.openxmlformats.org/drawingml/2006/picture">
             <w:pict>
               <v:rect id="Rectangle 74" style="position:absolute;margin-left:198.5pt;margin-top:804.05pt;width:2pt;height:.2pt;z-index:-251653120;visibility:visible;mso-wrap-style:square;mso-width-percent:0;mso-height-percent:0;mso-wrap-distance-left:9pt;mso-wrap-distance-top:0;mso-wrap-distance-right:9pt;mso-wrap-distance-bottom:0;mso-position-horizontal:absolute;mso-position-horizontal-relative:page;mso-position-vertical:absolute;mso-position-vertical-relative:page;mso-width-percent:0;mso-height-percent:0;mso-width-relative:page;mso-height-relative:page;v-text-anchor:top" o:spid="_x0000_s1026" fillcolor="#9d9d9d" stroked="f" o:gfxdata="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" w14:anchorId="0F2E15EB">
                 <w10:wrap anchorx="page" anchory="page"/>
@@ -23020,7 +23272,7 @@
         <mc:AlternateContent>
           <mc:Choice Requires="wps">
             <w:drawing>
-              <wp:anchor distT="0" distB="0" distL="114300" distR="114300" simplePos="0" relativeHeight="251664384" behindDoc="1" locked="0" layoutInCell="1" allowOverlap="1" wp14:editId="1DB6410C" wp14:anchorId="79BE89B8">
+              <wp:anchor distT="0" distB="0" distL="114300" distR="114300" simplePos="0" relativeHeight="251664384" behindDoc="1" locked="0" layoutInCell="1" allowOverlap="1" wp14:editId="08E7B420" wp14:anchorId="03F92AB2">
                 <wp:simplePos x="0" y="0"/>
                 <wp:positionH relativeFrom="page">
                   <wp:posOffset>6851650</wp:posOffset>
@@ -23083,7 +23335,7 @@
               </wp:anchor>
             </w:drawing>
           </mc:Choice>
-          <mc:Fallback xmlns:pic="http://schemas.openxmlformats.org/drawingml/2006/picture" xmlns:a14="http://schemas.microsoft.com/office/drawing/2010/main" xmlns:a="http://schemas.openxmlformats.org/drawingml/2006/main">
+          <mc:Fallback xmlns:a="http://schemas.openxmlformats.org/drawingml/2006/main" xmlns:a14="http://schemas.microsoft.com/office/drawing/2010/main" xmlns:pic="http://schemas.openxmlformats.org/drawingml/2006/picture">
             <w:pict>
               <v:rect id="Rectangle 73" style="position:absolute;margin-left:539.5pt;margin-top:804.05pt;width:1pt;height:.2pt;z-index:-251652096;visibility:visible;mso-wrap-style:square;mso-width-percent:0;mso-height-percent:0;mso-wrap-distance-left:9pt;mso-wrap-distance-top:0;mso-wrap-distance-right:9pt;mso-wrap-distance-bottom:0;mso-position-horizontal:absolute;mso-position-horizontal-relative:page;mso-position-vertical:absolute;mso-position-vertical-relative:page;mso-width-percent:0;mso-height-percent:0;mso-width-relative:page;mso-height-relative:page;v-text-anchor:top" o:spid="_x0000_s1026" fillcolor="#9d9d9d" stroked="f" o:gfxdata="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" w14:anchorId="5650B171">
                 <w10:wrap anchorx="page" anchory="page"/>
@@ -23100,7 +23352,7 @@
         <mc:AlternateContent>
           <mc:Choice Requires="wps">
             <w:drawing>
-              <wp:anchor distT="0" distB="0" distL="114300" distR="114300" simplePos="0" relativeHeight="251665408" behindDoc="1" locked="0" layoutInCell="1" allowOverlap="1" wp14:editId="77838DDC" wp14:anchorId="73EA1DBB">
+              <wp:anchor distT="0" distB="0" distL="114300" distR="114300" simplePos="0" relativeHeight="251665408" behindDoc="1" locked="0" layoutInCell="1" allowOverlap="1" wp14:editId="6546B4E6" wp14:anchorId="3BF5F1B6">
                 <wp:simplePos x="0" y="0"/>
                 <wp:positionH relativeFrom="page">
                   <wp:posOffset>5988050</wp:posOffset>
@@ -23163,7 +23415,7 @@
               </wp:anchor>
             </w:drawing>
           </mc:Choice>
-          <mc:Fallback xmlns:pic="http://schemas.openxmlformats.org/drawingml/2006/picture" xmlns:a14="http://schemas.microsoft.com/office/drawing/2010/main" xmlns:a="http://schemas.openxmlformats.org/drawingml/2006/main">
+          <mc:Fallback xmlns:a="http://schemas.openxmlformats.org/drawingml/2006/main" xmlns:a14="http://schemas.microsoft.com/office/drawing/2010/main" xmlns:pic="http://schemas.openxmlformats.org/drawingml/2006/picture">
             <w:pict>
               <v:rect id="Rectangle 72" style="position:absolute;margin-left:471.5pt;margin-top:804.05pt;width:2pt;height:.2pt;z-index:-251651072;visibility:visible;mso-wrap-style:square;mso-width-percent:0;mso-height-percent:0;mso-wrap-distance-left:9pt;mso-wrap-distance-top:0;mso-wrap-distance-right:9pt;mso-wrap-distance-bottom:0;mso-position-horizontal:absolute;mso-position-horizontal-relative:page;mso-position-vertical:absolute;mso-position-vertical-relative:page;mso-width-percent:0;mso-height-percent:0;mso-width-relative:page;mso-height-relative:page;v-text-anchor:top" o:spid="_x0000_s1026" fillcolor="#9d9d9d" stroked="f" o:gfxdata="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" w14:anchorId="7751343D">
                 <w10:wrap anchorx="page" anchory="page"/>
@@ -23192,7 +23444,7 @@
         <mc:AlternateContent>
           <mc:Choice Requires="wps">
             <w:drawing>
-              <wp:inline distT="0" distB="0" distL="0" distR="0" wp14:anchorId="0CE625BD" wp14:editId="74427E07">
+              <wp:inline distT="0" distB="0" distL="0" distR="0" wp14:anchorId="6496B6F7" wp14:editId="04F612A7">
                 <wp:extent cx="6845300" cy="274320"/>
                 <wp:effectExtent l="3175" t="0" r="0" b="0"/>
                 <wp:docPr id="71" name="Text Box 71"/>
@@ -23291,7 +23543,7 @@
           </mc:Choice>
           <mc:Fallback>
             <w:pict>
-              <v:shape id="Text Box 71" style="width:539pt;height:21.6pt;visibility:visible;mso-wrap-style:square;mso-left-percent:-10001;mso-top-percent:-10001;mso-position-horizontal:absolute;mso-position-horizontal-relative:char;mso-position-vertical:absolute;mso-position-vertical-relative:line;mso-left-percent:-10001;mso-top-percent:-10001;v-text-anchor:top" o:spid="_x0000_s1066" fillcolor="#252b4f" stroked="f" type="#_x0000_t202" o:gfxdata="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" w14:anchorId="0CE625BD">
+              <v:shape id="Text Box 71" style="width:539pt;height:21.6pt;visibility:visible;mso-wrap-style:square;mso-left-percent:-10001;mso-top-percent:-10001;mso-position-horizontal:absolute;mso-position-horizontal-relative:char;mso-position-vertical:absolute;mso-position-vertical-relative:line;mso-left-percent:-10001;mso-top-percent:-10001;v-text-anchor:top" o:spid="_x0000_s1066" fillcolor="#252b4f" stroked="f" type="#_x0000_t202" o:gfxdata="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" w14:anchorId="6496B6F7">
                 <v:textbox inset="0,0,0,0">
                   <w:txbxContent>
                     <w:p>
@@ -23375,7 +23627,7 @@
         <mc:AlternateContent>
           <mc:Choice Requires="wps">
             <w:drawing>
-              <wp:inline distT="0" distB="0" distL="0" distR="0" wp14:anchorId="35E9BF7D" wp14:editId="6363FC71">
+              <wp:inline distT="0" distB="0" distL="0" distR="0" wp14:anchorId="6F3639E0" wp14:editId="0E5742D6">
                 <wp:extent cx="3374390" cy="897890"/>
                 <wp:effectExtent l="12700" t="13970" r="13335" b="12065"/>
                 <wp:docPr id="70" name="Text Box 70"/>
@@ -23595,7 +23847,7 @@
           </mc:Choice>
           <mc:Fallback>
             <w:pict>
-              <v:shape id="Text Box 70" style="width:265.7pt;height:70.7pt;visibility:visible;mso-wrap-style:square;mso-left-percent:-10001;mso-top-percent:-10001;mso-position-horizontal:absolute;mso-position-horizontal-relative:char;mso-position-vertical:absolute;mso-position-vertical-relative:line;mso-left-percent:-10001;mso-top-percent:-10001;v-text-anchor:top" o:spid="_x0000_s1067" filled="f" strokecolor="#e1e1e1" strokeweight=".3pt" type="#_x0000_t202" o:gfxdata="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" w14:anchorId="35E9BF7D">
+              <v:shape id="Text Box 70" style="width:265.7pt;height:70.7pt;visibility:visible;mso-wrap-style:square;mso-left-percent:-10001;mso-top-percent:-10001;mso-position-horizontal:absolute;mso-position-horizontal-relative:char;mso-position-vertical:absolute;mso-position-vertical-relative:line;mso-left-percent:-10001;mso-top-percent:-10001;v-text-anchor:top" o:spid="_x0000_s1067" filled="f" strokecolor="#e1e1e1" strokeweight=".3pt" type="#_x0000_t202" o:gfxdata="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" w14:anchorId="6F3639E0">
                 <v:textbox inset="0,0,0,0">
                   <w:txbxContent>
                     <w:p>
@@ -23788,7 +24040,7 @@
         <mc:AlternateContent>
           <mc:Choice Requires="wps">
             <w:drawing>
-              <wp:inline distT="0" distB="0" distL="0" distR="0" wp14:anchorId="0DD879AF" wp14:editId="44C0E100">
+              <wp:inline distT="0" distB="0" distL="0" distR="0" wp14:anchorId="44ABB3FB" wp14:editId="0A246C6B">
                 <wp:extent cx="3374390" cy="897890"/>
                 <wp:effectExtent l="11430" t="13970" r="5080" b="12065"/>
                 <wp:docPr id="69" name="Text Box 69"/>
@@ -24003,7 +24255,7 @@
           </mc:Choice>
           <mc:Fallback>
             <w:pict>
-              <v:shape id="Text Box 69" style="width:265.7pt;height:70.7pt;visibility:visible;mso-wrap-style:square;mso-left-percent:-10001;mso-top-percent:-10001;mso-position-horizontal:absolute;mso-position-horizontal-relative:char;mso-position-vertical:absolute;mso-position-vertical-relative:line;mso-left-percent:-10001;mso-top-percent:-10001;v-text-anchor:top" o:spid="_x0000_s1068" filled="f" strokecolor="#e1e1e1" strokeweight=".3pt" type="#_x0000_t202" o:gfxdata="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" w14:anchorId="0DD879AF">
+              <v:shape id="Text Box 69" style="width:265.7pt;height:70.7pt;visibility:visible;mso-wrap-style:square;mso-left-percent:-10001;mso-top-percent:-10001;mso-position-horizontal:absolute;mso-position-horizontal-relative:char;mso-position-vertical:absolute;mso-position-vertical-relative:line;mso-left-percent:-10001;mso-top-percent:-10001;v-text-anchor:top" o:spid="_x0000_s1068" filled="f" strokecolor="#e1e1e1" strokeweight=".3pt" type="#_x0000_t202" o:gfxdata="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" w14:anchorId="44ABB3FB">
                 <v:textbox inset="0,0,0,0">
                   <w:txbxContent>
                     <w:p>
@@ -24206,7 +24458,7 @@
         <mc:AlternateContent>
           <mc:Choice Requires="wpg">
             <w:drawing>
-              <wp:anchor distT="0" distB="0" distL="114300" distR="114300" simplePos="0" relativeHeight="251670528" behindDoc="1" locked="0" layoutInCell="1" allowOverlap="1" wp14:editId="1902D79D" wp14:anchorId="3684A035">
+              <wp:anchor distT="0" distB="0" distL="114300" distR="114300" simplePos="0" relativeHeight="251670528" behindDoc="1" locked="0" layoutInCell="1" allowOverlap="1" wp14:editId="275CB948" wp14:anchorId="325FFC3F">
                 <wp:simplePos x="0" y="0"/>
                 <wp:positionH relativeFrom="page">
                   <wp:posOffset>353291</wp:posOffset>
@@ -24480,7 +24732,7 @@
           </mc:Choice>
           <mc:Fallback>
             <w:pict>
-              <v:group id="Group 64" style="position:absolute;margin-left:27.8pt;margin-top:7.55pt;width:538.4pt;height:23.45pt;z-index:-251645952;mso-position-horizontal-relative:page;mso-position-vertical-relative:text" coordsize="10768,388" coordorigin="563,-520" o:spid="_x0000_s1069" o:gfxdata="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" w14:anchorId="3684A035">
+              <v:group id="Group 64" style="position:absolute;margin-left:27.8pt;margin-top:7.55pt;width:538.4pt;height:23.45pt;z-index:-251645952;mso-position-horizontal-relative:page;mso-position-vertical-relative:text" coordsize="10768,388" coordorigin="563,-520" o:spid="_x0000_s1069" o:gfxdata="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" w14:anchorId="325FFC3F">
                 <v:rect id="Rectangle 114" style="position:absolute;left:563;top:-520;width:10768;height:388;visibility:visible;mso-wrap-style:square;v-text-anchor:top" o:spid="_x0000_s1070" fillcolor="#002060" strokecolor="#e1e1e1" strokeweight=".3pt" o:gfxdata="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"/>
                 <v:shape id="Text Box 116" style="position:absolute;left:9246;top:-474;width:1974;height:342;visibility:visible;mso-wrap-style:square;v-text-anchor:top" o:spid="_x0000_s1071" filled="f" stroked="f" type="#_x0000_t202" o:gfxdata="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">
                   <v:textbox inset="0,0,0,0">
@@ -26071,7 +26323,7 @@
         <mc:AlternateContent>
           <mc:Choice Requires="wpg">
             <w:drawing>
-              <wp:anchor distT="0" distB="0" distL="0" distR="0" simplePos="0" relativeHeight="251671552" behindDoc="1" locked="0" layoutInCell="1" allowOverlap="1" wp14:editId="00144F26" wp14:anchorId="1D166B05">
+              <wp:anchor distT="0" distB="0" distL="0" distR="0" simplePos="0" relativeHeight="251671552" behindDoc="1" locked="0" layoutInCell="1" allowOverlap="1" wp14:editId="54EDE7E2" wp14:anchorId="2B3CC212">
                 <wp:simplePos x="0" y="0"/>
                 <wp:positionH relativeFrom="page">
                   <wp:posOffset>351444</wp:posOffset>
@@ -26108,7 +26360,7 @@
                           </pic:cNvPicPr>
                         </pic:nvPicPr>
                         <pic:blipFill>
-                          <a:blip r:embed="rId27">
+                          <a:blip r:embed="rId22">
                             <a:extLst>
                               <a:ext uri="{28A0092B-C50C-407E-A947-70E740481C1C}">
                                 <a14:useLocalDpi xmlns:a14="http://schemas.microsoft.com/office/drawing/2010/main" val="0"/>
@@ -27108,9 +27360,9 @@
           </mc:Choice>
           <mc:Fallback>
             <w:pict>
-              <v:group id="Group 49" style="position:absolute;margin-left:27.65pt;margin-top:167.2pt;width:539pt;height:68pt;z-index:-251644928;mso-wrap-distance-left:0;mso-wrap-distance-right:0;mso-position-horizontal-relative:page;mso-position-vertical-relative:text" coordsize="10780,1360" coordorigin="560,250" o:spid="_x0000_s1073" o:gfxdata="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" w14:anchorId="1D166B05">
+              <v:group id="Group 49" style="position:absolute;margin-left:27.65pt;margin-top:167.2pt;width:539pt;height:68pt;z-index:-251644928;mso-wrap-distance-left:0;mso-wrap-distance-right:0;mso-position-horizontal-relative:page;mso-position-vertical-relative:text" coordsize="10780,1360" coordorigin="560,250" o:spid="_x0000_s1073" o:gfxdata="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" w14:anchorId="2B3CC212">
                 <v:shape id="Picture 130" style="position:absolute;left:4346;top:1298;width:334;height:150;visibility:visible;mso-wrap-style:square" o:spid="_x0000_s1074" type="#_x0000_t75" o:gfxdata="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">
-                  <v:imagedata o:title="" r:id="rId28"/>
+                  <v:imagedata o:title="" r:id="rId23"/>
                 </v:shape>
                 <v:rect id="Rectangle 131" style="position:absolute;left:563;top:253;width:10774;height:1354;visibility:visible;mso-wrap-style:square;v-text-anchor:top" o:spid="_x0000_s1075" filled="f" strokecolor="#e1e1e1" strokeweight=".3pt" o:gfxdata="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"/>
                 <v:rect id="Rectangle 132" style="position:absolute;left:560;top:250;width:10780;height:432;visibility:visible;mso-wrap-style:square;v-text-anchor:top" o:spid="_x0000_s1076" fillcolor="#252b4f" stroked="f" o:gfxdata="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"/>
@@ -27840,7 +28092,7 @@
         <mc:AlternateContent>
           <mc:Choice Requires="wpg">
             <w:drawing>
-              <wp:anchor distT="0" distB="0" distL="114300" distR="114300" simplePos="0" relativeHeight="251666432" behindDoc="1" locked="0" layoutInCell="1" allowOverlap="1" wp14:editId="2BF2295B" wp14:anchorId="262D1E5A">
+              <wp:anchor distT="0" distB="0" distL="114300" distR="114300" simplePos="0" relativeHeight="251666432" behindDoc="1" locked="0" layoutInCell="1" allowOverlap="1" wp14:editId="14D9D289" wp14:anchorId="45E59D8C">
                 <wp:simplePos x="0" y="0"/>
                 <wp:positionH relativeFrom="page">
                   <wp:posOffset>2295525</wp:posOffset>
@@ -29161,7 +29413,7 @@
                           </pic:cNvPicPr>
                         </pic:nvPicPr>
                         <pic:blipFill>
-                          <a:blip r:embed="rId29">
+                          <a:blip r:embed="rId24">
                             <a:extLst>
                               <a:ext uri="{28A0092B-C50C-407E-A947-70E740481C1C}">
                                 <a14:useLocalDpi xmlns:a14="http://schemas.microsoft.com/office/drawing/2010/main" val="0"/>
@@ -29214,7 +29466,7 @@
                           </pic:cNvPicPr>
                         </pic:nvPicPr>
                         <pic:blipFill>
-                          <a:blip r:embed="rId30">
+                          <a:blip r:embed="rId25">
                             <a:extLst>
                               <a:ext uri="{28A0092B-C50C-407E-A947-70E740481C1C}">
                                 <a14:useLocalDpi xmlns:a14="http://schemas.microsoft.com/office/drawing/2010/main" val="0"/>
@@ -29267,7 +29519,7 @@
                           </pic:cNvPicPr>
                         </pic:nvPicPr>
                         <pic:blipFill>
-                          <a:blip r:embed="rId31">
+                          <a:blip r:embed="rId26">
                             <a:extLst>
                               <a:ext uri="{28A0092B-C50C-407E-A947-70E740481C1C}">
                                 <a14:useLocalDpi xmlns:a14="http://schemas.microsoft.com/office/drawing/2010/main" val="0"/>
@@ -29324,7 +29576,7 @@
               </wp:anchor>
             </w:drawing>
           </mc:Choice>
-          <mc:Fallback xmlns:pic="http://schemas.openxmlformats.org/drawingml/2006/picture" xmlns:a14="http://schemas.microsoft.com/office/drawing/2010/main" xmlns:a="http://schemas.openxmlformats.org/drawingml/2006/main">
+          <mc:Fallback xmlns:a="http://schemas.openxmlformats.org/drawingml/2006/main" xmlns:a14="http://schemas.microsoft.com/office/drawing/2010/main" xmlns:pic="http://schemas.openxmlformats.org/drawingml/2006/picture">
             <w:pict>
               <v:group id="Group 38" style="position:absolute;margin-left:180.75pt;margin-top:95.15pt;width:233.75pt;height:73.8pt;z-index:-251650048;mso-position-horizontal-relative:page" coordsize="4675,1476" coordorigin="3615,1903" o:spid="_x0000_s1026" o:gfxdata="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" w14:anchorId="07FB9762">
                 <v:shape id="AutoShape 107" style="position:absolute;left:3615;top:1902;width:4675;height:1476;visibility:visible;mso-wrap-style:square;v-text-anchor:top" coordsize="4675,1476" o:spid="_x0000_s1027" fillcolor="#f5f5f4" stroked="f" path="m1056,1409r-353,l703,1254r314,l1017,1195r-314,l703,1059r333,l1036,1000r-335,l642,1002r-42,11l575,1031r-9,26l567,1409r4,25l594,1454r44,12l703,1469r353,l1056,1409xm1646,1000r-136,l1510,1313r,13l1508,1339r-3,12l1500,1362r-5,10l1488,1380r-8,8l1471,1394r-10,5l1451,1404r-12,3l1426,1410r-14,2l1397,1414r-16,1l1365,1415r-14,l1339,1414r-12,l1300,1411r-13,-1l1276,1407r-17,59l1269,1468r11,2l1293,1471r10,1l1313,1473r10,1l1334,1474r22,1l1366,1475r11,l1406,1475r27,-2l1460,1471r25,-4l1509,1463r22,-6l1551,1449r19,-9l1587,1430r15,-11l1606,1415r9,-10l1626,1391r9,-17l1641,1356r4,-21l1646,1313r,-313xm2632,1469l2386,1048r,228l2271,1276r-116,l2227,1153r5,-10l2236,1133r5,-10l2246,1112r5,-10l2255,1091r5,-10l2264,1071r5,-10l2271,1061r5,11l2281,1083r11,24l2298,1119r6,11l2310,1142r6,12l2386,1276r,-228l2358,1000r-87,l2191,1000r-274,469l2056,1469r78,-138l2271,1331r137,l2489,1469r143,xm3467,854l3296,842r-49,-3l2338,816r-763,3l1077,834,625,877,,961,184,943,685,902r743,-41l2338,842r762,2l3467,854xm3490,1469r-5,-6l3478,1453r-7,-12l3466,1432r-5,-11l3455,1410r-6,-13l3443,1384r-6,-13l3430,1357r-6,-16l3415,1323r-10,-16l3392,1293r-14,-13l3362,1269r-19,-10l3322,1252r-24,-6l3298,1245r22,-5l3341,1234r20,-7l3380,1219r17,-8l3412,1201r14,-10l3437,1179r10,-12l3453,1154r4,-14l3459,1126r-1,-14l3454,1099r-5,-13l3441,1074r-11,-12l3418,1052r-14,-9l3387,1034r-22,-9l3340,1017r-17,-4l3323,1133r-2,12l3317,1157r-7,10l3300,1177r-12,9l3274,1194r-17,7l3237,1206r-12,3l3213,1212r-14,1l3186,1215r-11,1l3163,1217r-11,l3140,1217r-92,l3048,1056r9,-1l3069,1054r29,-1l3112,1052r15,l3143,1052r11,l3165,1052r10,1l3186,1053r9,1l3204,1055r9,1l3228,1059r15,3l3257,1065r13,5l3281,1075r11,6l3301,1088r8,7l3315,1103r4,9l3322,1122r1,11l3323,1013r-10,-2l3282,1006r-22,-3l3237,1001r-25,-2l3186,998r-13,-1l3159,997r-27,l3091,997r-58,2l2995,1001r-35,2l2928,1005r-14,2l2914,1469r134,l3048,1270r82,l3145,1271r15,l3173,1272r13,2l3194,1275r8,2l3209,1279r16,5l3238,1290r13,8l3261,1307r10,10l3279,1329r8,13l3293,1356r6,15l3304,1384r6,12l3315,1408r5,11l3325,1429r5,9l3334,1446r6,11l3345,1464r5,5l3490,1469xm3904,1000r-136,l3768,1469r136,l3904,1000xm3910,l3772,r,463l3910,463,3910,xm4262,916l4050,892,3598,857r-131,-3l3990,889r272,27xm4675,961l4491,939,4262,916r413,45xe" o:gfxdata="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">
@@ -29353,7 +29605,7 @@
         <mc:AlternateContent>
           <mc:Choice Requires="wps">
             <w:drawing>
-              <wp:anchor distT="0" distB="0" distL="114300" distR="114300" simplePos="0" relativeHeight="251667456" behindDoc="1" locked="0" layoutInCell="1" allowOverlap="1" wp14:editId="408F7DE5" wp14:anchorId="04295431">
+              <wp:anchor distT="0" distB="0" distL="114300" distR="114300" simplePos="0" relativeHeight="251667456" behindDoc="1" locked="0" layoutInCell="1" allowOverlap="1" wp14:editId="462223B5" wp14:anchorId="036EA0F9">
                 <wp:simplePos x="0" y="0"/>
                 <wp:positionH relativeFrom="page">
                   <wp:posOffset>3563620</wp:posOffset>
@@ -29738,7 +29990,7 @@
               </wp:anchor>
             </w:drawing>
           </mc:Choice>
-          <mc:Fallback xmlns:pic="http://schemas.openxmlformats.org/drawingml/2006/picture" xmlns:a14="http://schemas.microsoft.com/office/drawing/2010/main" xmlns:a="http://schemas.openxmlformats.org/drawingml/2006/main">
+          <mc:Fallback xmlns:a="http://schemas.openxmlformats.org/drawingml/2006/main" xmlns:a14="http://schemas.microsoft.com/office/drawing/2010/main" xmlns:pic="http://schemas.openxmlformats.org/drawingml/2006/picture">
             <w:pict>
               <v:shape id="Freeform 37" style="position:absolute;margin-left:280.6pt;margin-top:94.65pt;width:76.55pt;height:23.95pt;z-index:-251649024;visibility:visible;mso-wrap-style:square;mso-width-percent:0;mso-height-percent:0;mso-wrap-distance-left:9pt;mso-wrap-distance-top:0;mso-wrap-distance-right:9pt;mso-wrap-distance-bottom:0;mso-position-horizontal:absolute;mso-position-horizontal-relative:page;mso-position-vertical:absolute;mso-position-vertical-relative:text;mso-width-percent:0;mso-height-percent:0;mso-width-relative:page;mso-height-relative:page;v-text-anchor:top" coordsize="1531,479" o:spid="_x0000_s1026" fillcolor="#f5f5f4" stroked="f" path="m1399,478r-468,l862,478r-726,l75,474,32,453,7,416,,363,,,138,r,399l834,399r,-175l510,224r,-79l834,145r69,9l946,177r22,36l972,258r,141l1393,399r,-254l1531,145r,221l1524,414r-23,36l1460,472r-61,6xe" o:gfxdata="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" w14:anchorId="471C21BF">
                 <v:path arrowok="t" o:connecttype="custom" o:connectlocs="888365,1505585;591185,1505585;591185,1505585;547370,1505585;547370,1505585;86360,1505585;47625,1503045;20320,1489710;4445,1466215;0,1432560;0,1202055;87630,1202055;87630,1455420;529590,1455420;529590,1344295;323850,1344295;323850,1294130;529590,1294130;573405,1299845;600710,1314450;614680,1337310;617220,1365885;617220,1455420;884555,1455420;884555,1294130;972185,1294130;972185,1434465;967740,1464945;953135,1487805;927100,1501775;888365,1505585;888365,1505585" o:connectangles="0,0,0,0,0,0,0,0,0,0,0,0,0,0,0,0,0,0,0,0,0,0,0,0,0,0,0,0,0,0,0,0"/>
@@ -29756,7 +30008,7 @@
         <mc:AlternateContent>
           <mc:Choice Requires="wps">
             <w:drawing>
-              <wp:anchor distT="0" distB="0" distL="114300" distR="114300" simplePos="0" relativeHeight="251668480" behindDoc="1" locked="0" layoutInCell="1" allowOverlap="1" wp14:editId="5C7C7FFC" wp14:anchorId="5BDD8678">
+              <wp:anchor distT="0" distB="0" distL="114300" distR="114300" simplePos="0" relativeHeight="251668480" behindDoc="1" locked="0" layoutInCell="1" allowOverlap="1" wp14:editId="4AA7F8DB" wp14:anchorId="26C0B9E3">
                 <wp:simplePos x="0" y="0"/>
                 <wp:positionH relativeFrom="page">
                   <wp:posOffset>2623185</wp:posOffset>
@@ -30080,7 +30332,7 @@
               </wp:anchor>
             </w:drawing>
           </mc:Choice>
-          <mc:Fallback xmlns:pic="http://schemas.openxmlformats.org/drawingml/2006/picture" xmlns:a14="http://schemas.microsoft.com/office/drawing/2010/main" xmlns:a="http://schemas.openxmlformats.org/drawingml/2006/main">
+          <mc:Fallback xmlns:a="http://schemas.openxmlformats.org/drawingml/2006/main" xmlns:a14="http://schemas.microsoft.com/office/drawing/2010/main" xmlns:pic="http://schemas.openxmlformats.org/drawingml/2006/picture">
             <w:pict>
               <v:shape id="Freeform 36" style="position:absolute;margin-left:206.55pt;margin-top:94.9pt;width:35.6pt;height:24.65pt;z-index:-251648000;visibility:visible;mso-wrap-style:square;mso-width-percent:0;mso-height-percent:0;mso-wrap-distance-left:9pt;mso-wrap-distance-top:0;mso-wrap-distance-right:9pt;mso-wrap-distance-bottom:0;mso-position-horizontal:absolute;mso-position-horizontal-relative:page;mso-position-vertical:absolute;mso-position-vertical-relative:text;mso-width-percent:0;mso-height-percent:0;mso-width-relative:page;mso-height-relative:page;v-text-anchor:top" coordsize="712,493" o:spid="_x0000_s1026" fillcolor="#f5f5f4" stroked="f" path="m575,492r-451,l29,467,,377,,158r125,l125,408r450,l575,304r-298,l277,113r5,-47l301,30,341,8,408,,711,r,85l402,85r,131l701,216r,161l698,426r-21,36l637,485r-62,7xe" o:gfxdata="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" w14:anchorId="22AC1D6D">
                 <v:path arrowok="t" o:connecttype="custom" o:connectlocs="365125,1517650;78740,1517650;18415,1501775;0,1444625;0,1305560;79375,1305560;79375,1464310;365125,1464310;365125,1398270;175895,1398270;175895,1276985;179070,1247140;191135,1224280;216535,1210310;259080,1205230;451485,1205230;451485,1259205;255270,1259205;255270,1342390;445135,1342390;445135,1444625;443230,1475740;429895,1498600;404495,1513205;365125,1517650" o:connectangles="0,0,0,0,0,0,0,0,0,0,0,0,0,0,0,0,0,0,0,0,0,0,0,0,0"/>
@@ -30096,7 +30348,7 @@
           <w:lang w:val="en-GB" w:eastAsia="en-GB"/>
         </w:rPr>
         <w:drawing>
-          <wp:anchor distT="0" distB="0" distL="0" distR="0" simplePos="0" relativeHeight="251669504" behindDoc="1" locked="0" layoutInCell="1" allowOverlap="1" wp14:editId="4ACAAB0E" wp14:anchorId="2F46D0F2">
+          <wp:anchor distT="0" distB="0" distL="0" distR="0" simplePos="0" relativeHeight="251669504" behindDoc="1" locked="0" layoutInCell="1" allowOverlap="1" wp14:editId="682647B6" wp14:anchorId="2902B6A9">
             <wp:simplePos x="0" y="0"/>
             <wp:positionH relativeFrom="page">
               <wp:posOffset>3179622</wp:posOffset>
@@ -30175,7 +30427,7 @@
         <mc:AlternateContent>
           <mc:Choice Requires="wpg">
             <w:drawing>
-              <wp:anchor distT="0" distB="0" distL="0" distR="0" simplePos="0" relativeHeight="251724800" behindDoc="1" locked="0" layoutInCell="1" allowOverlap="1" wp14:editId="17569259" wp14:anchorId="5C111B71">
+              <wp:anchor distT="0" distB="0" distL="0" distR="0" simplePos="0" relativeHeight="251724800" behindDoc="1" locked="0" layoutInCell="1" allowOverlap="1" wp14:editId="70477A1F" wp14:anchorId="1F99F48D">
                 <wp:simplePos x="0" y="0"/>
                 <wp:positionH relativeFrom="page">
                   <wp:posOffset>347691</wp:posOffset>
@@ -30802,7 +31054,7 @@
           </mc:Choice>
           <mc:Fallback>
             <w:pict>
-              <v:group id="Group 116" style="position:absolute;margin-left:27.4pt;margin-top:78pt;width:539pt;height:152pt;z-index:-251591680;mso-wrap-distance-left:0;mso-wrap-distance-right:0;mso-position-horizontal-relative:page;mso-position-vertical-relative:text" coordsize="10780,3040" coordorigin="560,1810" o:spid="_x0000_s1081" o:gfxdata="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" w14:anchorId="5C111B71">
+              <v:group id="Group 116" style="position:absolute;margin-left:27.4pt;margin-top:78pt;width:539pt;height:152pt;z-index:-251591680;mso-wrap-distance-left:0;mso-wrap-distance-right:0;mso-position-horizontal-relative:page;mso-position-vertical-relative:text" coordsize="10780,3040" coordorigin="560,1810" o:spid="_x0000_s1081" o:gfxdata="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" w14:anchorId="1F99F48D">
                 <v:rect id="Rectangle 3" style="position:absolute;left:563;top:1812;width:10774;height:3034;visibility:visible;mso-wrap-style:square;v-text-anchor:top" o:spid="_x0000_s1082" filled="f" strokecolor="#e1e1e1" strokeweight=".3pt" o:gfxdata="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"/>
                 <v:rect id="Rectangle 4" style="position:absolute;left:560;top:1809;width:10780;height:432;visibility:visible;mso-wrap-style:square;v-text-anchor:top" o:spid="_x0000_s1083" fillcolor="#252b4f" stroked="f" o:gfxdata="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"/>
                 <v:shape id="Text Box 5" style="position:absolute;left:566;top:2241;width:10768;height:2603;visibility:visible;mso-wrap-style:square;v-text-anchor:top" o:spid="_x0000_s1084" filled="f" stroked="f" type="#_x0000_t202" o:gfxdata="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">
@@ -31735,7 +31987,7 @@
         <mc:AlternateContent>
           <mc:Choice Requires="wps">
             <w:drawing>
-              <wp:inline distT="0" distB="0" distL="0" distR="0" wp14:anchorId="6F392111" wp14:editId="7421A5A9">
+              <wp:inline distT="0" distB="0" distL="0" distR="0" wp14:anchorId="0124DA3F" wp14:editId="7DD55469">
                 <wp:extent cx="6856384" cy="274320"/>
                 <wp:effectExtent l="0" t="0" r="1905" b="0"/>
                 <wp:docPr id="1709389663" name="Text Box 1709389663"/>
@@ -31846,7 +32098,7 @@
           </mc:Choice>
           <mc:Fallback>
             <w:pict>
-              <v:shape id="Text Box 1709389663" style="width:539.85pt;height:21.6pt;visibility:visible;mso-wrap-style:square;mso-left-percent:-10001;mso-top-percent:-10001;mso-position-horizontal:absolute;mso-position-horizontal-relative:char;mso-position-vertical:absolute;mso-position-vertical-relative:line;mso-left-percent:-10001;mso-top-percent:-10001;v-text-anchor:top" o:spid="_x0000_s1087" fillcolor="#252b4f" stroked="f" type="#_x0000_t202" o:gfxdata="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" w14:anchorId="6F392111">
+              <v:shape id="Text Box 1709389663" style="width:539.85pt;height:21.6pt;visibility:visible;mso-wrap-style:square;mso-left-percent:-10001;mso-top-percent:-10001;mso-position-horizontal:absolute;mso-position-horizontal-relative:char;mso-position-vertical:absolute;mso-position-vertical-relative:line;mso-left-percent:-10001;mso-top-percent:-10001;v-text-anchor:top" o:spid="_x0000_s1087" fillcolor="#252b4f" stroked="f" type="#_x0000_t202" o:gfxdata="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" w14:anchorId="0124DA3F">
                 <v:textbox inset="0,0,0,0">
                   <w:txbxContent>
                     <w:p>
@@ -31952,7 +32204,7 @@
         <mc:AlternateContent>
           <mc:Choice Requires="wps">
             <w:drawing>
-              <wp:inline distT="0" distB="0" distL="0" distR="0" wp14:anchorId="5E65241F" wp14:editId="6927AA7A">
+              <wp:inline distT="0" distB="0" distL="0" distR="0" wp14:anchorId="7C1442D1" wp14:editId="30544F47">
                 <wp:extent cx="3374390" cy="897890"/>
                 <wp:effectExtent l="12700" t="13970" r="13335" b="12065"/>
                 <wp:docPr id="33952194" name="Text Box 33952194"/>
@@ -32180,7 +32432,7 @@
           </mc:Choice>
           <mc:Fallback>
             <w:pict>
-              <v:shape id="Text Box 33952194" style="width:265.7pt;height:70.7pt;visibility:visible;mso-wrap-style:square;mso-left-percent:-10001;mso-top-percent:-10001;mso-position-horizontal:absolute;mso-position-horizontal-relative:char;mso-position-vertical:absolute;mso-position-vertical-relative:line;mso-left-percent:-10001;mso-top-percent:-10001;v-text-anchor:top" o:spid="_x0000_s1088" filled="f" strokecolor="#e1e1e1" strokeweight=".3pt" type="#_x0000_t202" o:gfxdata="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" w14:anchorId="5E65241F">
+              <v:shape id="Text Box 33952194" style="width:265.7pt;height:70.7pt;visibility:visible;mso-wrap-style:square;mso-left-percent:-10001;mso-top-percent:-10001;mso-position-horizontal:absolute;mso-position-horizontal-relative:char;mso-position-vertical:absolute;mso-position-vertical-relative:line;mso-left-percent:-10001;mso-top-percent:-10001;v-text-anchor:top" o:spid="_x0000_s1088" filled="f" strokecolor="#e1e1e1" strokeweight=".3pt" type="#_x0000_t202" o:gfxdata="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" w14:anchorId="7C1442D1">
                 <v:textbox inset="0,0,0,0">
                   <w:txbxContent>
                     <w:p>
@@ -32381,7 +32633,7 @@
         <mc:AlternateContent>
           <mc:Choice Requires="wps">
             <w:drawing>
-              <wp:inline distT="0" distB="0" distL="0" distR="0" wp14:anchorId="31C3F5C5" wp14:editId="45B84C2D">
+              <wp:inline distT="0" distB="0" distL="0" distR="0" wp14:anchorId="2D721A4E" wp14:editId="0D67EF11">
                 <wp:extent cx="3374390" cy="897890"/>
                 <wp:effectExtent l="11430" t="13970" r="5080" b="12065"/>
                 <wp:docPr id="1600772885" name="Text Box 1600772885"/>
@@ -32596,7 +32848,7 @@
           </mc:Choice>
           <mc:Fallback>
             <w:pict>
-              <v:shape id="Text Box 1600772885" style="width:265.7pt;height:70.7pt;visibility:visible;mso-wrap-style:square;mso-left-percent:-10001;mso-top-percent:-10001;mso-position-horizontal:absolute;mso-position-horizontal-relative:char;mso-position-vertical:absolute;mso-position-vertical-relative:line;mso-left-percent:-10001;mso-top-percent:-10001;v-text-anchor:top" o:spid="_x0000_s1089" filled="f" strokecolor="#e1e1e1" strokeweight=".3pt" type="#_x0000_t202" o:gfxdata="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" w14:anchorId="31C3F5C5">
+              <v:shape id="Text Box 1600772885" style="width:265.7pt;height:70.7pt;visibility:visible;mso-wrap-style:square;mso-left-percent:-10001;mso-top-percent:-10001;mso-position-horizontal:absolute;mso-position-horizontal-relative:char;mso-position-vertical:absolute;mso-position-vertical-relative:line;mso-left-percent:-10001;mso-top-percent:-10001;v-text-anchor:top" o:spid="_x0000_s1089" filled="f" strokecolor="#e1e1e1" strokeweight=".3pt" type="#_x0000_t202" o:gfxdata="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" w14:anchorId="2D721A4E">
                 <v:textbox inset="0,0,0,0">
                   <w:txbxContent>
                     <w:p>
@@ -32800,7 +33052,7 @@
         <mc:AlternateContent>
           <mc:Choice Requires="wps">
             <w:drawing>
-              <wp:anchor distT="0" distB="0" distL="114300" distR="114300" simplePos="0" relativeHeight="251725824" behindDoc="0" locked="0" layoutInCell="1" allowOverlap="1" wp14:editId="4223FEA4" wp14:anchorId="45C12E41">
+              <wp:anchor distT="0" distB="0" distL="114300" distR="114300" simplePos="0" relativeHeight="251725824" behindDoc="0" locked="0" layoutInCell="1" allowOverlap="1" wp14:editId="46176257" wp14:anchorId="674B12A6">
                 <wp:simplePos x="0" y="0"/>
                 <wp:positionH relativeFrom="column">
                   <wp:posOffset>367145</wp:posOffset>
@@ -32847,7 +33099,7 @@
                                 <w:noProof/>
                               </w:rPr>
                               <w:drawing>
-                                <wp:inline distT="0" distB="0" distL="0" distR="0" wp14:anchorId="12F43B8C" wp14:editId="1CEECDF9">
+                                <wp:inline distT="0" distB="0" distL="0" distR="0" wp14:anchorId="161B0476" wp14:editId="2586EFF8">
                                   <wp:extent cx="6463030" cy="401089"/>
                                   <wp:effectExtent l="0" t="0" r="0" b="0"/>
                                   <wp:docPr id="607273027" name="Picture 1"/>
@@ -32903,7 +33155,7 @@
           </mc:Choice>
           <mc:Fallback>
             <w:pict>
-              <v:shape id="Text Box 93" style="position:absolute;margin-left:28.9pt;margin-top:30.75pt;width:538.85pt;height:35.45pt;z-index:251725824;visibility:visible;mso-wrap-style:square;mso-height-percent:0;mso-wrap-distance-left:9pt;mso-wrap-distance-top:0;mso-wrap-distance-right:9pt;mso-wrap-distance-bottom:0;mso-position-horizontal:absolute;mso-position-horizontal-relative:text;mso-position-vertical:absolute;mso-position-vertical-relative:text;mso-height-percent:0;mso-height-relative:margin;v-text-anchor:top" o:spid="_x0000_s1090" fillcolor="white [3201]" strokecolor="#cfcdcd [2894]" strokeweight=".5pt" type="#_x0000_t202" o:gfxdata="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" w14:anchorId="45C12E41">
+              <v:shape id="Text Box 93" style="position:absolute;margin-left:28.9pt;margin-top:30.75pt;width:538.85pt;height:35.45pt;z-index:251725824;visibility:visible;mso-wrap-style:square;mso-height-percent:0;mso-wrap-distance-left:9pt;mso-wrap-distance-top:0;mso-wrap-distance-right:9pt;mso-wrap-distance-bottom:0;mso-position-horizontal:absolute;mso-position-horizontal-relative:text;mso-position-vertical:absolute;mso-position-vertical-relative:text;mso-height-percent:0;mso-height-relative:margin;v-text-anchor:top" o:spid="_x0000_s1090" fillcolor="white [3201]" strokecolor="#cfcdcd [2894]" strokeweight=".5pt" type="#_x0000_t202" o:gfxdata="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" w14:anchorId="674B12A6">
                 <v:textbox>
                   <w:txbxContent>
                     <w:p>
@@ -32915,7 +33167,7 @@
                           <w:noProof/>
                         </w:rPr>
                         <w:drawing>
-                          <wp:inline distT="0" distB="0" distL="0" distR="0" wp14:anchorId="12F43B8C" wp14:editId="1CEECDF9">
+                          <wp:inline distT="0" distB="0" distL="0" distR="0" wp14:anchorId="161B0476" wp14:editId="2586EFF8">
                             <wp:extent cx="6463030" cy="401089"/>
                             <wp:effectExtent l="0" t="0" r="0" b="0"/>
                             <wp:docPr id="607273027" name="Picture 1"/>
@@ -32978,7 +33230,7 @@
 </file>
 
 <file path=word/endnotes.xml><?xml version="1.0" encoding="utf-8"?>
-<w:endnotes xmlns:wpc="http://schemas.microsoft.com/office/word/2010/wordprocessingCanvas" xmlns:cx="http://schemas.microsoft.com/office/drawing/2014/chartex" xmlns:cx1="http://schemas.microsoft.com/office/drawing/2015/9/8/chartex" xmlns:cx2="http://schemas.microsoft.com/office/drawing/2015/10/21/chartex" xmlns:cx3="http://schemas.microsoft.com/office/drawing/2016/5/9/chartex" xmlns:cx4="http://schemas.microsoft.com/office/drawing/2016/5/10/chartex" xmlns:cx5="http://schemas.microsoft.com/office/drawing/2016/5/11/chartex" xmlns:cx6="http://schemas.microsoft.com/office/drawing/2016/5/12/chartex" xmlns:cx7="http://schemas.microsoft.com/office/drawing/2016/5/13/chartex" xmlns:cx8="http://schemas.microsoft.com/office/drawing/2016/5/14/chartex" xmlns:mc="http://schemas.openxmlformats.org/markup-compatibility/2006" xmlns:aink="http://schemas.microsoft.com/office/drawing/2016/ink" xmlns:am3d="http://schemas.microsoft.com/office/drawing/2017/model3d" xmlns:o="urn:schemas-microsoft-com:office:office" xmlns:oel="http://schemas.microsoft.com/office/2019/extlst" xmlns:r="http://schemas.openxmlformats.org/officeDocument/2006/relationships" xmlns:m="http://schemas.openxmlformats.org/officeDocument/2006/math" xmlns:v="urn:schemas-microsoft-com:vml" xmlns:wp14="http://schemas.microsoft.com/office/word/2010/wordprocessingDrawing" xmlns:wp="http://schemas.openxmlformats.org/drawingml/2006/wordprocessingDrawing" xmlns:w10="urn:schemas-microsoft-com:office:word" xmlns:w="http://schemas.openxmlformats.org/wordprocessingml/2006/main" xmlns:w14="http://schemas.microsoft.com/office/word/2010/wordml" xmlns:w15="http://schemas.microsoft.com/office/word/2012/wordml" xmlns:w16cex="http://schemas.microsoft.com/office/word/2018/wordml/cex" xmlns:w16cid="http://schemas.microsoft.com/office/word/2016/wordml/cid" xmlns:w16="http://schemas.microsoft.com/office/word/2018/wordml" xmlns:w16du="http://schemas.microsoft.com/office/word/2023/wordml/word16du" xmlns:w16sdtdh="http://schemas.microsoft.com/office/word/2020/wordml/sdtdatahash" xmlns:w16se="http://schemas.microsoft.com/office/word/2015/wordml/symex" xmlns:wpg="http://schemas.microsoft.com/office/word/2010/wordprocessingGroup" xmlns:wpi="http://schemas.microsoft.com/office/word/2010/wordprocessingInk" xmlns:wne="http://schemas.microsoft.com/office/word/2006/wordml" xmlns:wps="http://schemas.microsoft.com/office/word/2010/wordprocessingShape" mc:Ignorable="w14 w15 w16se w16cid w16 w16cex w16sdtdh w16du wp14">
+<w:endnotes xmlns:wpc="http://schemas.microsoft.com/office/word/2010/wordprocessingCanvas" xmlns:cx="http://schemas.microsoft.com/office/drawing/2014/chartex" xmlns:cx1="http://schemas.microsoft.com/office/drawing/2015/9/8/chartex" xmlns:cx2="http://schemas.microsoft.com/office/drawing/2015/10/21/chartex" xmlns:cx3="http://schemas.microsoft.com/office/drawing/2016/5/9/chartex" xmlns:cx4="http://schemas.microsoft.com/office/drawing/2016/5/10/chartex" xmlns:cx5="http://schemas.microsoft.com/office/drawing/2016/5/11/chartex" xmlns:cx6="http://schemas.microsoft.com/office/drawing/2016/5/12/chartex" xmlns:cx7="http://schemas.microsoft.com/office/drawing/2016/5/13/chartex" xmlns:cx8="http://schemas.microsoft.com/office/drawing/2016/5/14/chartex" xmlns:mc="http://schemas.openxmlformats.org/markup-compatibility/2006" xmlns:aink="http://schemas.microsoft.com/office/drawing/2016/ink" xmlns:am3d="http://schemas.microsoft.com/office/drawing/2017/model3d" xmlns:o="urn:schemas-microsoft-com:office:office" xmlns:oel="http://schemas.microsoft.com/office/2019/extlst" xmlns:r="http://schemas.openxmlformats.org/officeDocument/2006/relationships" xmlns:m="http://schemas.openxmlformats.org/officeDocument/2006/math" xmlns:v="urn:schemas-microsoft-com:vml" xmlns:wp14="http://schemas.microsoft.com/office/word/2010/wordprocessingDrawing" xmlns:wp="http://schemas.openxmlformats.org/drawingml/2006/wordprocessingDrawing" xmlns:w10="urn:schemas-microsoft-com:office:word" xmlns:w="http://schemas.openxmlformats.org/wordprocessingml/2006/main" xmlns:w14="http://schemas.microsoft.com/office/word/2010/wordml" xmlns:w15="http://schemas.microsoft.com/office/word/2012/wordml" xmlns:w16cex="http://schemas.microsoft.com/office/word/2018/wordml/cex" xmlns:w16cid="http://schemas.microsoft.com/office/word/2016/wordml/cid" xmlns:w16="http://schemas.microsoft.com/office/word/2018/wordml" xmlns:w16du="http://schemas.microsoft.com/office/word/2023/wordml/word16du" xmlns:w16sdtdh="http://schemas.microsoft.com/office/word/2020/wordml/sdtdatahash" xmlns:w16sdtfl="http://schemas.microsoft.com/office/word/2024/wordml/sdtformatlock" xmlns:w16se="http://schemas.microsoft.com/office/word/2015/wordml/symex" xmlns:wpg="http://schemas.microsoft.com/office/word/2010/wordprocessingGroup" xmlns:wpi="http://schemas.microsoft.com/office/word/2010/wordprocessingInk" xmlns:wne="http://schemas.microsoft.com/office/word/2006/wordml" xmlns:wps="http://schemas.microsoft.com/office/word/2010/wordprocessingShape" mc:Ignorable="w14 w15 w16se w16cid w16 w16cex w16sdtdh w16sdtfl w16du wp14">
   <w:endnote w:type="separator" w:id="-1">
     <w:p>
       <w:pPr>
@@ -33002,38 +33254,8 @@
 </w:endnotes>
 </file>
 
-<file path=word/footer1.xml><?xml version="1.0" encoding="utf-8"?>
-<w:ftr xmlns:wpc="http://schemas.microsoft.com/office/word/2010/wordprocessingCanvas" xmlns:cx="http://schemas.microsoft.com/office/drawing/2014/chartex" xmlns:cx1="http://schemas.microsoft.com/office/drawing/2015/9/8/chartex" xmlns:cx2="http://schemas.microsoft.com/office/drawing/2015/10/21/chartex" xmlns:cx3="http://schemas.microsoft.com/office/drawing/2016/5/9/chartex" xmlns:cx4="http://schemas.microsoft.com/office/drawing/2016/5/10/chartex" xmlns:cx5="http://schemas.microsoft.com/office/drawing/2016/5/11/chartex" xmlns:cx6="http://schemas.microsoft.com/office/drawing/2016/5/12/chartex" xmlns:cx7="http://schemas.microsoft.com/office/drawing/2016/5/13/chartex" xmlns:cx8="http://schemas.microsoft.com/office/drawing/2016/5/14/chartex" xmlns:mc="http://schemas.openxmlformats.org/markup-compatibility/2006" xmlns:aink="http://schemas.microsoft.com/office/drawing/2016/ink" xmlns:am3d="http://schemas.microsoft.com/office/drawing/2017/model3d" xmlns:o="urn:schemas-microsoft-com:office:office" xmlns:oel="http://schemas.microsoft.com/office/2019/extlst" xmlns:r="http://schemas.openxmlformats.org/officeDocument/2006/relationships" xmlns:m="http://schemas.openxmlformats.org/officeDocument/2006/math" xmlns:v="urn:schemas-microsoft-com:vml" xmlns:wp14="http://schemas.microsoft.com/office/word/2010/wordprocessingDrawing" xmlns:wp="http://schemas.openxmlformats.org/drawingml/2006/wordprocessingDrawing" xmlns:w10="urn:schemas-microsoft-com:office:word" xmlns:w="http://schemas.openxmlformats.org/wordprocessingml/2006/main" xmlns:w14="http://schemas.microsoft.com/office/word/2010/wordml" xmlns:w15="http://schemas.microsoft.com/office/word/2012/wordml" xmlns:w16cex="http://schemas.microsoft.com/office/word/2018/wordml/cex" xmlns:w16cid="http://schemas.microsoft.com/office/word/2016/wordml/cid" xmlns:w16="http://schemas.microsoft.com/office/word/2018/wordml" xmlns:w16du="http://schemas.microsoft.com/office/word/2023/wordml/word16du" xmlns:w16sdtdh="http://schemas.microsoft.com/office/word/2020/wordml/sdtdatahash" xmlns:w16se="http://schemas.microsoft.com/office/word/2015/wordml/symex" xmlns:wpg="http://schemas.microsoft.com/office/word/2010/wordprocessingGroup" xmlns:wpi="http://schemas.microsoft.com/office/word/2010/wordprocessingInk" xmlns:wne="http://schemas.microsoft.com/office/word/2006/wordml" xmlns:wps="http://schemas.microsoft.com/office/word/2010/wordprocessingShape" mc:Ignorable="w14 w15 w16se w16cid w16 w16cex w16sdtdh w16du wp14">
-  <w:p>
-    <w:pPr>
-      <w:pStyle w:val="Footer"/>
-    </w:pPr>
-  </w:p>
-</w:ftr>
-</file>
-
-<file path=word/footer2.xml><?xml version="1.0" encoding="utf-8"?>
-<w:ftr xmlns:wpc="http://schemas.microsoft.com/office/word/2010/wordprocessingCanvas" xmlns:cx="http://schemas.microsoft.com/office/drawing/2014/chartex" xmlns:cx1="http://schemas.microsoft.com/office/drawing/2015/9/8/chartex" xmlns:cx2="http://schemas.microsoft.com/office/drawing/2015/10/21/chartex" xmlns:cx3="http://schemas.microsoft.com/office/drawing/2016/5/9/chartex" xmlns:cx4="http://schemas.microsoft.com/office/drawing/2016/5/10/chartex" xmlns:cx5="http://schemas.microsoft.com/office/drawing/2016/5/11/chartex" xmlns:cx6="http://schemas.microsoft.com/office/drawing/2016/5/12/chartex" xmlns:cx7="http://schemas.microsoft.com/office/drawing/2016/5/13/chartex" xmlns:cx8="http://schemas.microsoft.com/office/drawing/2016/5/14/chartex" xmlns:mc="http://schemas.openxmlformats.org/markup-compatibility/2006" xmlns:aink="http://schemas.microsoft.com/office/drawing/2016/ink" xmlns:am3d="http://schemas.microsoft.com/office/drawing/2017/model3d" xmlns:o="urn:schemas-microsoft-com:office:office" xmlns:oel="http://schemas.microsoft.com/office/2019/extlst" xmlns:r="http://schemas.openxmlformats.org/officeDocument/2006/relationships" xmlns:m="http://schemas.openxmlformats.org/officeDocument/2006/math" xmlns:v="urn:schemas-microsoft-com:vml" xmlns:wp14="http://schemas.microsoft.com/office/word/2010/wordprocessingDrawing" xmlns:wp="http://schemas.openxmlformats.org/drawingml/2006/wordprocessingDrawing" xmlns:w10="urn:schemas-microsoft-com:office:word" xmlns:w="http://schemas.openxmlformats.org/wordprocessingml/2006/main" xmlns:w14="http://schemas.microsoft.com/office/word/2010/wordml" xmlns:w15="http://schemas.microsoft.com/office/word/2012/wordml" xmlns:w16cex="http://schemas.microsoft.com/office/word/2018/wordml/cex" xmlns:w16cid="http://schemas.microsoft.com/office/word/2016/wordml/cid" xmlns:w16="http://schemas.microsoft.com/office/word/2018/wordml" xmlns:w16du="http://schemas.microsoft.com/office/word/2023/wordml/word16du" xmlns:w16sdtdh="http://schemas.microsoft.com/office/word/2020/wordml/sdtdatahash" xmlns:w16se="http://schemas.microsoft.com/office/word/2015/wordml/symex" xmlns:wpg="http://schemas.microsoft.com/office/word/2010/wordprocessingGroup" xmlns:wpi="http://schemas.microsoft.com/office/word/2010/wordprocessingInk" xmlns:wne="http://schemas.microsoft.com/office/word/2006/wordml" xmlns:wps="http://schemas.microsoft.com/office/word/2010/wordprocessingShape" mc:Ignorable="w14 w15 w16se w16cid w16 w16cex w16sdtdh w16du wp14">
-  <w:p>
-    <w:pPr>
-      <w:pStyle w:val="Footer"/>
-    </w:pPr>
-  </w:p>
-</w:ftr>
-</file>
-
-<file path=word/footer3.xml><?xml version="1.0" encoding="utf-8"?>
-<w:ftr xmlns:wpc="http://schemas.microsoft.com/office/word/2010/wordprocessingCanvas" xmlns:cx="http://schemas.microsoft.com/office/drawing/2014/chartex" xmlns:cx1="http://schemas.microsoft.com/office/drawing/2015/9/8/chartex" xmlns:cx2="http://schemas.microsoft.com/office/drawing/2015/10/21/chartex" xmlns:cx3="http://schemas.microsoft.com/office/drawing/2016/5/9/chartex" xmlns:cx4="http://schemas.microsoft.com/office/drawing/2016/5/10/chartex" xmlns:cx5="http://schemas.microsoft.com/office/drawing/2016/5/11/chartex" xmlns:cx6="http://schemas.microsoft.com/office/drawing/2016/5/12/chartex" xmlns:cx7="http://schemas.microsoft.com/office/drawing/2016/5/13/chartex" xmlns:cx8="http://schemas.microsoft.com/office/drawing/2016/5/14/chartex" xmlns:mc="http://schemas.openxmlformats.org/markup-compatibility/2006" xmlns:aink="http://schemas.microsoft.com/office/drawing/2016/ink" xmlns:am3d="http://schemas.microsoft.com/office/drawing/2017/model3d" xmlns:o="urn:schemas-microsoft-com:office:office" xmlns:oel="http://schemas.microsoft.com/office/2019/extlst" xmlns:r="http://schemas.openxmlformats.org/officeDocument/2006/relationships" xmlns:m="http://schemas.openxmlformats.org/officeDocument/2006/math" xmlns:v="urn:schemas-microsoft-com:vml" xmlns:wp14="http://schemas.microsoft.com/office/word/2010/wordprocessingDrawing" xmlns:wp="http://schemas.openxmlformats.org/drawingml/2006/wordprocessingDrawing" xmlns:w10="urn:schemas-microsoft-com:office:word" xmlns:w="http://schemas.openxmlformats.org/wordprocessingml/2006/main" xmlns:w14="http://schemas.microsoft.com/office/word/2010/wordml" xmlns:w15="http://schemas.microsoft.com/office/word/2012/wordml" xmlns:w16cex="http://schemas.microsoft.com/office/word/2018/wordml/cex" xmlns:w16cid="http://schemas.microsoft.com/office/word/2016/wordml/cid" xmlns:w16="http://schemas.microsoft.com/office/word/2018/wordml" xmlns:w16du="http://schemas.microsoft.com/office/word/2023/wordml/word16du" xmlns:w16sdtdh="http://schemas.microsoft.com/office/word/2020/wordml/sdtdatahash" xmlns:w16se="http://schemas.microsoft.com/office/word/2015/wordml/symex" xmlns:wpg="http://schemas.microsoft.com/office/word/2010/wordprocessingGroup" xmlns:wpi="http://schemas.microsoft.com/office/word/2010/wordprocessingInk" xmlns:wne="http://schemas.microsoft.com/office/word/2006/wordml" xmlns:wps="http://schemas.microsoft.com/office/word/2010/wordprocessingShape" mc:Ignorable="w14 w15 w16se w16cid w16 w16cex w16sdtdh w16du wp14">
-  <w:p>
-    <w:pPr>
-      <w:pStyle w:val="Footer"/>
-    </w:pPr>
-  </w:p>
-</w:ftr>
-</file>
-
 <file path=word/footnotes.xml><?xml version="1.0" encoding="utf-8"?>
-<w:footnotes xmlns:wpc="http://schemas.microsoft.com/office/word/2010/wordprocessingCanvas" xmlns:cx="http://schemas.microsoft.com/office/drawing/2014/chartex" xmlns:cx1="http://schemas.microsoft.com/office/drawing/2015/9/8/chartex" xmlns:cx2="http://schemas.microsoft.com/office/drawing/2015/10/21/chartex" xmlns:cx3="http://schemas.microsoft.com/office/drawing/2016/5/9/chartex" xmlns:cx4="http://schemas.microsoft.com/office/drawing/2016/5/10/chartex" xmlns:cx5="http://schemas.microsoft.com/office/drawing/2016/5/11/chartex" xmlns:cx6="http://schemas.microsoft.com/office/drawing/2016/5/12/chartex" xmlns:cx7="http://schemas.microsoft.com/office/drawing/2016/5/13/chartex" xmlns:cx8="http://schemas.microsoft.com/office/drawing/2016/5/14/chartex" xmlns:mc="http://schemas.openxmlformats.org/markup-compatibility/2006" xmlns:aink="http://schemas.microsoft.com/office/drawing/2016/ink" xmlns:am3d="http://schemas.microsoft.com/office/drawing/2017/model3d" xmlns:o="urn:schemas-microsoft-com:office:office" xmlns:oel="http://schemas.microsoft.com/office/2019/extlst" xmlns:r="http://schemas.openxmlformats.org/officeDocument/2006/relationships" xmlns:m="http://schemas.openxmlformats.org/officeDocument/2006/math" xmlns:v="urn:schemas-microsoft-com:vml" xmlns:wp14="http://schemas.microsoft.com/office/word/2010/wordprocessingDrawing" xmlns:wp="http://schemas.openxmlformats.org/drawingml/2006/wordprocessingDrawing" xmlns:w10="urn:schemas-microsoft-com:office:word" xmlns:w="http://schemas.openxmlformats.org/wordprocessingml/2006/main" xmlns:w14="http://schemas.microsoft.com/office/word/2010/wordml" xmlns:w15="http://schemas.microsoft.com/office/word/2012/wordml" xmlns:w16cex="http://schemas.microsoft.com/office/word/2018/wordml/cex" xmlns:w16cid="http://schemas.microsoft.com/office/word/2016/wordml/cid" xmlns:w16="http://schemas.microsoft.com/office/word/2018/wordml" xmlns:w16du="http://schemas.microsoft.com/office/word/2023/wordml/word16du" xmlns:w16sdtdh="http://schemas.microsoft.com/office/word/2020/wordml/sdtdatahash" xmlns:w16se="http://schemas.microsoft.com/office/word/2015/wordml/symex" xmlns:wpg="http://schemas.microsoft.com/office/word/2010/wordprocessingGroup" xmlns:wpi="http://schemas.microsoft.com/office/word/2010/wordprocessingInk" xmlns:wne="http://schemas.microsoft.com/office/word/2006/wordml" xmlns:wps="http://schemas.microsoft.com/office/word/2010/wordprocessingShape" mc:Ignorable="w14 w15 w16se w16cid w16 w16cex w16sdtdh w16du wp14">
+<w:footnotes xmlns:wpc="http://schemas.microsoft.com/office/word/2010/wordprocessingCanvas" xmlns:cx="http://schemas.microsoft.com/office/drawing/2014/chartex" xmlns:cx1="http://schemas.microsoft.com/office/drawing/2015/9/8/chartex" xmlns:cx2="http://schemas.microsoft.com/office/drawing/2015/10/21/chartex" xmlns:cx3="http://schemas.microsoft.com/office/drawing/2016/5/9/chartex" xmlns:cx4="http://schemas.microsoft.com/office/drawing/2016/5/10/chartex" xmlns:cx5="http://schemas.microsoft.com/office/drawing/2016/5/11/chartex" xmlns:cx6="http://schemas.microsoft.com/office/drawing/2016/5/12/chartex" xmlns:cx7="http://schemas.microsoft.com/office/drawing/2016/5/13/chartex" xmlns:cx8="http://schemas.microsoft.com/office/drawing/2016/5/14/chartex" xmlns:mc="http://schemas.openxmlformats.org/markup-compatibility/2006" xmlns:aink="http://schemas.microsoft.com/office/drawing/2016/ink" xmlns:am3d="http://schemas.microsoft.com/office/drawing/2017/model3d" xmlns:o="urn:schemas-microsoft-com:office:office" xmlns:oel="http://schemas.microsoft.com/office/2019/extlst" xmlns:r="http://schemas.openxmlformats.org/officeDocument/2006/relationships" xmlns:m="http://schemas.openxmlformats.org/officeDocument/2006/math" xmlns:v="urn:schemas-microsoft-com:vml" xmlns:wp14="http://schemas.microsoft.com/office/word/2010/wordprocessingDrawing" xmlns:wp="http://schemas.openxmlformats.org/drawingml/2006/wordprocessingDrawing" xmlns:w10="urn:schemas-microsoft-com:office:word" xmlns:w="http://schemas.openxmlformats.org/wordprocessingml/2006/main" xmlns:w14="http://schemas.microsoft.com/office/word/2010/wordml" xmlns:w15="http://schemas.microsoft.com/office/word/2012/wordml" xmlns:w16cex="http://schemas.microsoft.com/office/word/2018/wordml/cex" xmlns:w16cid="http://schemas.microsoft.com/office/word/2016/wordml/cid" xmlns:w16="http://schemas.microsoft.com/office/word/2018/wordml" xmlns:w16du="http://schemas.microsoft.com/office/word/2023/wordml/word16du" xmlns:w16sdtdh="http://schemas.microsoft.com/office/word/2020/wordml/sdtdatahash" xmlns:w16sdtfl="http://schemas.microsoft.com/office/word/2024/wordml/sdtformatlock" xmlns:w16se="http://schemas.microsoft.com/office/word/2015/wordml/symex" xmlns:wpg="http://schemas.microsoft.com/office/word/2010/wordprocessingGroup" xmlns:wpi="http://schemas.microsoft.com/office/word/2010/wordprocessingInk" xmlns:wne="http://schemas.microsoft.com/office/word/2006/wordml" xmlns:wps="http://schemas.microsoft.com/office/word/2010/wordprocessingShape" mc:Ignorable="w14 w15 w16se w16cid w16 w16cex w16sdtdh w16sdtfl w16du wp14">
   <w:footnote w:type="separator" w:id="-1">
     <w:p>
       <w:pPr>
@@ -33058,17 +33280,7 @@
 </file>
 
 <file path=word/header1.xml><?xml version="1.0" encoding="utf-8"?>
-<w:hdr xmlns:wpc="http://schemas.microsoft.com/office/word/2010/wordprocessingCanvas" xmlns:cx="http://schemas.microsoft.com/office/drawing/2014/chartex" xmlns:cx1="http://schemas.microsoft.com/office/drawing/2015/9/8/chartex" xmlns:cx2="http://schemas.microsoft.com/office/drawing/2015/10/21/chartex" xmlns:cx3="http://schemas.microsoft.com/office/drawing/2016/5/9/chartex" xmlns:cx4="http://schemas.microsoft.com/office/drawing/2016/5/10/chartex" xmlns:cx5="http://schemas.microsoft.com/office/drawing/2016/5/11/chartex" xmlns:cx6="http://schemas.microsoft.com/office/drawing/2016/5/12/chartex" xmlns:cx7="http://schemas.microsoft.com/office/drawing/2016/5/13/chartex" xmlns:cx8="http://schemas.microsoft.com/office/drawing/2016/5/14/chartex" xmlns:mc="http://schemas.openxmlformats.org/markup-compatibility/2006" xmlns:aink="http://schemas.microsoft.com/office/drawing/2016/ink" xmlns:am3d="http://schemas.microsoft.com/office/drawing/2017/model3d" xmlns:o="urn:schemas-microsoft-com:office:office" xmlns:oel="http://schemas.microsoft.com/office/2019/extlst" xmlns:r="http://schemas.openxmlformats.org/officeDocument/2006/relationships" xmlns:m="http://schemas.openxmlformats.org/officeDocument/2006/math" xmlns:v="urn:schemas-microsoft-com:vml" xmlns:wp14="http://schemas.microsoft.com/office/word/2010/wordprocessingDrawing" xmlns:wp="http://schemas.openxmlformats.org/drawingml/2006/wordprocessingDrawing" xmlns:w10="urn:schemas-microsoft-com:office:word" xmlns:w="http://schemas.openxmlformats.org/wordprocessingml/2006/main" xmlns:w14="http://schemas.microsoft.com/office/word/2010/wordml" xmlns:w15="http://schemas.microsoft.com/office/word/2012/wordml" xmlns:w16cex="http://schemas.microsoft.com/office/word/2018/wordml/cex" xmlns:w16cid="http://schemas.microsoft.com/office/word/2016/wordml/cid" xmlns:w16="http://schemas.microsoft.com/office/word/2018/wordml" xmlns:w16du="http://schemas.microsoft.com/office/word/2023/wordml/word16du" xmlns:w16sdtdh="http://schemas.microsoft.com/office/word/2020/wordml/sdtdatahash" xmlns:w16se="http://schemas.microsoft.com/office/word/2015/wordml/symex" xmlns:wpg="http://schemas.microsoft.com/office/word/2010/wordprocessingGroup" xmlns:wpi="http://schemas.microsoft.com/office/word/2010/wordprocessingInk" xmlns:wne="http://schemas.microsoft.com/office/word/2006/wordml" xmlns:wps="http://schemas.microsoft.com/office/word/2010/wordprocessingShape" mc:Ignorable="w14 w15 w16se w16cid w16 w16cex w16sdtdh w16du wp14">
-  <w:p>
-    <w:pPr>
-      <w:pStyle w:val="Header"/>
-    </w:pPr>
-  </w:p>
-</w:hdr>
-</file>
-
-<file path=word/header2.xml><?xml version="1.0" encoding="utf-8"?>
-<w:hdr xmlns:a="http://schemas.openxmlformats.org/drawingml/2006/main" xmlns:pic="http://schemas.openxmlformats.org/drawingml/2006/picture" xmlns:wpc="http://schemas.microsoft.com/office/word/2010/wordprocessingCanvas" xmlns:cx="http://schemas.microsoft.com/office/drawing/2014/chartex" xmlns:cx1="http://schemas.microsoft.com/office/drawing/2015/9/8/chartex" xmlns:cx2="http://schemas.microsoft.com/office/drawing/2015/10/21/chartex" xmlns:cx3="http://schemas.microsoft.com/office/drawing/2016/5/9/chartex" xmlns:cx4="http://schemas.microsoft.com/office/drawing/2016/5/10/chartex" xmlns:cx5="http://schemas.microsoft.com/office/drawing/2016/5/11/chartex" xmlns:cx6="http://schemas.microsoft.com/office/drawing/2016/5/12/chartex" xmlns:cx7="http://schemas.microsoft.com/office/drawing/2016/5/13/chartex" xmlns:cx8="http://schemas.microsoft.com/office/drawing/2016/5/14/chartex" xmlns:mc="http://schemas.openxmlformats.org/markup-compatibility/2006" xmlns:aink="http://schemas.microsoft.com/office/drawing/2016/ink" xmlns:am3d="http://schemas.microsoft.com/office/drawing/2017/model3d" xmlns:o="urn:schemas-microsoft-com:office:office" xmlns:oel="http://schemas.microsoft.com/office/2019/extlst" xmlns:r="http://schemas.openxmlformats.org/officeDocument/2006/relationships" xmlns:m="http://schemas.openxmlformats.org/officeDocument/2006/math" xmlns:v="urn:schemas-microsoft-com:vml" xmlns:wp14="http://schemas.microsoft.com/office/word/2010/wordprocessingDrawing" xmlns:wp="http://schemas.openxmlformats.org/drawingml/2006/wordprocessingDrawing" xmlns:w10="urn:schemas-microsoft-com:office:word" xmlns:w="http://schemas.openxmlformats.org/wordprocessingml/2006/main" xmlns:w14="http://schemas.microsoft.com/office/word/2010/wordml" xmlns:w15="http://schemas.microsoft.com/office/word/2012/wordml" xmlns:w16cex="http://schemas.microsoft.com/office/word/2018/wordml/cex" xmlns:w16cid="http://schemas.microsoft.com/office/word/2016/wordml/cid" xmlns:w16="http://schemas.microsoft.com/office/word/2018/wordml" xmlns:w16du="http://schemas.microsoft.com/office/word/2023/wordml/word16du" xmlns:w16sdtdh="http://schemas.microsoft.com/office/word/2020/wordml/sdtdatahash" xmlns:w16se="http://schemas.microsoft.com/office/word/2015/wordml/symex" xmlns:wpg="http://schemas.microsoft.com/office/word/2010/wordprocessingGroup" xmlns:wpi="http://schemas.microsoft.com/office/word/2010/wordprocessingInk" xmlns:wne="http://schemas.microsoft.com/office/word/2006/wordml" xmlns:wps="http://schemas.microsoft.com/office/word/2010/wordprocessingShape" mc:Ignorable="w14 w15 w16se w16cid w16 w16cex w16sdtdh w16du wp14">
+<w:hdr xmlns:a="http://schemas.openxmlformats.org/drawingml/2006/main" xmlns:pic="http://schemas.openxmlformats.org/drawingml/2006/picture" xmlns:wpc="http://schemas.microsoft.com/office/word/2010/wordprocessingCanvas" xmlns:cx="http://schemas.microsoft.com/office/drawing/2014/chartex" xmlns:cx1="http://schemas.microsoft.com/office/drawing/2015/9/8/chartex" xmlns:cx2="http://schemas.microsoft.com/office/drawing/2015/10/21/chartex" xmlns:cx3="http://schemas.microsoft.com/office/drawing/2016/5/9/chartex" xmlns:cx4="http://schemas.microsoft.com/office/drawing/2016/5/10/chartex" xmlns:cx5="http://schemas.microsoft.com/office/drawing/2016/5/11/chartex" xmlns:cx6="http://schemas.microsoft.com/office/drawing/2016/5/12/chartex" xmlns:cx7="http://schemas.microsoft.com/office/drawing/2016/5/13/chartex" xmlns:cx8="http://schemas.microsoft.com/office/drawing/2016/5/14/chartex" xmlns:mc="http://schemas.openxmlformats.org/markup-compatibility/2006" xmlns:aink="http://schemas.microsoft.com/office/drawing/2016/ink" xmlns:am3d="http://schemas.microsoft.com/office/drawing/2017/model3d" xmlns:o="urn:schemas-microsoft-com:office:office" xmlns:oel="http://schemas.microsoft.com/office/2019/extlst" xmlns:r="http://schemas.openxmlformats.org/officeDocument/2006/relationships" xmlns:m="http://schemas.openxmlformats.org/officeDocument/2006/math" xmlns:v="urn:schemas-microsoft-com:vml" xmlns:wp14="http://schemas.microsoft.com/office/word/2010/wordprocessingDrawing" xmlns:wp="http://schemas.openxmlformats.org/drawingml/2006/wordprocessingDrawing" xmlns:w10="urn:schemas-microsoft-com:office:word" xmlns:w="http://schemas.openxmlformats.org/wordprocessingml/2006/main" xmlns:w14="http://schemas.microsoft.com/office/word/2010/wordml" xmlns:w15="http://schemas.microsoft.com/office/word/2012/wordml" xmlns:w16cex="http://schemas.microsoft.com/office/word/2018/wordml/cex" xmlns:w16cid="http://schemas.microsoft.com/office/word/2016/wordml/cid" xmlns:w16="http://schemas.microsoft.com/office/word/2018/wordml" xmlns:w16du="http://schemas.microsoft.com/office/word/2023/wordml/word16du" xmlns:w16sdtdh="http://schemas.microsoft.com/office/word/2020/wordml/sdtdatahash" xmlns:w16sdtfl="http://schemas.microsoft.com/office/word/2024/wordml/sdtformatlock" xmlns:w16se="http://schemas.microsoft.com/office/word/2015/wordml/symex" xmlns:wpg="http://schemas.microsoft.com/office/word/2010/wordprocessingGroup" xmlns:wpi="http://schemas.microsoft.com/office/word/2010/wordprocessingInk" xmlns:wne="http://schemas.microsoft.com/office/word/2006/wordml" xmlns:wps="http://schemas.microsoft.com/office/word/2010/wordprocessingShape" mc:Ignorable="w14 w15 w16se w16cid w16 w16cex w16sdtdh w16sdtfl w16du wp14">
   <w:p>
     <w:pPr>
       <w:pStyle w:val="BodyText"/>
@@ -33084,7 +33296,7 @@
         <w:lang w:val="en-GB" w:eastAsia="en-GB"/>
       </w:rPr>
       <w:drawing>
-        <wp:anchor distT="0" distB="0" distL="0" distR="0" simplePos="0" relativeHeight="251659264" behindDoc="1" locked="0" layoutInCell="1" allowOverlap="1" wp14:editId="15961AAD" wp14:anchorId="1953C6E3">
+        <wp:anchor distT="0" distB="0" distL="0" distR="0" simplePos="0" relativeHeight="251659264" behindDoc="1" locked="0" layoutInCell="1" allowOverlap="1" wp14:editId="09575B44" wp14:anchorId="6D70541A">
           <wp:simplePos x="0" y="0"/>
           <wp:positionH relativeFrom="page">
             <wp:posOffset>400050</wp:posOffset>
@@ -33095,7 +33307,7 @@
           <wp:extent cx="1562735" cy="628650"/>
           <wp:effectExtent l="0" t="0" r="0" b="0"/>
           <wp:wrapNone/>
-          <wp:docPr id="1292729550" name="image1.png"/>
+          <wp:docPr id="1336362821" name="image1.png"/>
           <wp:cNvGraphicFramePr>
             <a:graphicFrameLocks xmlns:a="http://schemas.openxmlformats.org/drawingml/2006/main" noChangeAspect="1"/>
           </wp:cNvGraphicFramePr>
@@ -33136,7 +33348,7 @@
       <mc:AlternateContent>
         <mc:Choice Requires="wps">
           <w:drawing>
-            <wp:anchor distT="0" distB="0" distL="114300" distR="114300" simplePos="0" relativeHeight="251662336" behindDoc="0" locked="0" layoutInCell="1" allowOverlap="1" wp14:editId="2D38BEC3" wp14:anchorId="21D23475">
+            <wp:anchor distT="0" distB="0" distL="114300" distR="114300" simplePos="0" relativeHeight="251662336" behindDoc="0" locked="0" layoutInCell="1" allowOverlap="1" wp14:editId="10838314" wp14:anchorId="7754EFE1">
               <wp:simplePos x="0" y="0"/>
               <wp:positionH relativeFrom="column">
                 <wp:posOffset>9247505</wp:posOffset>
@@ -33193,7 +33405,7 @@
         </mc:Choice>
         <mc:Fallback>
           <w:pict>
-            <v:shapetype id="_x0000_t202" coordsize="21600,21600" o:spt="202" path="m,l,21600r21600,l21600,xe" w14:anchorId="21D23475">
+            <v:shapetype id="_x0000_t202" coordsize="21600,21600" o:spt="202" path="m,l,21600r21600,l21600,xe" w14:anchorId="7754EFE1">
               <v:stroke joinstyle="miter"/>
               <v:path gradientshapeok="t" o:connecttype="rect"/>
             </v:shapetype>
@@ -33208,81 +33420,12 @@
         </mc:Fallback>
       </mc:AlternateContent>
     </w:r>
-    <w:sdt>
-      <w:sdtPr>
-        <w:rPr>
-          <w:sz w:val="20"/>
-        </w:rPr>
-        <w:alias w:val="#Nav: /TenancyContract/CompanyPicture"/>
-        <w:tag w:val="#Nav: Tenancy_Contract/50101"/>
-        <w:id w:val="682942765"/>
-        <w:dataBinding w:prefixMappings="xmlns:ns0='urn:microsoft-dynamics-nav/reports/Tenancy_Contract/50101/'" w:xpath="/ns0:NavWordReportXmlPart[1]/ns0:TenancyContract[1]/ns0:CompanyPicture[1]" w:storeItemID="{B8787D49-5AAC-4AAC-A9D8-A7D9793FE4D0}"/>
-        <w:picture/>
-      </w:sdtPr>
-      <w:sdtContent/>
-    </w:sdt>
-    <w:sdt>
-      <w:sdtPr>
-        <w:rPr>
-          <w:sz w:val="20"/>
-        </w:rPr>
-        <w:alias w:val="#Nav: /TenancyContract/CompanyPicture"/>
-        <w:tag w:val="#Nav: Tenancy_Contract/50101"/>
-        <w:id w:val="2106836147"/>
-        <w:dataBinding w:prefixMappings="xmlns:ns0='urn:microsoft-dynamics-nav/reports/Tenancy_Contract/50101/'" w:xpath="/ns0:NavWordReportXmlPart[1]/ns0:TenancyContract[1]/ns0:CompanyPicture[1]" w:storeItemID="{B8787D49-5AAC-4AAC-A9D8-A7D9793FE4D0}"/>
-        <w:picture/>
-      </w:sdtPr>
-      <w:sdtContent/>
-    </w:sdt>
-    <w:r>
-      <w:rPr>
-        <w:sz w:val="20"/>
-      </w:rPr>
-      <w:t xml:space="preserve"> </w:t>
-    </w:r>
-    <w:r>
-      <w:rPr>
-        <w:noProof/>
-        <w:lang w:val="en-GB" w:eastAsia="en-GB"/>
-      </w:rPr>
-      <w:t xml:space="preserve">  </w:t>
-    </w:r>
-    <w:sdt>
-      <w:sdtPr>
-        <w:rPr>
-          <w:sz w:val="20"/>
-        </w:rPr>
-        <w:alias w:val="#Nav: /TenancyContract/CompanyPicture"/>
-        <w:tag w:val="#Nav: Tenancy_Contract/50101"/>
-        <w:id w:val="1015189817"/>
-        <w:dataBinding w:prefixMappings="xmlns:ns0='urn:microsoft-dynamics-nav/reports/Tenancy_Contract/50101/'" w:xpath="/ns0:NavWordReportXmlPart[1]/ns0:TenancyContract[1]/ns0:CompanyPicture[1]" w:storeItemID="{B8787D49-5AAC-4AAC-A9D8-A7D9793FE4D0}"/>
-        <w:picture/>
-      </w:sdtPr>
-      <w:sdtContent/>
-    </w:sdt>
-    <w:r>
-      <w:rPr>
-        <w:noProof/>
-        <w:lang w:val="en-GB" w:eastAsia="en-GB"/>
-      </w:rPr>
-      <w:t xml:space="preserve"> </w:t>
-    </w:r>
   </w:p>
 </w:hdr>
 </file>
 
-<file path=word/header3.xml><?xml version="1.0" encoding="utf-8"?>
-<w:hdr xmlns:wpc="http://schemas.microsoft.com/office/word/2010/wordprocessingCanvas" xmlns:cx="http://schemas.microsoft.com/office/drawing/2014/chartex" xmlns:cx1="http://schemas.microsoft.com/office/drawing/2015/9/8/chartex" xmlns:cx2="http://schemas.microsoft.com/office/drawing/2015/10/21/chartex" xmlns:cx3="http://schemas.microsoft.com/office/drawing/2016/5/9/chartex" xmlns:cx4="http://schemas.microsoft.com/office/drawing/2016/5/10/chartex" xmlns:cx5="http://schemas.microsoft.com/office/drawing/2016/5/11/chartex" xmlns:cx6="http://schemas.microsoft.com/office/drawing/2016/5/12/chartex" xmlns:cx7="http://schemas.microsoft.com/office/drawing/2016/5/13/chartex" xmlns:cx8="http://schemas.microsoft.com/office/drawing/2016/5/14/chartex" xmlns:mc="http://schemas.openxmlformats.org/markup-compatibility/2006" xmlns:aink="http://schemas.microsoft.com/office/drawing/2016/ink" xmlns:am3d="http://schemas.microsoft.com/office/drawing/2017/model3d" xmlns:o="urn:schemas-microsoft-com:office:office" xmlns:oel="http://schemas.microsoft.com/office/2019/extlst" xmlns:r="http://schemas.openxmlformats.org/officeDocument/2006/relationships" xmlns:m="http://schemas.openxmlformats.org/officeDocument/2006/math" xmlns:v="urn:schemas-microsoft-com:vml" xmlns:wp14="http://schemas.microsoft.com/office/word/2010/wordprocessingDrawing" xmlns:wp="http://schemas.openxmlformats.org/drawingml/2006/wordprocessingDrawing" xmlns:w10="urn:schemas-microsoft-com:office:word" xmlns:w="http://schemas.openxmlformats.org/wordprocessingml/2006/main" xmlns:w14="http://schemas.microsoft.com/office/word/2010/wordml" xmlns:w15="http://schemas.microsoft.com/office/word/2012/wordml" xmlns:w16cex="http://schemas.microsoft.com/office/word/2018/wordml/cex" xmlns:w16cid="http://schemas.microsoft.com/office/word/2016/wordml/cid" xmlns:w16="http://schemas.microsoft.com/office/word/2018/wordml" xmlns:w16du="http://schemas.microsoft.com/office/word/2023/wordml/word16du" xmlns:w16sdtdh="http://schemas.microsoft.com/office/word/2020/wordml/sdtdatahash" xmlns:w16se="http://schemas.microsoft.com/office/word/2015/wordml/symex" xmlns:wpg="http://schemas.microsoft.com/office/word/2010/wordprocessingGroup" xmlns:wpi="http://schemas.microsoft.com/office/word/2010/wordprocessingInk" xmlns:wne="http://schemas.microsoft.com/office/word/2006/wordml" xmlns:wps="http://schemas.microsoft.com/office/word/2010/wordprocessingShape" mc:Ignorable="w14 w15 w16se w16cid w16 w16cex w16sdtdh w16du wp14">
-  <w:p>
-    <w:pPr>
-      <w:pStyle w:val="Header"/>
-    </w:pPr>
-  </w:p>
-</w:hdr>
-</file>
-
-<file path=word/header4.xml><?xml version="1.0" encoding="utf-8"?>
-<w:hdr xmlns:wpc="http://schemas.microsoft.com/office/word/2010/wordprocessingCanvas" xmlns:cx="http://schemas.microsoft.com/office/drawing/2014/chartex" xmlns:cx1="http://schemas.microsoft.com/office/drawing/2015/9/8/chartex" xmlns:cx2="http://schemas.microsoft.com/office/drawing/2015/10/21/chartex" xmlns:cx3="http://schemas.microsoft.com/office/drawing/2016/5/9/chartex" xmlns:cx4="http://schemas.microsoft.com/office/drawing/2016/5/10/chartex" xmlns:cx5="http://schemas.microsoft.com/office/drawing/2016/5/11/chartex" xmlns:cx6="http://schemas.microsoft.com/office/drawing/2016/5/12/chartex" xmlns:cx7="http://schemas.microsoft.com/office/drawing/2016/5/13/chartex" xmlns:cx8="http://schemas.microsoft.com/office/drawing/2016/5/14/chartex" xmlns:mc="http://schemas.openxmlformats.org/markup-compatibility/2006" xmlns:aink="http://schemas.microsoft.com/office/drawing/2016/ink" xmlns:am3d="http://schemas.microsoft.com/office/drawing/2017/model3d" xmlns:o="urn:schemas-microsoft-com:office:office" xmlns:oel="http://schemas.microsoft.com/office/2019/extlst" xmlns:r="http://schemas.openxmlformats.org/officeDocument/2006/relationships" xmlns:m="http://schemas.openxmlformats.org/officeDocument/2006/math" xmlns:v="urn:schemas-microsoft-com:vml" xmlns:wp14="http://schemas.microsoft.com/office/word/2010/wordprocessingDrawing" xmlns:wp="http://schemas.openxmlformats.org/drawingml/2006/wordprocessingDrawing" xmlns:w10="urn:schemas-microsoft-com:office:word" xmlns:w="http://schemas.openxmlformats.org/wordprocessingml/2006/main" xmlns:w14="http://schemas.microsoft.com/office/word/2010/wordml" xmlns:w15="http://schemas.microsoft.com/office/word/2012/wordml" xmlns:w16cex="http://schemas.microsoft.com/office/word/2018/wordml/cex" xmlns:w16cid="http://schemas.microsoft.com/office/word/2016/wordml/cid" xmlns:w16="http://schemas.microsoft.com/office/word/2018/wordml" xmlns:w16du="http://schemas.microsoft.com/office/word/2023/wordml/word16du" xmlns:w16sdtdh="http://schemas.microsoft.com/office/word/2020/wordml/sdtdatahash" xmlns:w16se="http://schemas.microsoft.com/office/word/2015/wordml/symex" xmlns:wpg="http://schemas.microsoft.com/office/word/2010/wordprocessingGroup" xmlns:wpi="http://schemas.microsoft.com/office/word/2010/wordprocessingInk" xmlns:wne="http://schemas.microsoft.com/office/word/2006/wordml" xmlns:wps="http://schemas.microsoft.com/office/word/2010/wordprocessingShape" mc:Ignorable="w14 w15 w16se w16cid w16 w16cex w16sdtdh w16du wp14">
+<file path=word/header2.xml><?xml version="1.0" encoding="utf-8"?>
+<w:hdr xmlns:wpc="http://schemas.microsoft.com/office/word/2010/wordprocessingCanvas" xmlns:cx="http://schemas.microsoft.com/office/drawing/2014/chartex" xmlns:cx1="http://schemas.microsoft.com/office/drawing/2015/9/8/chartex" xmlns:cx2="http://schemas.microsoft.com/office/drawing/2015/10/21/chartex" xmlns:cx3="http://schemas.microsoft.com/office/drawing/2016/5/9/chartex" xmlns:cx4="http://schemas.microsoft.com/office/drawing/2016/5/10/chartex" xmlns:cx5="http://schemas.microsoft.com/office/drawing/2016/5/11/chartex" xmlns:cx6="http://schemas.microsoft.com/office/drawing/2016/5/12/chartex" xmlns:cx7="http://schemas.microsoft.com/office/drawing/2016/5/13/chartex" xmlns:cx8="http://schemas.microsoft.com/office/drawing/2016/5/14/chartex" xmlns:mc="http://schemas.openxmlformats.org/markup-compatibility/2006" xmlns:aink="http://schemas.microsoft.com/office/drawing/2016/ink" xmlns:am3d="http://schemas.microsoft.com/office/drawing/2017/model3d" xmlns:o="urn:schemas-microsoft-com:office:office" xmlns:oel="http://schemas.microsoft.com/office/2019/extlst" xmlns:r="http://schemas.openxmlformats.org/officeDocument/2006/relationships" xmlns:m="http://schemas.openxmlformats.org/officeDocument/2006/math" xmlns:v="urn:schemas-microsoft-com:vml" xmlns:wp14="http://schemas.microsoft.com/office/word/2010/wordprocessingDrawing" xmlns:wp="http://schemas.openxmlformats.org/drawingml/2006/wordprocessingDrawing" xmlns:w10="urn:schemas-microsoft-com:office:word" xmlns:w="http://schemas.openxmlformats.org/wordprocessingml/2006/main" xmlns:w14="http://schemas.microsoft.com/office/word/2010/wordml" xmlns:w15="http://schemas.microsoft.com/office/word/2012/wordml" xmlns:w16cex="http://schemas.microsoft.com/office/word/2018/wordml/cex" xmlns:w16cid="http://schemas.microsoft.com/office/word/2016/wordml/cid" xmlns:w16="http://schemas.microsoft.com/office/word/2018/wordml" xmlns:w16du="http://schemas.microsoft.com/office/word/2023/wordml/word16du" xmlns:w16sdtdh="http://schemas.microsoft.com/office/word/2020/wordml/sdtdatahash" xmlns:w16sdtfl="http://schemas.microsoft.com/office/word/2024/wordml/sdtformatlock" xmlns:w16se="http://schemas.microsoft.com/office/word/2015/wordml/symex" xmlns:wpg="http://schemas.microsoft.com/office/word/2010/wordprocessingGroup" xmlns:wpi="http://schemas.microsoft.com/office/word/2010/wordprocessingInk" xmlns:wne="http://schemas.microsoft.com/office/word/2006/wordml" xmlns:wps="http://schemas.microsoft.com/office/word/2010/wordprocessingShape" mc:Ignorable="w14 w15 w16se w16cid w16 w16cex w16sdtdh w16sdtfl w16du wp14">
   <w:p>
     <w:pPr>
       <w:pStyle w:val="Header"/>
@@ -33292,7 +33435,7 @@
 </file>
 
 <file path=word/numbering.xml><?xml version="1.0" encoding="utf-8"?>
-<w:numbering xmlns:wpc="http://schemas.microsoft.com/office/word/2010/wordprocessingCanvas" xmlns:cx="http://schemas.microsoft.com/office/drawing/2014/chartex" xmlns:cx1="http://schemas.microsoft.com/office/drawing/2015/9/8/chartex" xmlns:cx2="http://schemas.microsoft.com/office/drawing/2015/10/21/chartex" xmlns:cx3="http://schemas.microsoft.com/office/drawing/2016/5/9/chartex" xmlns:cx4="http://schemas.microsoft.com/office/drawing/2016/5/10/chartex" xmlns:cx5="http://schemas.microsoft.com/office/drawing/2016/5/11/chartex" xmlns:cx6="http://schemas.microsoft.com/office/drawing/2016/5/12/chartex" xmlns:cx7="http://schemas.microsoft.com/office/drawing/2016/5/13/chartex" xmlns:cx8="http://schemas.microsoft.com/office/drawing/2016/5/14/chartex" xmlns:mc="http://schemas.openxmlformats.org/markup-compatibility/2006" xmlns:aink="http://schemas.microsoft.com/office/drawing/2016/ink" xmlns:am3d="http://schemas.microsoft.com/office/drawing/2017/model3d" xmlns:o="urn:schemas-microsoft-com:office:office" xmlns:oel="http://schemas.microsoft.com/office/2019/extlst" xmlns:r="http://schemas.openxmlformats.org/officeDocument/2006/relationships" xmlns:m="http://schemas.openxmlformats.org/officeDocument/2006/math" xmlns:v="urn:schemas-microsoft-com:vml" xmlns:wp14="http://schemas.microsoft.com/office/word/2010/wordprocessingDrawing" xmlns:wp="http://schemas.openxmlformats.org/drawingml/2006/wordprocessingDrawing" xmlns:w10="urn:schemas-microsoft-com:office:word" xmlns:w="http://schemas.openxmlformats.org/wordprocessingml/2006/main" xmlns:w14="http://schemas.microsoft.com/office/word/2010/wordml" xmlns:w15="http://schemas.microsoft.com/office/word/2012/wordml" xmlns:w16cex="http://schemas.microsoft.com/office/word/2018/wordml/cex" xmlns:w16cid="http://schemas.microsoft.com/office/word/2016/wordml/cid" xmlns:w16="http://schemas.microsoft.com/office/word/2018/wordml" xmlns:w16du="http://schemas.microsoft.com/office/word/2023/wordml/word16du" xmlns:w16sdtdh="http://schemas.microsoft.com/office/word/2020/wordml/sdtdatahash" xmlns:w16se="http://schemas.microsoft.com/office/word/2015/wordml/symex" xmlns:wpg="http://schemas.microsoft.com/office/word/2010/wordprocessingGroup" xmlns:wpi="http://schemas.microsoft.com/office/word/2010/wordprocessingInk" xmlns:wne="http://schemas.microsoft.com/office/word/2006/wordml" xmlns:wps="http://schemas.microsoft.com/office/word/2010/wordprocessingShape" mc:Ignorable="w14 w15 w16se w16cid w16 w16cex w16sdtdh w16du wp14">
+<w:numbering xmlns:wpc="http://schemas.microsoft.com/office/word/2010/wordprocessingCanvas" xmlns:cx="http://schemas.microsoft.com/office/drawing/2014/chartex" xmlns:cx1="http://schemas.microsoft.com/office/drawing/2015/9/8/chartex" xmlns:cx2="http://schemas.microsoft.com/office/drawing/2015/10/21/chartex" xmlns:cx3="http://schemas.microsoft.com/office/drawing/2016/5/9/chartex" xmlns:cx4="http://schemas.microsoft.com/office/drawing/2016/5/10/chartex" xmlns:cx5="http://schemas.microsoft.com/office/drawing/2016/5/11/chartex" xmlns:cx6="http://schemas.microsoft.com/office/drawing/2016/5/12/chartex" xmlns:cx7="http://schemas.microsoft.com/office/drawing/2016/5/13/chartex" xmlns:cx8="http://schemas.microsoft.com/office/drawing/2016/5/14/chartex" xmlns:mc="http://schemas.openxmlformats.org/markup-compatibility/2006" xmlns:aink="http://schemas.microsoft.com/office/drawing/2016/ink" xmlns:am3d="http://schemas.microsoft.com/office/drawing/2017/model3d" xmlns:o="urn:schemas-microsoft-com:office:office" xmlns:oel="http://schemas.microsoft.com/office/2019/extlst" xmlns:r="http://schemas.openxmlformats.org/officeDocument/2006/relationships" xmlns:m="http://schemas.openxmlformats.org/officeDocument/2006/math" xmlns:v="urn:schemas-microsoft-com:vml" xmlns:wp14="http://schemas.microsoft.com/office/word/2010/wordprocessingDrawing" xmlns:wp="http://schemas.openxmlformats.org/drawingml/2006/wordprocessingDrawing" xmlns:w10="urn:schemas-microsoft-com:office:word" xmlns:w="http://schemas.openxmlformats.org/wordprocessingml/2006/main" xmlns:w14="http://schemas.microsoft.com/office/word/2010/wordml" xmlns:w15="http://schemas.microsoft.com/office/word/2012/wordml" xmlns:w16cex="http://schemas.microsoft.com/office/word/2018/wordml/cex" xmlns:w16cid="http://schemas.microsoft.com/office/word/2016/wordml/cid" xmlns:w16="http://schemas.microsoft.com/office/word/2018/wordml" xmlns:w16du="http://schemas.microsoft.com/office/word/2023/wordml/word16du" xmlns:w16sdtdh="http://schemas.microsoft.com/office/word/2020/wordml/sdtdatahash" xmlns:w16sdtfl="http://schemas.microsoft.com/office/word/2024/wordml/sdtformatlock" xmlns:w16se="http://schemas.microsoft.com/office/word/2015/wordml/symex" xmlns:wpg="http://schemas.microsoft.com/office/word/2010/wordprocessingGroup" xmlns:wpi="http://schemas.microsoft.com/office/word/2010/wordprocessingInk" xmlns:wne="http://schemas.microsoft.com/office/word/2006/wordml" xmlns:wps="http://schemas.microsoft.com/office/word/2010/wordprocessingShape" mc:Ignorable="w14 w15 w16se w16cid w16 w16cex w16sdtdh w16sdtfl w16du wp14">
   <w:abstractNum w:abstractNumId="0" w15:restartNumberingAfterBreak="0">
     <w:nsid w:val="17927E1A"/>
     <w:multiLevelType w:val="hybridMultilevel"/>
@@ -33650,7 +33793,7 @@
 </file>
 
 <file path=word/styles.xml><?xml version="1.0" encoding="utf-8"?>
-<w:styles xmlns:mc="http://schemas.openxmlformats.org/markup-compatibility/2006" xmlns:r="http://schemas.openxmlformats.org/officeDocument/2006/relationships" xmlns:w="http://schemas.openxmlformats.org/wordprocessingml/2006/main" xmlns:w14="http://schemas.microsoft.com/office/word/2010/wordml" xmlns:w15="http://schemas.microsoft.com/office/word/2012/wordml" xmlns:w16cex="http://schemas.microsoft.com/office/word/2018/wordml/cex" xmlns:w16cid="http://schemas.microsoft.com/office/word/2016/wordml/cid" xmlns:w16="http://schemas.microsoft.com/office/word/2018/wordml" xmlns:w16du="http://schemas.microsoft.com/office/word/2023/wordml/word16du" xmlns:w16sdtdh="http://schemas.microsoft.com/office/word/2020/wordml/sdtdatahash" xmlns:w16se="http://schemas.microsoft.com/office/word/2015/wordml/symex" mc:Ignorable="w14 w15 w16se w16cid w16 w16cex w16sdtdh w16du">
+<w:styles xmlns:mc="http://schemas.openxmlformats.org/markup-compatibility/2006" xmlns:r="http://schemas.openxmlformats.org/officeDocument/2006/relationships" xmlns:w="http://schemas.openxmlformats.org/wordprocessingml/2006/main" xmlns:w14="http://schemas.microsoft.com/office/word/2010/wordml" xmlns:w15="http://schemas.microsoft.com/office/word/2012/wordml" xmlns:w16cex="http://schemas.microsoft.com/office/word/2018/wordml/cex" xmlns:w16cid="http://schemas.microsoft.com/office/word/2016/wordml/cid" xmlns:w16="http://schemas.microsoft.com/office/word/2018/wordml" xmlns:w16du="http://schemas.microsoft.com/office/word/2023/wordml/word16du" xmlns:w16sdtdh="http://schemas.microsoft.com/office/word/2020/wordml/sdtdatahash" xmlns:w16sdtfl="http://schemas.microsoft.com/office/word/2024/wordml/sdtformatlock" xmlns:w16se="http://schemas.microsoft.com/office/word/2015/wordml/symex" mc:Ignorable="w14 w15 w16se w16cid w16 w16cex w16sdtdh w16sdtfl w16du">
   <w:docDefaults>
     <w:rPrDefault>
       <w:rPr>
@@ -34205,7 +34348,7 @@
 </file>
 
 <file path=word/glossary/document.xml><?xml version="1.0" encoding="utf-8"?>
-<w:glossaryDocument xmlns:wpc="http://schemas.microsoft.com/office/word/2010/wordprocessingCanvas" xmlns:cx="http://schemas.microsoft.com/office/drawing/2014/chartex" xmlns:cx1="http://schemas.microsoft.com/office/drawing/2015/9/8/chartex" xmlns:cx2="http://schemas.microsoft.com/office/drawing/2015/10/21/chartex" xmlns:cx3="http://schemas.microsoft.com/office/drawing/2016/5/9/chartex" xmlns:cx4="http://schemas.microsoft.com/office/drawing/2016/5/10/chartex" xmlns:cx5="http://schemas.microsoft.com/office/drawing/2016/5/11/chartex" xmlns:cx6="http://schemas.microsoft.com/office/drawing/2016/5/12/chartex" xmlns:cx7="http://schemas.microsoft.com/office/drawing/2016/5/13/chartex" xmlns:cx8="http://schemas.microsoft.com/office/drawing/2016/5/14/chartex" xmlns:mc="http://schemas.openxmlformats.org/markup-compatibility/2006" xmlns:aink="http://schemas.microsoft.com/office/drawing/2016/ink" xmlns:am3d="http://schemas.microsoft.com/office/drawing/2017/model3d" xmlns:o="urn:schemas-microsoft-com:office:office" xmlns:oel="http://schemas.microsoft.com/office/2019/extlst" xmlns:r="http://schemas.openxmlformats.org/officeDocument/2006/relationships" xmlns:m="http://schemas.openxmlformats.org/officeDocument/2006/math" xmlns:v="urn:schemas-microsoft-com:vml" xmlns:wp14="http://schemas.microsoft.com/office/word/2010/wordprocessingDrawing" xmlns:wp="http://schemas.openxmlformats.org/drawingml/2006/wordprocessingDrawing" xmlns:w10="urn:schemas-microsoft-com:office:word" xmlns:w="http://schemas.openxmlformats.org/wordprocessingml/2006/main" xmlns:w14="http://schemas.microsoft.com/office/word/2010/wordml" xmlns:w15="http://schemas.microsoft.com/office/word/2012/wordml" xmlns:w16cex="http://schemas.microsoft.com/office/word/2018/wordml/cex" xmlns:w16cid="http://schemas.microsoft.com/office/word/2016/wordml/cid" xmlns:w16="http://schemas.microsoft.com/office/word/2018/wordml" xmlns:w16du="http://schemas.microsoft.com/office/word/2023/wordml/word16du" xmlns:w16sdtdh="http://schemas.microsoft.com/office/word/2020/wordml/sdtdatahash" xmlns:w16se="http://schemas.microsoft.com/office/word/2015/wordml/symex" xmlns:wpg="http://schemas.microsoft.com/office/word/2010/wordprocessingGroup" xmlns:wpi="http://schemas.microsoft.com/office/word/2010/wordprocessingInk" xmlns:wne="http://schemas.microsoft.com/office/word/2006/wordml" xmlns:wps="http://schemas.microsoft.com/office/word/2010/wordprocessingShape" mc:Ignorable="w14 w15 w16se w16cid w16 w16cex w16sdtdh w16du wp14">
+<w:glossaryDocument xmlns:wpc="http://schemas.microsoft.com/office/word/2010/wordprocessingCanvas" xmlns:cx="http://schemas.microsoft.com/office/drawing/2014/chartex" xmlns:cx1="http://schemas.microsoft.com/office/drawing/2015/9/8/chartex" xmlns:cx2="http://schemas.microsoft.com/office/drawing/2015/10/21/chartex" xmlns:cx3="http://schemas.microsoft.com/office/drawing/2016/5/9/chartex" xmlns:cx4="http://schemas.microsoft.com/office/drawing/2016/5/10/chartex" xmlns:cx5="http://schemas.microsoft.com/office/drawing/2016/5/11/chartex" xmlns:cx6="http://schemas.microsoft.com/office/drawing/2016/5/12/chartex" xmlns:cx7="http://schemas.microsoft.com/office/drawing/2016/5/13/chartex" xmlns:cx8="http://schemas.microsoft.com/office/drawing/2016/5/14/chartex" xmlns:mc="http://schemas.openxmlformats.org/markup-compatibility/2006" xmlns:aink="http://schemas.microsoft.com/office/drawing/2016/ink" xmlns:am3d="http://schemas.microsoft.com/office/drawing/2017/model3d" xmlns:o="urn:schemas-microsoft-com:office:office" xmlns:oel="http://schemas.microsoft.com/office/2019/extlst" xmlns:r="http://schemas.openxmlformats.org/officeDocument/2006/relationships" xmlns:m="http://schemas.openxmlformats.org/officeDocument/2006/math" xmlns:v="urn:schemas-microsoft-com:vml" xmlns:wp14="http://schemas.microsoft.com/office/word/2010/wordprocessingDrawing" xmlns:wp="http://schemas.openxmlformats.org/drawingml/2006/wordprocessingDrawing" xmlns:w10="urn:schemas-microsoft-com:office:word" xmlns:w="http://schemas.openxmlformats.org/wordprocessingml/2006/main" xmlns:w14="http://schemas.microsoft.com/office/word/2010/wordml" xmlns:w15="http://schemas.microsoft.com/office/word/2012/wordml" xmlns:w16cex="http://schemas.microsoft.com/office/word/2018/wordml/cex" xmlns:w16cid="http://schemas.microsoft.com/office/word/2016/wordml/cid" xmlns:w16="http://schemas.microsoft.com/office/word/2018/wordml" xmlns:w16du="http://schemas.microsoft.com/office/word/2023/wordml/word16du" xmlns:w16sdtdh="http://schemas.microsoft.com/office/word/2020/wordml/sdtdatahash" xmlns:w16sdtfl="http://schemas.microsoft.com/office/word/2024/wordml/sdtformatlock" xmlns:w16se="http://schemas.microsoft.com/office/word/2015/wordml/symex" xmlns:wpg="http://schemas.microsoft.com/office/word/2010/wordprocessingGroup" xmlns:wpi="http://schemas.microsoft.com/office/word/2010/wordprocessingInk" xmlns:wne="http://schemas.microsoft.com/office/word/2006/wordml" xmlns:wps="http://schemas.microsoft.com/office/word/2010/wordprocessingShape" mc:Ignorable="w14 w15 w16se w16cid w16 w16cex w16sdtdh w16sdtfl w16du wp14">
   <w:docParts>
     <w:docPart>
       <w:docPartPr>
@@ -34354,7 +34497,7 @@
 </file>
 
 <file path=word/glossary/fontTable.xml><?xml version="1.0" encoding="utf-8"?>
-<w:fonts xmlns:mc="http://schemas.openxmlformats.org/markup-compatibility/2006" xmlns:r="http://schemas.openxmlformats.org/officeDocument/2006/relationships" xmlns:w="http://schemas.openxmlformats.org/wordprocessingml/2006/main" xmlns:w14="http://schemas.microsoft.com/office/word/2010/wordml" xmlns:w15="http://schemas.microsoft.com/office/word/2012/wordml" xmlns:w16cex="http://schemas.microsoft.com/office/word/2018/wordml/cex" xmlns:w16cid="http://schemas.microsoft.com/office/word/2016/wordml/cid" xmlns:w16="http://schemas.microsoft.com/office/word/2018/wordml" xmlns:w16du="http://schemas.microsoft.com/office/word/2023/wordml/word16du" xmlns:w16sdtdh="http://schemas.microsoft.com/office/word/2020/wordml/sdtdatahash" xmlns:w16se="http://schemas.microsoft.com/office/word/2015/wordml/symex" mc:Ignorable="w14 w15 w16se w16cid w16 w16cex w16sdtdh w16du">
+<w:fonts xmlns:mc="http://schemas.openxmlformats.org/markup-compatibility/2006" xmlns:r="http://schemas.openxmlformats.org/officeDocument/2006/relationships" xmlns:w="http://schemas.openxmlformats.org/wordprocessingml/2006/main" xmlns:w14="http://schemas.microsoft.com/office/word/2010/wordml" xmlns:w15="http://schemas.microsoft.com/office/word/2012/wordml" xmlns:w16cex="http://schemas.microsoft.com/office/word/2018/wordml/cex" xmlns:w16cid="http://schemas.microsoft.com/office/word/2016/wordml/cid" xmlns:w16="http://schemas.microsoft.com/office/word/2018/wordml" xmlns:w16du="http://schemas.microsoft.com/office/word/2023/wordml/word16du" xmlns:w16sdtdh="http://schemas.microsoft.com/office/word/2020/wordml/sdtdatahash" xmlns:w16sdtfl="http://schemas.microsoft.com/office/word/2024/wordml/sdtformatlock" xmlns:w16se="http://schemas.microsoft.com/office/word/2015/wordml/symex" mc:Ignorable="w14 w15 w16se w16cid w16 w16cex w16sdtdh w16sdtfl w16du">
   <w:font w:name="Roboto Lt">
     <w:altName w:val="Times New Roman"/>
     <w:charset w:val="01"/>
@@ -34447,7 +34590,7 @@
 </file>
 
 <file path=word/glossary/settings.xml><?xml version="1.0" encoding="utf-8"?>
-<w:settings xmlns:mc="http://schemas.openxmlformats.org/markup-compatibility/2006" xmlns:o="urn:schemas-microsoft-com:office:office" xmlns:r="http://schemas.openxmlformats.org/officeDocument/2006/relationships" xmlns:m="http://schemas.openxmlformats.org/officeDocument/2006/math" xmlns:v="urn:schemas-microsoft-com:vml" xmlns:w10="urn:schemas-microsoft-com:office:word" xmlns:w="http://schemas.openxmlformats.org/wordprocessingml/2006/main" xmlns:w14="http://schemas.microsoft.com/office/word/2010/wordml" xmlns:w15="http://schemas.microsoft.com/office/word/2012/wordml" xmlns:w16cex="http://schemas.microsoft.com/office/word/2018/wordml/cex" xmlns:w16cid="http://schemas.microsoft.com/office/word/2016/wordml/cid" xmlns:w16="http://schemas.microsoft.com/office/word/2018/wordml" xmlns:w16du="http://schemas.microsoft.com/office/word/2023/wordml/word16du" xmlns:w16sdtdh="http://schemas.microsoft.com/office/word/2020/wordml/sdtdatahash" xmlns:w16se="http://schemas.microsoft.com/office/word/2015/wordml/symex" xmlns:sl="http://schemas.openxmlformats.org/schemaLibrary/2006/main" mc:Ignorable="w14 w15 w16se w16cid w16 w16cex w16sdtdh w16du">
+<w:settings xmlns:mc="http://schemas.openxmlformats.org/markup-compatibility/2006" xmlns:o="urn:schemas-microsoft-com:office:office" xmlns:r="http://schemas.openxmlformats.org/officeDocument/2006/relationships" xmlns:m="http://schemas.openxmlformats.org/officeDocument/2006/math" xmlns:v="urn:schemas-microsoft-com:vml" xmlns:w10="urn:schemas-microsoft-com:office:word" xmlns:w="http://schemas.openxmlformats.org/wordprocessingml/2006/main" xmlns:w14="http://schemas.microsoft.com/office/word/2010/wordml" xmlns:w15="http://schemas.microsoft.com/office/word/2012/wordml" xmlns:w16cex="http://schemas.microsoft.com/office/word/2018/wordml/cex" xmlns:w16cid="http://schemas.microsoft.com/office/word/2016/wordml/cid" xmlns:w16="http://schemas.microsoft.com/office/word/2018/wordml" xmlns:w16du="http://schemas.microsoft.com/office/word/2023/wordml/word16du" xmlns:w16sdtdh="http://schemas.microsoft.com/office/word/2020/wordml/sdtdatahash" xmlns:w16sdtfl="http://schemas.microsoft.com/office/word/2024/wordml/sdtformatlock" xmlns:w16se="http://schemas.microsoft.com/office/word/2015/wordml/symex" xmlns:sl="http://schemas.openxmlformats.org/schemaLibrary/2006/main" mc:Ignorable="w14 w15 w16se w16cid w16 w16cex w16sdtdh w16sdtfl w16du">
   <w:view w:val="normal"/>
   <w:defaultTabStop w:val="720"/>
   <w:characterSpacingControl w:val="doNotCompress"/>
@@ -34482,10 +34625,13 @@
     <w:rsid w:val="001B0AE1"/>
     <w:rsid w:val="001B5D85"/>
     <w:rsid w:val="001C768F"/>
+    <w:rsid w:val="001F353E"/>
     <w:rsid w:val="00200B21"/>
     <w:rsid w:val="0023756D"/>
+    <w:rsid w:val="0025538C"/>
     <w:rsid w:val="002F4160"/>
     <w:rsid w:val="00306E7E"/>
+    <w:rsid w:val="003360AB"/>
     <w:rsid w:val="00340A44"/>
     <w:rsid w:val="00344ED6"/>
     <w:rsid w:val="00354946"/>
@@ -34507,11 +34653,14 @@
     <w:rsid w:val="005C20CF"/>
     <w:rsid w:val="005D299D"/>
     <w:rsid w:val="005F507D"/>
+    <w:rsid w:val="006615D4"/>
+    <w:rsid w:val="00662DB3"/>
     <w:rsid w:val="00685002"/>
     <w:rsid w:val="006A0A15"/>
     <w:rsid w:val="0070661B"/>
     <w:rsid w:val="00730390"/>
     <w:rsid w:val="0074486F"/>
+    <w:rsid w:val="00766147"/>
     <w:rsid w:val="00787275"/>
     <w:rsid w:val="007A1815"/>
     <w:rsid w:val="007A7101"/>
@@ -34519,6 +34668,7 @@
     <w:rsid w:val="00842FE6"/>
     <w:rsid w:val="008522BE"/>
     <w:rsid w:val="00887CB7"/>
+    <w:rsid w:val="008B2252"/>
     <w:rsid w:val="008C6377"/>
     <w:rsid w:val="008D3582"/>
     <w:rsid w:val="008D447E"/>
@@ -34526,15 +34676,20 @@
     <w:rsid w:val="00901DCE"/>
     <w:rsid w:val="009971E4"/>
     <w:rsid w:val="009B1875"/>
+    <w:rsid w:val="009C0E95"/>
     <w:rsid w:val="00A13CC8"/>
     <w:rsid w:val="00A32095"/>
     <w:rsid w:val="00A51DA2"/>
     <w:rsid w:val="00A70DD3"/>
+    <w:rsid w:val="00A954D2"/>
     <w:rsid w:val="00AA1D8E"/>
     <w:rsid w:val="00AA60D0"/>
     <w:rsid w:val="00AD2ECF"/>
     <w:rsid w:val="00B72ABC"/>
+    <w:rsid w:val="00B74C2F"/>
+    <w:rsid w:val="00B81704"/>
     <w:rsid w:val="00B879AB"/>
+    <w:rsid w:val="00BB32FE"/>
     <w:rsid w:val="00BB71F5"/>
     <w:rsid w:val="00C0378F"/>
     <w:rsid w:val="00C052C2"/>
@@ -34550,6 +34705,7 @@
     <w:rsid w:val="00D0005C"/>
     <w:rsid w:val="00D25D96"/>
     <w:rsid w:val="00D67D44"/>
+    <w:rsid w:val="00D8701D"/>
     <w:rsid w:val="00DB3047"/>
     <w:rsid w:val="00DC4790"/>
     <w:rsid w:val="00E038E3"/>
@@ -34557,6 +34713,8 @@
     <w:rsid w:val="00E42B71"/>
     <w:rsid w:val="00E753D6"/>
     <w:rsid w:val="00E77B79"/>
+    <w:rsid w:val="00EA0312"/>
+    <w:rsid w:val="00F164E5"/>
     <w:rsid w:val="00F30273"/>
     <w:rsid w:val="00F37F66"/>
     <w:rsid w:val="00F43983"/>
@@ -34578,7 +34736,7 @@
     <m:intLim m:val="subSup"/>
     <m:naryLim m:val="undOvr"/>
   </m:mathPr>
-  <w:themeFontLang w:val="en-US"/>
+  <w:themeFontLang w:val="en-US" w:bidi="ar-SA"/>
   <w:clrSchemeMapping w:bg1="light1" w:t1="dark1" w:bg2="light2" w:t2="dark2" w:accent1="accent1" w:accent2="accent2" w:accent3="accent3" w:accent4="accent4" w:accent5="accent5" w:accent6="accent6" w:hyperlink="hyperlink" w:followedHyperlink="followedHyperlink"/>
   <w:decimalSymbol w:val="."/>
   <w:listSeparator w:val=","/>
@@ -34587,7 +34745,7 @@
 </file>
 
 <file path=word/glossary/styles.xml><?xml version="1.0" encoding="utf-8"?>
-<w:styles xmlns:mc="http://schemas.openxmlformats.org/markup-compatibility/2006" xmlns:r="http://schemas.openxmlformats.org/officeDocument/2006/relationships" xmlns:w="http://schemas.openxmlformats.org/wordprocessingml/2006/main" xmlns:w14="http://schemas.microsoft.com/office/word/2010/wordml" xmlns:w15="http://schemas.microsoft.com/office/word/2012/wordml" xmlns:w16cex="http://schemas.microsoft.com/office/word/2018/wordml/cex" xmlns:w16cid="http://schemas.microsoft.com/office/word/2016/wordml/cid" xmlns:w16="http://schemas.microsoft.com/office/word/2018/wordml" xmlns:w16du="http://schemas.microsoft.com/office/word/2023/wordml/word16du" xmlns:w16sdtdh="http://schemas.microsoft.com/office/word/2020/wordml/sdtdatahash" xmlns:w16se="http://schemas.microsoft.com/office/word/2015/wordml/symex" mc:Ignorable="w14 w15 w16se w16cid w16 w16cex w16sdtdh w16du">
+<w:styles xmlns:mc="http://schemas.openxmlformats.org/markup-compatibility/2006" xmlns:r="http://schemas.openxmlformats.org/officeDocument/2006/relationships" xmlns:w="http://schemas.openxmlformats.org/wordprocessingml/2006/main" xmlns:w14="http://schemas.microsoft.com/office/word/2010/wordml" xmlns:w15="http://schemas.microsoft.com/office/word/2012/wordml" xmlns:w16cex="http://schemas.microsoft.com/office/word/2018/wordml/cex" xmlns:w16cid="http://schemas.microsoft.com/office/word/2016/wordml/cid" xmlns:w16="http://schemas.microsoft.com/office/word/2018/wordml" xmlns:w16du="http://schemas.microsoft.com/office/word/2023/wordml/word16du" xmlns:w16sdtdh="http://schemas.microsoft.com/office/word/2020/wordml/sdtdatahash" xmlns:w16sdtfl="http://schemas.microsoft.com/office/word/2024/wordml/sdtformatlock" xmlns:w16se="http://schemas.microsoft.com/office/word/2015/wordml/symex" mc:Ignorable="w14 w15 w16se w16cid w16 w16cex w16sdtdh w16sdtfl w16du">
   <w:docDefaults>
     <w:rPrDefault>
       <w:rPr>
@@ -35019,7 +35177,7 @@
     <w:basedOn w:val="DefaultParagraphFont"/>
     <w:uiPriority w:val="99"/>
     <w:semiHidden/>
-    <w:rsid w:val="001B0AE1"/>
+    <w:rsid w:val="00A954D2"/>
     <w:rPr>
       <w:color w:val="666666"/>
     </w:rPr>
@@ -35044,7 +35202,7 @@
 </file>
 
 <file path=word/glossary/webSettings.xml><?xml version="1.0" encoding="utf-8"?>
-<w:webSettings xmlns:mc="http://schemas.openxmlformats.org/markup-compatibility/2006" xmlns:r="http://schemas.openxmlformats.org/officeDocument/2006/relationships" xmlns:w="http://schemas.openxmlformats.org/wordprocessingml/2006/main" xmlns:w14="http://schemas.microsoft.com/office/word/2010/wordml" xmlns:w15="http://schemas.microsoft.com/office/word/2012/wordml" xmlns:w16cex="http://schemas.microsoft.com/office/word/2018/wordml/cex" xmlns:w16cid="http://schemas.microsoft.com/office/word/2016/wordml/cid" xmlns:w16="http://schemas.microsoft.com/office/word/2018/wordml" xmlns:w16du="http://schemas.microsoft.com/office/word/2023/wordml/word16du" xmlns:w16sdtdh="http://schemas.microsoft.com/office/word/2020/wordml/sdtdatahash" xmlns:w16se="http://schemas.microsoft.com/office/word/2015/wordml/symex" mc:Ignorable="w14 w15 w16se w16cid w16 w16cex w16sdtdh w16du">
+<w:webSettings xmlns:mc="http://schemas.openxmlformats.org/markup-compatibility/2006" xmlns:r="http://schemas.openxmlformats.org/officeDocument/2006/relationships" xmlns:w="http://schemas.openxmlformats.org/wordprocessingml/2006/main" xmlns:w14="http://schemas.microsoft.com/office/word/2010/wordml" xmlns:w15="http://schemas.microsoft.com/office/word/2012/wordml" xmlns:w16cex="http://schemas.microsoft.com/office/word/2018/wordml/cex" xmlns:w16cid="http://schemas.microsoft.com/office/word/2016/wordml/cid" xmlns:w16="http://schemas.microsoft.com/office/word/2018/wordml" xmlns:w16du="http://schemas.microsoft.com/office/word/2023/wordml/word16du" xmlns:w16sdtdh="http://schemas.microsoft.com/office/word/2020/wordml/sdtdatahash" xmlns:w16sdtfl="http://schemas.microsoft.com/office/word/2024/wordml/sdtformatlock" xmlns:w16se="http://schemas.microsoft.com/office/word/2015/wordml/symex" mc:Ignorable="w14 w15 w16se w16cid w16 w16cex w16sdtdh w16sdtfl w16du">
   <w:optimizeForBrowser/>
   <w:allowPNG/>
 </w:webSettings>
@@ -35345,7 +35503,11 @@
 </a:theme>
 </file>
 
-<file path=customXml/item1.xml>��< ? x m l   v e r s i o n = " 1 . 0 "   e n c o d i n g = " u t f - 1 6 " ? > +<file path=customXml/item1.xml><?xml version="1.0" encoding="utf-8"?>
+<b:Sources xmlns:b="http://schemas.openxmlformats.org/officeDocument/2006/bibliography" xmlns="http://schemas.openxmlformats.org/officeDocument/2006/bibliography" SelectedStyle="\APASixthEditionOfficeOnline.xsl" StyleName="APA" Version="6"/>
+</file>
+
+<file path=customXml/item2.xml>��< ? x m l   v e r s i o n = " 1 . 0 "   e n c o d i n g = " u t f - 1 6 " ? >   
  < N a v W o r d R e p o r t X m l P a r t   x m l n s = " u r n : m i c r o s o f t - d y n a m i c s - n a v / r e p o r t s / T e n a n c y _ C o n t r a c t / 5 0 1 0 1 / " >   
@@ -35423,7 +35585,7 @@
  
          < C o m m u n i t y > C o m m u n i t y < / C o m m u n i t y >   
-         < C o m p a n y P i c t u r e > C o m p a n y P i c t u r e < / C o m p a n y P i c t u r e > +         < C o m p a n y P i c t u r e   / >   
          < C o n t a c t _ N u m b e r > C o n t a c t _ N u m b e r < / C o n t a c t _ N u m b e r >   
@@ -35504,22 +35666,18 @@
  < / N a v W o r d R e p o r t X m l P a r t > 
 </file>
 
-<file path=customXml/item2.xml><?xml version="1.0" encoding="utf-8"?>
-<b:Sources xmlns:b="http://schemas.openxmlformats.org/officeDocument/2006/bibliography" xmlns="http://schemas.openxmlformats.org/officeDocument/2006/bibliography" SelectedStyle="\APASixthEditionOfficeOnline.xsl" StyleName="APA" Version="6"/>
+<file path=customXml/itemProps1.xml><?xml version="1.0" encoding="utf-8"?>
+<ds:datastoreItem xmlns:ds="http://schemas.openxmlformats.org/officeDocument/2006/customXml" ds:itemID="{B2FE98F9-7A23-46CC-9826-471773318048}">
+  <ds:schemaRefs>
+    <ds:schemaRef ds:uri="http://schemas.openxmlformats.org/officeDocument/2006/bibliography"/>
+  </ds:schemaRefs>
+</ds:datastoreItem>
 </file>
 
-<file path=customXml/itemProps1.xml><?xml version="1.0" encoding="utf-8"?>
+<file path=customXml/itemProps2.xml><?xml version="1.0" encoding="utf-8"?>
 <ds:datastoreItem xmlns:ds="http://schemas.openxmlformats.org/officeDocument/2006/customXml" ds:itemID="{B8787D49-5AAC-4AAC-A9D8-A7D9793FE4D0}">
   <ds:schemaRefs>
     <ds:schemaRef ds:uri="urn:microsoft-dynamics-nav/reports/Tenancy_Contract/50101/"/>
   </ds:schemaRefs>
 </ds:datastoreItem>
-</file>
-
-<file path=customXml/itemProps2.xml><?xml version="1.0" encoding="utf-8"?>
-<ds:datastoreItem xmlns:ds="http://schemas.openxmlformats.org/officeDocument/2006/customXml" ds:itemID="{B2FE98F9-7A23-46CC-9826-471773318048}">
-  <ds:schemaRefs>
-    <ds:schemaRef ds:uri="http://schemas.openxmlformats.org/officeDocument/2006/bibliography"/>
-  </ds:schemaRefs>
-</ds:datastoreItem>
 </file>
</xml_diff>